<commit_message>
part6: case study v6 fix - correct Part4/5/6 order with real screenshots
</commit_message>
<xml_diff>
--- a/docs/Przewodnik_Techniczny_SRE_Lab_KOMPLETNY.docx
+++ b/docs/Przewodnik_Techniczny_SRE_Lab_KOMPLETNY.docx
@@ -14562,6 +14562,1459 @@
                 <w:szCs w:val="20"/>
               </w:rPr>
               <w:t xml:space="preserve">Webhook moze blokowac tworzenie zasobow jesli cert-manager jest niedostepny (chicken-and-egg)</w:t>
+            </w:r>
+          </w:p>
+        </w:tc>
+      </w:tr>
+    </w:tbl>
+    <w:p>
+      <w:r>
+        <w:br w:type="page"/>
+      </w:r>
+    </w:p>
+    <w:p>
+      <w:pPr>
+        <w:pStyle w:val="Heading1"/>
+        <w:spacing w:after="200" w:before="400"/>
+      </w:pPr>
+      <w:r>
+        <w:rPr>
+          <w:rFonts w:ascii="Arial" w:cs="Arial" w:eastAsia="Arial" w:hAnsi="Arial"/>
+          <w:b/>
+          <w:bCs/>
+          <w:color w:val="1F4E79"/>
+          <w:sz w:val="32"/>
+          <w:szCs w:val="32"/>
+        </w:rPr>
+        <w:t xml:space="preserve">Rozdzial 21: KEDA — Kubernetes Event-Driven Autoscaling</w:t>
+      </w:r>
+    </w:p>
+    <w:p>
+      <w:pPr>
+        <w:pStyle w:val="Heading2"/>
+        <w:spacing w:after="140" w:before="280"/>
+      </w:pPr>
+      <w:r>
+        <w:rPr>
+          <w:rFonts w:ascii="Arial" w:cs="Arial" w:eastAsia="Arial" w:hAnsi="Arial"/>
+          <w:b/>
+          <w:bCs/>
+          <w:color w:val="2E75B6"/>
+          <w:sz w:val="26"/>
+          <w:szCs w:val="26"/>
+        </w:rPr>
+        <w:t xml:space="preserve">Co to jest</w:t>
+      </w:r>
+    </w:p>
+    <w:p>
+      <w:pPr>
+        <w:spacing w:after="80" w:before="80"/>
+      </w:pPr>
+      <w:r>
+        <w:rPr>
+          <w:rFonts w:ascii="Arial" w:cs="Arial" w:eastAsia="Arial" w:hAnsi="Arial"/>
+          <w:sz w:val="22"/>
+          <w:szCs w:val="22"/>
+        </w:rPr>
+        <w:t xml:space="preserve">KEDA (Kubernetes Event-Driven Autoscaling) to rozszerzenie Kubernetes ktore umozliwia skalowanie aplikacji na podstawie dowolnej metryki zewnetrznej — nie tylko CPU i RAM jak standardowy HPA. KEDA obsluguje 50+ zrodel danych: Prometheus, Azure Service Bus, Apache Kafka, Redis, RabbitMQ, KEDA HTTP, Cron i wiele innych. Kluczowa zaleta: KEDA moze skalowac do 0 replik gdy nie ma ruchu — HPA ma minimum 1.</w:t>
+      </w:r>
+    </w:p>
+    <w:p>
+      <w:pPr>
+        <w:spacing w:after="80" w:before="0"/>
+      </w:pPr>
+      <w:r>
+        <w:t xml:space="preserve"/>
+      </w:r>
+    </w:p>
+    <w:tbl>
+      <w:tblPr>
+        <w:tblW w:type="dxa" w:w="9360"/>
+        <w:tblBorders>
+          <w:top w:val="single" w:color="auto" w:sz="4"/>
+          <w:left w:val="single" w:color="auto" w:sz="4"/>
+          <w:bottom w:val="single" w:color="auto" w:sz="4"/>
+          <w:right w:val="single" w:color="auto" w:sz="4"/>
+          <w:insideH w:val="single" w:color="auto" w:sz="4"/>
+          <w:insideV w:val="single" w:color="auto" w:sz="4"/>
+        </w:tblBorders>
+      </w:tblPr>
+      <w:tblGrid>
+        <w:gridCol w:w="9360"/>
+      </w:tblGrid>
+      <w:tr>
+        <w:tc>
+          <w:tcPr>
+            <w:tcW w:type="dxa" w:w="9360"/>
+            <w:tcBorders>
+              <w:top w:val="single" w:color="CCCCCC" w:sz="1"/>
+              <w:left w:val="single" w:color="CCCCCC" w:sz="1"/>
+              <w:bottom w:val="single" w:color="CCCCCC" w:sz="1"/>
+              <w:right w:val="single" w:color="CCCCCC" w:sz="1"/>
+            </w:tcBorders>
+            <w:shd w:fill="D5E8F0" w:val="clear"/>
+            <w:tcMar>
+              <w:top w:type="dxa" w:w="120"/>
+              <w:left w:type="dxa" w:w="200"/>
+              <w:bottom w:type="dxa" w:w="120"/>
+              <w:right w:type="dxa" w:w="200"/>
+            </w:tcMar>
+          </w:tcPr>
+          <w:p>
+            <w:pPr>
+              <w:spacing w:after="0" w:before="0"/>
+            </w:pPr>
+            <w:r>
+              <w:rPr>
+                <w:rFonts w:ascii="Arial" w:cs="Arial" w:eastAsia="Arial" w:hAnsi="Arial"/>
+                <w:b/>
+                <w:bCs/>
+                <w:color w:val="1F4E79"/>
+                <w:sz w:val="22"/>
+                <w:szCs w:val="22"/>
+              </w:rPr>
+              <w:t xml:space="preserve">Analogia: </w:t>
+            </w:r>
+            <w:r>
+              <w:rPr>
+                <w:rFonts w:ascii="Arial" w:cs="Arial" w:eastAsia="Arial" w:hAnsi="Arial"/>
+                <w:i/>
+                <w:iCs/>
+                <w:color w:val="000000"/>
+                <w:sz w:val="22"/>
+                <w:szCs w:val="22"/>
+              </w:rPr>
+              <w:t xml:space="preserve">Inteligentna klimatyzacja vs termostat — HPA to termostat: mierzy temperature (CPU) i wlacza/wylacza grzewanie (repliki). KEDA to inteligentna klimatyzacja: reaguje na temperature, wilgotnosc, pore dnia, liczbe osob w pomieszczeniu, prognoze pogody — dowolna kombinacja sygnalow. I jesli nikogo nie ma w domu, wylaczy sie calkowicie (scale to zero).</w:t>
+            </w:r>
+          </w:p>
+        </w:tc>
+      </w:tr>
+    </w:tbl>
+    <w:p>
+      <w:pPr>
+        <w:spacing w:after="80" w:before="0"/>
+      </w:pPr>
+      <w:r>
+        <w:t xml:space="preserve"/>
+      </w:r>
+    </w:p>
+    <w:p>
+      <w:pPr>
+        <w:pStyle w:val="Heading2"/>
+        <w:spacing w:after="140" w:before="280"/>
+      </w:pPr>
+      <w:r>
+        <w:rPr>
+          <w:rFonts w:ascii="Arial" w:cs="Arial" w:eastAsia="Arial" w:hAnsi="Arial"/>
+          <w:b/>
+          <w:bCs/>
+          <w:color w:val="2E75B6"/>
+          <w:sz w:val="26"/>
+          <w:szCs w:val="26"/>
+        </w:rPr>
+        <w:t xml:space="preserve">Jak dziala technicznie</w:t>
+      </w:r>
+    </w:p>
+    <w:p>
+      <w:pPr>
+        <w:spacing w:after="80" w:before="80"/>
+      </w:pPr>
+      <w:r>
+        <w:rPr>
+          <w:rFonts w:ascii="Arial" w:cs="Arial" w:eastAsia="Arial" w:hAnsi="Arial"/>
+          <w:sz w:val="22"/>
+          <w:szCs w:val="22"/>
+        </w:rPr>
+        <w:t xml:space="preserve">KEDA instaluje trzy komponenty: operator (glowny kontroler), metrics-apiserver (dostarcza metryki do K8s HPA) oraz admission-webhooks (walidacja ScaledObject). Uzytkownik tworzy obiekt ScaledObject ktory definiuje: co skalowac, zakres replik, cooldown period oraz triggery. KEDA tworzy i zarzadza HPA w tle — uzytkownik nie musi tworzyc HPA recznie.</w:t>
+      </w:r>
+    </w:p>
+    <w:p>
+      <w:pPr>
+        <w:spacing w:after="80" w:before="0"/>
+      </w:pPr>
+      <w:r>
+        <w:t xml:space="preserve"/>
+      </w:r>
+    </w:p>
+    <w:p>
+      <w:pPr>
+        <w:pStyle w:val="Heading2"/>
+        <w:spacing w:after="140" w:before="280"/>
+      </w:pPr>
+      <w:r>
+        <w:rPr>
+          <w:rFonts w:ascii="Arial" w:cs="Arial" w:eastAsia="Arial" w:hAnsi="Arial"/>
+          <w:b/>
+          <w:bCs/>
+          <w:color w:val="2E75B6"/>
+          <w:sz w:val="26"/>
+          <w:szCs w:val="26"/>
+        </w:rPr>
+        <w:t xml:space="preserve">Co zrobilimy</w:t>
+      </w:r>
+    </w:p>
+    <w:p>
+      <w:pPr>
+        <w:pStyle w:val="ListParagraph"/>
+        <w:numPr>
+          <w:ilvl w:val="0"/>
+          <w:numId w:val="2"/>
+        </w:numPr>
+        <w:spacing w:after="60" w:before="60"/>
+      </w:pPr>
+      <w:r>
+        <w:rPr>
+          <w:rFonts w:ascii="Arial" w:cs="Arial" w:eastAsia="Arial" w:hAnsi="Arial"/>
+          <w:sz w:val="22"/>
+          <w:szCs w:val="22"/>
+        </w:rPr>
+        <w:t xml:space="preserve">Zainstalowalismy KEDA przez Helm (kedacore/keda) w namespace keda</w:t>
+      </w:r>
+    </w:p>
+    <w:p>
+      <w:pPr>
+        <w:pStyle w:val="ListParagraph"/>
+        <w:numPr>
+          <w:ilvl w:val="0"/>
+          <w:numId w:val="2"/>
+        </w:numPr>
+        <w:spacing w:after="60" w:before="60"/>
+      </w:pPr>
+      <w:r>
+        <w:rPr>
+          <w:rFonts w:ascii="Arial" w:cs="Arial" w:eastAsia="Arial" w:hAnsi="Arial"/>
+          <w:sz w:val="22"/>
+          <w:szCs w:val="22"/>
+        </w:rPr>
+        <w:t xml:space="preserve">Usunelismy stary HPA z Part 3 — KEDA nie moze wspoldzielic Deployment z istniejacym HPA</w:t>
+      </w:r>
+    </w:p>
+    <w:p>
+      <w:pPr>
+        <w:pStyle w:val="ListParagraph"/>
+        <w:numPr>
+          <w:ilvl w:val="0"/>
+          <w:numId w:val="2"/>
+        </w:numPr>
+        <w:spacing w:after="60" w:before="60"/>
+      </w:pPr>
+      <w:r>
+        <w:rPr>
+          <w:rFonts w:ascii="Arial" w:cs="Arial" w:eastAsia="Arial" w:hAnsi="Arial"/>
+          <w:sz w:val="22"/>
+          <w:szCs w:val="22"/>
+        </w:rPr>
+        <w:t xml:space="preserve">Stworzylimy ScaledObject z triggerem Prometheus — metryka: container_cpu_usage_seconds_total</w:t>
+      </w:r>
+    </w:p>
+    <w:p>
+      <w:pPr>
+        <w:pStyle w:val="ListParagraph"/>
+        <w:numPr>
+          <w:ilvl w:val="0"/>
+          <w:numId w:val="2"/>
+        </w:numPr>
+        <w:spacing w:after="60" w:before="60"/>
+      </w:pPr>
+      <w:r>
+        <w:rPr>
+          <w:rFonts w:ascii="Arial" w:cs="Arial" w:eastAsia="Arial" w:hAnsi="Arial"/>
+          <w:sz w:val="22"/>
+          <w:szCs w:val="22"/>
+        </w:rPr>
+        <w:t xml:space="preserve">Zdiagnozowalismy blad: kontener nazywa sie 'whoami' nie 'aras-demo-app' — poprawka w query</w:t>
+      </w:r>
+    </w:p>
+    <w:p>
+      <w:pPr>
+        <w:pStyle w:val="ListParagraph"/>
+        <w:numPr>
+          <w:ilvl w:val="0"/>
+          <w:numId w:val="2"/>
+        </w:numPr>
+        <w:spacing w:after="60" w:before="60"/>
+      </w:pPr>
+      <w:r>
+        <w:rPr>
+          <w:rFonts w:ascii="Arial" w:cs="Arial" w:eastAsia="Arial" w:hAnsi="Arial"/>
+          <w:sz w:val="22"/>
+          <w:szCs w:val="22"/>
+        </w:rPr>
+        <w:t xml:space="preserve">Test obciazeniowy: ab -n 500000 -c 100 przez SSH na masterze</w:t>
+      </w:r>
+    </w:p>
+    <w:p>
+      <w:pPr>
+        <w:pStyle w:val="ListParagraph"/>
+        <w:numPr>
+          <w:ilvl w:val="0"/>
+          <w:numId w:val="2"/>
+        </w:numPr>
+        <w:spacing w:after="60" w:before="60"/>
+      </w:pPr>
+      <w:r>
+        <w:rPr>
+          <w:rFonts w:ascii="Arial" w:cs="Arial" w:eastAsia="Arial" w:hAnsi="Arial"/>
+          <w:sz w:val="22"/>
+          <w:szCs w:val="22"/>
+        </w:rPr>
+        <w:t xml:space="preserve">Scale-up: 1 → 2 → 4 → 8 replik automatycznie w ciagu 45 sekund</w:t>
+      </w:r>
+    </w:p>
+    <w:p>
+      <w:pPr>
+        <w:pStyle w:val="ListParagraph"/>
+        <w:numPr>
+          <w:ilvl w:val="0"/>
+          <w:numId w:val="2"/>
+        </w:numPr>
+        <w:spacing w:after="60" w:before="60"/>
+      </w:pPr>
+      <w:r>
+        <w:rPr>
+          <w:rFonts w:ascii="Arial" w:cs="Arial" w:eastAsia="Arial" w:hAnsi="Arial"/>
+          <w:sz w:val="22"/>
+          <w:szCs w:val="22"/>
+        </w:rPr>
+        <w:t xml:space="preserve">Scale-down: 8 → 1 replika po 30 sekundach cooldown (vs 5 minut w HPA)</w:t>
+      </w:r>
+    </w:p>
+    <w:p>
+      <w:pPr>
+        <w:spacing w:after="80" w:before="0"/>
+      </w:pPr>
+      <w:r>
+        <w:t xml:space="preserve"/>
+      </w:r>
+    </w:p>
+    <w:tbl>
+      <w:tblPr>
+        <w:tblW w:type="dxa" w:w="9360"/>
+        <w:tblBorders>
+          <w:top w:val="single" w:color="auto" w:sz="4"/>
+          <w:left w:val="single" w:color="auto" w:sz="4"/>
+          <w:bottom w:val="single" w:color="auto" w:sz="4"/>
+          <w:right w:val="single" w:color="auto" w:sz="4"/>
+          <w:insideH w:val="single" w:color="auto" w:sz="4"/>
+          <w:insideV w:val="single" w:color="auto" w:sz="4"/>
+        </w:tblBorders>
+      </w:tblPr>
+      <w:tblGrid>
+        <w:gridCol w:w="9360"/>
+      </w:tblGrid>
+      <w:tr>
+        <w:tc>
+          <w:tcPr>
+            <w:tcW w:type="dxa" w:w="9360"/>
+            <w:tcBorders>
+              <w:top w:val="single" w:color="CCCCCC" w:sz="1"/>
+              <w:left w:val="single" w:color="CCCCCC" w:sz="1"/>
+              <w:bottom w:val="single" w:color="CCCCCC" w:sz="1"/>
+              <w:right w:val="single" w:color="CCCCCC" w:sz="1"/>
+            </w:tcBorders>
+            <w:shd w:fill="F2F2F2" w:val="clear"/>
+            <w:tcMar>
+              <w:top w:type="dxa" w:w="120"/>
+              <w:left w:type="dxa" w:w="200"/>
+              <w:bottom w:type="dxa" w:w="120"/>
+              <w:right w:type="dxa" w:w="200"/>
+            </w:tcMar>
+          </w:tcPr>
+          <w:p>
+            <w:pPr>
+              <w:spacing w:after="0" w:before="0"/>
+            </w:pPr>
+            <w:r>
+              <w:rPr>
+                <w:rFonts w:ascii="Arial" w:cs="Arial" w:eastAsia="Arial" w:hAnsi="Arial"/>
+                <w:b/>
+                <w:bCs/>
+                <w:sz w:val="22"/>
+                <w:szCs w:val="22"/>
+              </w:rPr>
+              <w:t xml:space="preserve">Wynik w projekcie: </w:t>
+            </w:r>
+            <w:r>
+              <w:rPr>
+                <w:rFonts w:ascii="Arial" w:cs="Arial" w:eastAsia="Arial" w:hAnsi="Arial"/>
+                <w:sz w:val="22"/>
+                <w:szCs w:val="22"/>
+              </w:rPr>
+              <w:t xml:space="preserve">kubectl get scaledobject -n default:
+NAME             READY  ACTIVE  FALLBACK  TRIGGERS    MIN  MAX
+aras-demo-keda   True   True    False     prometheus  1    8
+# Podczas obciazenia:
+kubectl get pods -n default | grep aras:
+aras-demo-app-*-spwkm   1/1  Running  (oryginalna)
+aras-demo-app-*-dhfhb   1/1  Running  (dodana przez KEDA)
+aras-demo-app-*-q9qtz   1/1  Running  (dodana przez KEDA)
+aras-demo-app-*-zrtlx   1/1  Running  (dodana przez KEDA)
+...
+# szczyt: 8 podow Running
+# Po obciazeniu (30s cooldown):
+aras-demo-app-*-spwkm   1/1  Running  &lt;- tylko 1 replika
+ab wyniki: 200000 requestow, 2747 req/s, 72.781 sekund</w:t>
+            </w:r>
+          </w:p>
+        </w:tc>
+      </w:tr>
+    </w:tbl>
+    <w:p>
+      <w:pPr>
+        <w:spacing w:after="80" w:before="0"/>
+      </w:pPr>
+      <w:r>
+        <w:t xml:space="preserve"/>
+      </w:r>
+    </w:p>
+    <w:p>
+      <w:pPr>
+        <w:pStyle w:val="Heading2"/>
+        <w:spacing w:after="140" w:before="280"/>
+      </w:pPr>
+      <w:r>
+        <w:rPr>
+          <w:rFonts w:ascii="Arial" w:cs="Arial" w:eastAsia="Arial" w:hAnsi="Arial"/>
+          <w:b/>
+          <w:bCs/>
+          <w:color w:val="2E75B6"/>
+          <w:sz w:val="26"/>
+          <w:szCs w:val="26"/>
+        </w:rPr>
+        <w:t xml:space="preserve">Roznica miedzy HPA a KEDA</w:t>
+      </w:r>
+    </w:p>
+    <w:tbl>
+      <w:tblPr>
+        <w:tblW w:type="dxa" w:w="9360"/>
+        <w:tblBorders>
+          <w:top w:val="single" w:color="auto" w:sz="4"/>
+          <w:left w:val="single" w:color="auto" w:sz="4"/>
+          <w:bottom w:val="single" w:color="auto" w:sz="4"/>
+          <w:right w:val="single" w:color="auto" w:sz="4"/>
+          <w:insideH w:val="single" w:color="auto" w:sz="4"/>
+          <w:insideV w:val="single" w:color="auto" w:sz="4"/>
+        </w:tblBorders>
+      </w:tblPr>
+      <w:tblGrid>
+        <w:gridCol w:w="3000"/>
+        <w:gridCol w:w="3180"/>
+        <w:gridCol w:w="3180"/>
+      </w:tblGrid>
+      <w:tr>
+        <w:tc>
+          <w:tcPr>
+            <w:tcBorders>
+              <w:top w:val="single" w:color="CCCCCC" w:sz="1"/>
+              <w:left w:val="single" w:color="CCCCCC" w:sz="1"/>
+              <w:bottom w:val="single" w:color="CCCCCC" w:sz="1"/>
+              <w:right w:val="single" w:color="CCCCCC" w:sz="1"/>
+            </w:tcBorders>
+            <w:shd w:fill="2E75B6" w:val="clear"/>
+            <w:tcMar>
+              <w:top w:type="dxa" w:w="80"/>
+              <w:left w:type="dxa" w:w="120"/>
+              <w:bottom w:type="dxa" w:w="80"/>
+              <w:right w:type="dxa" w:w="120"/>
+            </w:tcMar>
+          </w:tcPr>
+          <w:p>
+            <w:r>
+              <w:rPr>
+                <w:rFonts w:ascii="Arial" w:cs="Arial" w:eastAsia="Arial" w:hAnsi="Arial"/>
+                <w:b/>
+                <w:bCs/>
+                <w:color w:val="FFFFFF"/>
+                <w:sz w:val="20"/>
+                <w:szCs w:val="20"/>
+              </w:rPr>
+              <w:t xml:space="preserve">Aspekt</w:t>
+            </w:r>
+          </w:p>
+        </w:tc>
+        <w:tc>
+          <w:tcPr>
+            <w:tcBorders>
+              <w:top w:val="single" w:color="CCCCCC" w:sz="1"/>
+              <w:left w:val="single" w:color="CCCCCC" w:sz="1"/>
+              <w:bottom w:val="single" w:color="CCCCCC" w:sz="1"/>
+              <w:right w:val="single" w:color="CCCCCC" w:sz="1"/>
+            </w:tcBorders>
+            <w:shd w:fill="2E75B6" w:val="clear"/>
+            <w:tcMar>
+              <w:top w:type="dxa" w:w="80"/>
+              <w:left w:type="dxa" w:w="120"/>
+              <w:bottom w:type="dxa" w:w="80"/>
+              <w:right w:type="dxa" w:w="120"/>
+            </w:tcMar>
+          </w:tcPr>
+          <w:p>
+            <w:r>
+              <w:rPr>
+                <w:rFonts w:ascii="Arial" w:cs="Arial" w:eastAsia="Arial" w:hAnsi="Arial"/>
+                <w:b/>
+                <w:bCs/>
+                <w:color w:val="FFFFFF"/>
+                <w:sz w:val="20"/>
+                <w:szCs w:val="20"/>
+              </w:rPr>
+              <w:t xml:space="preserve">HPA (Part 3)</w:t>
+            </w:r>
+          </w:p>
+        </w:tc>
+        <w:tc>
+          <w:tcPr>
+            <w:tcBorders>
+              <w:top w:val="single" w:color="CCCCCC" w:sz="1"/>
+              <w:left w:val="single" w:color="CCCCCC" w:sz="1"/>
+              <w:bottom w:val="single" w:color="CCCCCC" w:sz="1"/>
+              <w:right w:val="single" w:color="CCCCCC" w:sz="1"/>
+            </w:tcBorders>
+            <w:shd w:fill="2E75B6" w:val="clear"/>
+            <w:tcMar>
+              <w:top w:type="dxa" w:w="80"/>
+              <w:left w:type="dxa" w:w="120"/>
+              <w:bottom w:type="dxa" w:w="80"/>
+              <w:right w:type="dxa" w:w="120"/>
+            </w:tcMar>
+          </w:tcPr>
+          <w:p>
+            <w:r>
+              <w:rPr>
+                <w:rFonts w:ascii="Arial" w:cs="Arial" w:eastAsia="Arial" w:hAnsi="Arial"/>
+                <w:b/>
+                <w:bCs/>
+                <w:color w:val="FFFFFF"/>
+                <w:sz w:val="20"/>
+                <w:szCs w:val="20"/>
+              </w:rPr>
+              <w:t xml:space="preserve">KEDA (Part 6)</w:t>
+            </w:r>
+          </w:p>
+        </w:tc>
+      </w:tr>
+      <w:tr>
+        <w:tc>
+          <w:tcPr>
+            <w:tcBorders>
+              <w:top w:val="single" w:color="CCCCCC" w:sz="1"/>
+              <w:left w:val="single" w:color="CCCCCC" w:sz="1"/>
+              <w:bottom w:val="single" w:color="CCCCCC" w:sz="1"/>
+              <w:right w:val="single" w:color="CCCCCC" w:sz="1"/>
+            </w:tcBorders>
+            <w:shd w:fill="FFFFFF" w:val="clear"/>
+            <w:tcMar>
+              <w:top w:type="dxa" w:w="80"/>
+              <w:left w:type="dxa" w:w="120"/>
+              <w:bottom w:type="dxa" w:w="80"/>
+              <w:right w:type="dxa" w:w="120"/>
+            </w:tcMar>
+          </w:tcPr>
+          <w:p>
+            <w:r>
+              <w:rPr>
+                <w:rFonts w:ascii="Arial" w:cs="Arial" w:eastAsia="Arial" w:hAnsi="Arial"/>
+                <w:sz w:val="20"/>
+                <w:szCs w:val="20"/>
+              </w:rPr>
+              <w:t xml:space="preserve">Minimum replik</w:t>
+            </w:r>
+          </w:p>
+        </w:tc>
+        <w:tc>
+          <w:tcPr>
+            <w:tcBorders>
+              <w:top w:val="single" w:color="CCCCCC" w:sz="1"/>
+              <w:left w:val="single" w:color="CCCCCC" w:sz="1"/>
+              <w:bottom w:val="single" w:color="CCCCCC" w:sz="1"/>
+              <w:right w:val="single" w:color="CCCCCC" w:sz="1"/>
+            </w:tcBorders>
+            <w:shd w:fill="FFFFFF" w:val="clear"/>
+            <w:tcMar>
+              <w:top w:type="dxa" w:w="80"/>
+              <w:left w:type="dxa" w:w="120"/>
+              <w:bottom w:type="dxa" w:w="80"/>
+              <w:right w:type="dxa" w:w="120"/>
+            </w:tcMar>
+          </w:tcPr>
+          <w:p>
+            <w:r>
+              <w:rPr>
+                <w:rFonts w:ascii="Arial" w:cs="Arial" w:eastAsia="Arial" w:hAnsi="Arial"/>
+                <w:sz w:val="20"/>
+                <w:szCs w:val="20"/>
+              </w:rPr>
+              <w:t xml:space="preserve">2</w:t>
+            </w:r>
+          </w:p>
+        </w:tc>
+        <w:tc>
+          <w:tcPr>
+            <w:tcBorders>
+              <w:top w:val="single" w:color="CCCCCC" w:sz="1"/>
+              <w:left w:val="single" w:color="CCCCCC" w:sz="1"/>
+              <w:bottom w:val="single" w:color="CCCCCC" w:sz="1"/>
+              <w:right w:val="single" w:color="CCCCCC" w:sz="1"/>
+            </w:tcBorders>
+            <w:shd w:fill="FFFFFF" w:val="clear"/>
+            <w:tcMar>
+              <w:top w:type="dxa" w:w="80"/>
+              <w:left w:type="dxa" w:w="120"/>
+              <w:bottom w:type="dxa" w:w="80"/>
+              <w:right w:type="dxa" w:w="120"/>
+            </w:tcMar>
+          </w:tcPr>
+          <w:p>
+            <w:r>
+              <w:rPr>
+                <w:rFonts w:ascii="Arial" w:cs="Arial" w:eastAsia="Arial" w:hAnsi="Arial"/>
+                <w:sz w:val="20"/>
+                <w:szCs w:val="20"/>
+              </w:rPr>
+              <w:t xml:space="preserve">1 (lub 0 dla batch jobow)</w:t>
+            </w:r>
+          </w:p>
+        </w:tc>
+      </w:tr>
+      <w:tr>
+        <w:tc>
+          <w:tcPr>
+            <w:tcBorders>
+              <w:top w:val="single" w:color="CCCCCC" w:sz="1"/>
+              <w:left w:val="single" w:color="CCCCCC" w:sz="1"/>
+              <w:bottom w:val="single" w:color="CCCCCC" w:sz="1"/>
+              <w:right w:val="single" w:color="CCCCCC" w:sz="1"/>
+            </w:tcBorders>
+            <w:shd w:fill="F2F2F2" w:val="clear"/>
+            <w:tcMar>
+              <w:top w:type="dxa" w:w="80"/>
+              <w:left w:type="dxa" w:w="120"/>
+              <w:bottom w:type="dxa" w:w="80"/>
+              <w:right w:type="dxa" w:w="120"/>
+            </w:tcMar>
+          </w:tcPr>
+          <w:p>
+            <w:r>
+              <w:rPr>
+                <w:rFonts w:ascii="Arial" w:cs="Arial" w:eastAsia="Arial" w:hAnsi="Arial"/>
+                <w:sz w:val="20"/>
+                <w:szCs w:val="20"/>
+              </w:rPr>
+              <w:t xml:space="preserve">Zrodlo triggera</w:t>
+            </w:r>
+          </w:p>
+        </w:tc>
+        <w:tc>
+          <w:tcPr>
+            <w:tcBorders>
+              <w:top w:val="single" w:color="CCCCCC" w:sz="1"/>
+              <w:left w:val="single" w:color="CCCCCC" w:sz="1"/>
+              <w:bottom w:val="single" w:color="CCCCCC" w:sz="1"/>
+              <w:right w:val="single" w:color="CCCCCC" w:sz="1"/>
+            </w:tcBorders>
+            <w:shd w:fill="F2F2F2" w:val="clear"/>
+            <w:tcMar>
+              <w:top w:type="dxa" w:w="80"/>
+              <w:left w:type="dxa" w:w="120"/>
+              <w:bottom w:type="dxa" w:w="80"/>
+              <w:right w:type="dxa" w:w="120"/>
+            </w:tcMar>
+          </w:tcPr>
+          <w:p>
+            <w:r>
+              <w:rPr>
+                <w:rFonts w:ascii="Arial" w:cs="Arial" w:eastAsia="Arial" w:hAnsi="Arial"/>
+                <w:sz w:val="20"/>
+                <w:szCs w:val="20"/>
+              </w:rPr>
+              <w:t xml:space="preserve">CPU/RAM (metrics-server)</w:t>
+            </w:r>
+          </w:p>
+        </w:tc>
+        <w:tc>
+          <w:tcPr>
+            <w:tcBorders>
+              <w:top w:val="single" w:color="CCCCCC" w:sz="1"/>
+              <w:left w:val="single" w:color="CCCCCC" w:sz="1"/>
+              <w:bottom w:val="single" w:color="CCCCCC" w:sz="1"/>
+              <w:right w:val="single" w:color="CCCCCC" w:sz="1"/>
+            </w:tcBorders>
+            <w:shd w:fill="F2F2F2" w:val="clear"/>
+            <w:tcMar>
+              <w:top w:type="dxa" w:w="80"/>
+              <w:left w:type="dxa" w:w="120"/>
+              <w:bottom w:type="dxa" w:w="80"/>
+              <w:right w:type="dxa" w:w="120"/>
+            </w:tcMar>
+          </w:tcPr>
+          <w:p>
+            <w:r>
+              <w:rPr>
+                <w:rFonts w:ascii="Arial" w:cs="Arial" w:eastAsia="Arial" w:hAnsi="Arial"/>
+                <w:sz w:val="20"/>
+                <w:szCs w:val="20"/>
+              </w:rPr>
+              <w:t xml:space="preserve">50+ zrodel: Prometheus, kolejki, HTTP...</w:t>
+            </w:r>
+          </w:p>
+        </w:tc>
+      </w:tr>
+      <w:tr>
+        <w:tc>
+          <w:tcPr>
+            <w:tcBorders>
+              <w:top w:val="single" w:color="CCCCCC" w:sz="1"/>
+              <w:left w:val="single" w:color="CCCCCC" w:sz="1"/>
+              <w:bottom w:val="single" w:color="CCCCCC" w:sz="1"/>
+              <w:right w:val="single" w:color="CCCCCC" w:sz="1"/>
+            </w:tcBorders>
+            <w:shd w:fill="FFFFFF" w:val="clear"/>
+            <w:tcMar>
+              <w:top w:type="dxa" w:w="80"/>
+              <w:left w:type="dxa" w:w="120"/>
+              <w:bottom w:type="dxa" w:w="80"/>
+              <w:right w:type="dxa" w:w="120"/>
+            </w:tcMar>
+          </w:tcPr>
+          <w:p>
+            <w:r>
+              <w:rPr>
+                <w:rFonts w:ascii="Arial" w:cs="Arial" w:eastAsia="Arial" w:hAnsi="Arial"/>
+                <w:sz w:val="20"/>
+                <w:szCs w:val="20"/>
+              </w:rPr>
+              <w:t xml:space="preserve">Scale to zero</w:t>
+            </w:r>
+          </w:p>
+        </w:tc>
+        <w:tc>
+          <w:tcPr>
+            <w:tcBorders>
+              <w:top w:val="single" w:color="CCCCCC" w:sz="1"/>
+              <w:left w:val="single" w:color="CCCCCC" w:sz="1"/>
+              <w:bottom w:val="single" w:color="CCCCCC" w:sz="1"/>
+              <w:right w:val="single" w:color="CCCCCC" w:sz="1"/>
+            </w:tcBorders>
+            <w:shd w:fill="FFFFFF" w:val="clear"/>
+            <w:tcMar>
+              <w:top w:type="dxa" w:w="80"/>
+              <w:left w:type="dxa" w:w="120"/>
+              <w:bottom w:type="dxa" w:w="80"/>
+              <w:right w:type="dxa" w:w="120"/>
+            </w:tcMar>
+          </w:tcPr>
+          <w:p>
+            <w:r>
+              <w:rPr>
+                <w:rFonts w:ascii="Arial" w:cs="Arial" w:eastAsia="Arial" w:hAnsi="Arial"/>
+                <w:sz w:val="20"/>
+                <w:szCs w:val="20"/>
+              </w:rPr>
+              <w:t xml:space="preserve">Nie</w:t>
+            </w:r>
+          </w:p>
+        </w:tc>
+        <w:tc>
+          <w:tcPr>
+            <w:tcBorders>
+              <w:top w:val="single" w:color="CCCCCC" w:sz="1"/>
+              <w:left w:val="single" w:color="CCCCCC" w:sz="1"/>
+              <w:bottom w:val="single" w:color="CCCCCC" w:sz="1"/>
+              <w:right w:val="single" w:color="CCCCCC" w:sz="1"/>
+            </w:tcBorders>
+            <w:shd w:fill="FFFFFF" w:val="clear"/>
+            <w:tcMar>
+              <w:top w:type="dxa" w:w="80"/>
+              <w:left w:type="dxa" w:w="120"/>
+              <w:bottom w:type="dxa" w:w="80"/>
+              <w:right w:type="dxa" w:w="120"/>
+            </w:tcMar>
+          </w:tcPr>
+          <w:p>
+            <w:r>
+              <w:rPr>
+                <w:rFonts w:ascii="Arial" w:cs="Arial" w:eastAsia="Arial" w:hAnsi="Arial"/>
+                <w:sz w:val="20"/>
+                <w:szCs w:val="20"/>
+              </w:rPr>
+              <w:t xml:space="preserve">Tak — zero kosztow gdy brak ruchu</w:t>
+            </w:r>
+          </w:p>
+        </w:tc>
+      </w:tr>
+      <w:tr>
+        <w:tc>
+          <w:tcPr>
+            <w:tcBorders>
+              <w:top w:val="single" w:color="CCCCCC" w:sz="1"/>
+              <w:left w:val="single" w:color="CCCCCC" w:sz="1"/>
+              <w:bottom w:val="single" w:color="CCCCCC" w:sz="1"/>
+              <w:right w:val="single" w:color="CCCCCC" w:sz="1"/>
+            </w:tcBorders>
+            <w:shd w:fill="F2F2F2" w:val="clear"/>
+            <w:tcMar>
+              <w:top w:type="dxa" w:w="80"/>
+              <w:left w:type="dxa" w:w="120"/>
+              <w:bottom w:type="dxa" w:w="80"/>
+              <w:right w:type="dxa" w:w="120"/>
+            </w:tcMar>
+          </w:tcPr>
+          <w:p>
+            <w:r>
+              <w:rPr>
+                <w:rFonts w:ascii="Arial" w:cs="Arial" w:eastAsia="Arial" w:hAnsi="Arial"/>
+                <w:sz w:val="20"/>
+                <w:szCs w:val="20"/>
+              </w:rPr>
+              <w:t xml:space="preserve">Cooldown</w:t>
+            </w:r>
+          </w:p>
+        </w:tc>
+        <w:tc>
+          <w:tcPr>
+            <w:tcBorders>
+              <w:top w:val="single" w:color="CCCCCC" w:sz="1"/>
+              <w:left w:val="single" w:color="CCCCCC" w:sz="1"/>
+              <w:bottom w:val="single" w:color="CCCCCC" w:sz="1"/>
+              <w:right w:val="single" w:color="CCCCCC" w:sz="1"/>
+            </w:tcBorders>
+            <w:shd w:fill="F2F2F2" w:val="clear"/>
+            <w:tcMar>
+              <w:top w:type="dxa" w:w="80"/>
+              <w:left w:type="dxa" w:w="120"/>
+              <w:bottom w:type="dxa" w:w="80"/>
+              <w:right w:type="dxa" w:w="120"/>
+            </w:tcMar>
+          </w:tcPr>
+          <w:p>
+            <w:r>
+              <w:rPr>
+                <w:rFonts w:ascii="Arial" w:cs="Arial" w:eastAsia="Arial" w:hAnsi="Arial"/>
+                <w:sz w:val="20"/>
+                <w:szCs w:val="20"/>
+              </w:rPr>
+              <w:t xml:space="preserve">5 minut</w:t>
+            </w:r>
+          </w:p>
+        </w:tc>
+        <w:tc>
+          <w:tcPr>
+            <w:tcBorders>
+              <w:top w:val="single" w:color="CCCCCC" w:sz="1"/>
+              <w:left w:val="single" w:color="CCCCCC" w:sz="1"/>
+              <w:bottom w:val="single" w:color="CCCCCC" w:sz="1"/>
+              <w:right w:val="single" w:color="CCCCCC" w:sz="1"/>
+            </w:tcBorders>
+            <w:shd w:fill="F2F2F2" w:val="clear"/>
+            <w:tcMar>
+              <w:top w:type="dxa" w:w="80"/>
+              <w:left w:type="dxa" w:w="120"/>
+              <w:bottom w:type="dxa" w:w="80"/>
+              <w:right w:type="dxa" w:w="120"/>
+            </w:tcMar>
+          </w:tcPr>
+          <w:p>
+            <w:r>
+              <w:rPr>
+                <w:rFonts w:ascii="Arial" w:cs="Arial" w:eastAsia="Arial" w:hAnsi="Arial"/>
+                <w:sz w:val="20"/>
+                <w:szCs w:val="20"/>
+              </w:rPr>
+              <w:t xml:space="preserve">30 sekund (konfigurowalny)</w:t>
+            </w:r>
+          </w:p>
+        </w:tc>
+      </w:tr>
+      <w:tr>
+        <w:tc>
+          <w:tcPr>
+            <w:tcBorders>
+              <w:top w:val="single" w:color="CCCCCC" w:sz="1"/>
+              <w:left w:val="single" w:color="CCCCCC" w:sz="1"/>
+              <w:bottom w:val="single" w:color="CCCCCC" w:sz="1"/>
+              <w:right w:val="single" w:color="CCCCCC" w:sz="1"/>
+            </w:tcBorders>
+            <w:shd w:fill="FFFFFF" w:val="clear"/>
+            <w:tcMar>
+              <w:top w:type="dxa" w:w="80"/>
+              <w:left w:type="dxa" w:w="120"/>
+              <w:bottom w:type="dxa" w:w="80"/>
+              <w:right w:type="dxa" w:w="120"/>
+            </w:tcMar>
+          </w:tcPr>
+          <w:p>
+            <w:r>
+              <w:rPr>
+                <w:rFonts w:ascii="Arial" w:cs="Arial" w:eastAsia="Arial" w:hAnsi="Arial"/>
+                <w:sz w:val="20"/>
+                <w:szCs w:val="20"/>
+              </w:rPr>
+              <w:t xml:space="preserve">Zarzadzanie HPA</w:t>
+            </w:r>
+          </w:p>
+        </w:tc>
+        <w:tc>
+          <w:tcPr>
+            <w:tcBorders>
+              <w:top w:val="single" w:color="CCCCCC" w:sz="1"/>
+              <w:left w:val="single" w:color="CCCCCC" w:sz="1"/>
+              <w:bottom w:val="single" w:color="CCCCCC" w:sz="1"/>
+              <w:right w:val="single" w:color="CCCCCC" w:sz="1"/>
+            </w:tcBorders>
+            <w:shd w:fill="FFFFFF" w:val="clear"/>
+            <w:tcMar>
+              <w:top w:type="dxa" w:w="80"/>
+              <w:left w:type="dxa" w:w="120"/>
+              <w:bottom w:type="dxa" w:w="80"/>
+              <w:right w:type="dxa" w:w="120"/>
+            </w:tcMar>
+          </w:tcPr>
+          <w:p>
+            <w:r>
+              <w:rPr>
+                <w:rFonts w:ascii="Arial" w:cs="Arial" w:eastAsia="Arial" w:hAnsi="Arial"/>
+                <w:sz w:val="20"/>
+                <w:szCs w:val="20"/>
+              </w:rPr>
+              <w:t xml:space="preserve">Uzytkownik tworzy HPA</w:t>
+            </w:r>
+          </w:p>
+        </w:tc>
+        <w:tc>
+          <w:tcPr>
+            <w:tcBorders>
+              <w:top w:val="single" w:color="CCCCCC" w:sz="1"/>
+              <w:left w:val="single" w:color="CCCCCC" w:sz="1"/>
+              <w:bottom w:val="single" w:color="CCCCCC" w:sz="1"/>
+              <w:right w:val="single" w:color="CCCCCC" w:sz="1"/>
+            </w:tcBorders>
+            <w:shd w:fill="FFFFFF" w:val="clear"/>
+            <w:tcMar>
+              <w:top w:type="dxa" w:w="80"/>
+              <w:left w:type="dxa" w:w="120"/>
+              <w:bottom w:type="dxa" w:w="80"/>
+              <w:right w:type="dxa" w:w="120"/>
+            </w:tcMar>
+          </w:tcPr>
+          <w:p>
+            <w:r>
+              <w:rPr>
+                <w:rFonts w:ascii="Arial" w:cs="Arial" w:eastAsia="Arial" w:hAnsi="Arial"/>
+                <w:sz w:val="20"/>
+                <w:szCs w:val="20"/>
+              </w:rPr>
+              <w:t xml:space="preserve">KEDA tworzy HPA automatycznie</w:t>
+            </w:r>
+          </w:p>
+        </w:tc>
+      </w:tr>
+      <w:tr>
+        <w:tc>
+          <w:tcPr>
+            <w:tcBorders>
+              <w:top w:val="single" w:color="CCCCCC" w:sz="1"/>
+              <w:left w:val="single" w:color="CCCCCC" w:sz="1"/>
+              <w:bottom w:val="single" w:color="CCCCCC" w:sz="1"/>
+              <w:right w:val="single" w:color="CCCCCC" w:sz="1"/>
+            </w:tcBorders>
+            <w:shd w:fill="F2F2F2" w:val="clear"/>
+            <w:tcMar>
+              <w:top w:type="dxa" w:w="80"/>
+              <w:left w:type="dxa" w:w="120"/>
+              <w:bottom w:type="dxa" w:w="80"/>
+              <w:right w:type="dxa" w:w="120"/>
+            </w:tcMar>
+          </w:tcPr>
+          <w:p>
+            <w:r>
+              <w:rPr>
+                <w:rFonts w:ascii="Arial" w:cs="Arial" w:eastAsia="Arial" w:hAnsi="Arial"/>
+                <w:sz w:val="20"/>
+                <w:szCs w:val="20"/>
+              </w:rPr>
+              <w:t xml:space="preserve">Triggerow na raz</w:t>
+            </w:r>
+          </w:p>
+        </w:tc>
+        <w:tc>
+          <w:tcPr>
+            <w:tcBorders>
+              <w:top w:val="single" w:color="CCCCCC" w:sz="1"/>
+              <w:left w:val="single" w:color="CCCCCC" w:sz="1"/>
+              <w:bottom w:val="single" w:color="CCCCCC" w:sz="1"/>
+              <w:right w:val="single" w:color="CCCCCC" w:sz="1"/>
+            </w:tcBorders>
+            <w:shd w:fill="F2F2F2" w:val="clear"/>
+            <w:tcMar>
+              <w:top w:type="dxa" w:w="80"/>
+              <w:left w:type="dxa" w:w="120"/>
+              <w:bottom w:type="dxa" w:w="80"/>
+              <w:right w:type="dxa" w:w="120"/>
+            </w:tcMar>
+          </w:tcPr>
+          <w:p>
+            <w:r>
+              <w:rPr>
+                <w:rFonts w:ascii="Arial" w:cs="Arial" w:eastAsia="Arial" w:hAnsi="Arial"/>
+                <w:sz w:val="20"/>
+                <w:szCs w:val="20"/>
+              </w:rPr>
+              <w:t xml:space="preserve">1 (CPU lub RAM)</w:t>
+            </w:r>
+          </w:p>
+        </w:tc>
+        <w:tc>
+          <w:tcPr>
+            <w:tcBorders>
+              <w:top w:val="single" w:color="CCCCCC" w:sz="1"/>
+              <w:left w:val="single" w:color="CCCCCC" w:sz="1"/>
+              <w:bottom w:val="single" w:color="CCCCCC" w:sz="1"/>
+              <w:right w:val="single" w:color="CCCCCC" w:sz="1"/>
+            </w:tcBorders>
+            <w:shd w:fill="F2F2F2" w:val="clear"/>
+            <w:tcMar>
+              <w:top w:type="dxa" w:w="80"/>
+              <w:left w:type="dxa" w:w="120"/>
+              <w:bottom w:type="dxa" w:w="80"/>
+              <w:right w:type="dxa" w:w="120"/>
+            </w:tcMar>
+          </w:tcPr>
+          <w:p>
+            <w:r>
+              <w:rPr>
+                <w:rFonts w:ascii="Arial" w:cs="Arial" w:eastAsia="Arial" w:hAnsi="Arial"/>
+                <w:sz w:val="20"/>
+                <w:szCs w:val="20"/>
+              </w:rPr>
+              <w:t xml:space="preserve">Wiele — CPU AND kolejka AND HTTP</w:t>
+            </w:r>
+          </w:p>
+        </w:tc>
+      </w:tr>
+    </w:tbl>
+    <w:p>
+      <w:pPr>
+        <w:spacing w:after="80" w:before="0"/>
+      </w:pPr>
+      <w:r>
+        <w:t xml:space="preserve"/>
+      </w:r>
+    </w:p>
+    <w:p>
+      <w:pPr>
+        <w:pStyle w:val="Heading2"/>
+        <w:spacing w:after="140" w:before="280"/>
+      </w:pPr>
+      <w:r>
+        <w:rPr>
+          <w:rFonts w:ascii="Arial" w:cs="Arial" w:eastAsia="Arial" w:hAnsi="Arial"/>
+          <w:b/>
+          <w:bCs/>
+          <w:color w:val="2E75B6"/>
+          <w:sz w:val="26"/>
+          <w:szCs w:val="26"/>
+        </w:rPr>
+        <w:t xml:space="preserve">Zastosowania produkcyjne</w:t>
+      </w:r>
+    </w:p>
+    <w:p>
+      <w:pPr>
+        <w:pStyle w:val="ListParagraph"/>
+        <w:numPr>
+          <w:ilvl w:val="0"/>
+          <w:numId w:val="2"/>
+        </w:numPr>
+        <w:spacing w:after="60" w:before="60"/>
+      </w:pPr>
+      <w:r>
+        <w:rPr>
+          <w:rFonts w:ascii="Arial" w:cs="Arial" w:eastAsia="Arial" w:hAnsi="Arial"/>
+          <w:sz w:val="22"/>
+          <w:szCs w:val="22"/>
+        </w:rPr>
+        <w:t xml:space="preserve">E-commerce: skalowanie po dlugosci kolejki zamowien w Azure Service Bus — nie CPU</w:t>
+      </w:r>
+    </w:p>
+    <w:p>
+      <w:pPr>
+        <w:pStyle w:val="ListParagraph"/>
+        <w:numPr>
+          <w:ilvl w:val="0"/>
+          <w:numId w:val="2"/>
+        </w:numPr>
+        <w:spacing w:after="60" w:before="60"/>
+      </w:pPr>
+      <w:r>
+        <w:rPr>
+          <w:rFonts w:ascii="Arial" w:cs="Arial" w:eastAsia="Arial" w:hAnsi="Arial"/>
+          <w:sz w:val="22"/>
+          <w:szCs w:val="22"/>
+        </w:rPr>
+        <w:t xml:space="preserve">Batch processing: scale to 0 w nocy, scale-up rano gdy pojawia sie zadania w kolejce</w:t>
+      </w:r>
+    </w:p>
+    <w:p>
+      <w:pPr>
+        <w:pStyle w:val="ListParagraph"/>
+        <w:numPr>
+          <w:ilvl w:val="0"/>
+          <w:numId w:val="2"/>
+        </w:numPr>
+        <w:spacing w:after="60" w:before="60"/>
+      </w:pPr>
+      <w:r>
+        <w:rPr>
+          <w:rFonts w:ascii="Arial" w:cs="Arial" w:eastAsia="Arial" w:hAnsi="Arial"/>
+          <w:sz w:val="22"/>
+          <w:szCs w:val="22"/>
+        </w:rPr>
+        <w:t xml:space="preserve">API Gateway: skalowanie po liczbie requestow HTTP (KEDA HTTP Scaler)</w:t>
+      </w:r>
+    </w:p>
+    <w:p>
+      <w:pPr>
+        <w:pStyle w:val="ListParagraph"/>
+        <w:numPr>
+          <w:ilvl w:val="0"/>
+          <w:numId w:val="2"/>
+        </w:numPr>
+        <w:spacing w:after="60" w:before="60"/>
+      </w:pPr>
+      <w:r>
+        <w:rPr>
+          <w:rFonts w:ascii="Arial" w:cs="Arial" w:eastAsia="Arial" w:hAnsi="Arial"/>
+          <w:sz w:val="22"/>
+          <w:szCs w:val="22"/>
+        </w:rPr>
+        <w:t xml:space="preserve">ML inference: skalowanie po liczbie zadan w kolejce Kafka — kazde zadanie = jeden Pod</w:t>
+      </w:r>
+    </w:p>
+    <w:p>
+      <w:pPr>
+        <w:pStyle w:val="ListParagraph"/>
+        <w:numPr>
+          <w:ilvl w:val="0"/>
+          <w:numId w:val="2"/>
+        </w:numPr>
+        <w:spacing w:after="60" w:before="60"/>
+      </w:pPr>
+      <w:r>
+        <w:rPr>
+          <w:rFonts w:ascii="Arial" w:cs="Arial" w:eastAsia="Arial" w:hAnsi="Arial"/>
+          <w:sz w:val="22"/>
+          <w:szCs w:val="22"/>
+        </w:rPr>
+        <w:t xml:space="preserve">Cron scaling: minReplicas=0 w nocy, minReplicas=3 w godzinach szczytu</w:t>
+      </w:r>
+    </w:p>
+    <w:p>
+      <w:pPr>
+        <w:spacing w:after="80" w:before="0"/>
+      </w:pPr>
+      <w:r>
+        <w:t xml:space="preserve"/>
+      </w:r>
+    </w:p>
+    <w:tbl>
+      <w:tblPr>
+        <w:tblW w:type="dxa" w:w="9360"/>
+        <w:tblBorders>
+          <w:top w:val="single" w:color="auto" w:sz="4"/>
+          <w:left w:val="single" w:color="auto" w:sz="4"/>
+          <w:bottom w:val="single" w:color="auto" w:sz="4"/>
+          <w:right w:val="single" w:color="auto" w:sz="4"/>
+          <w:insideH w:val="single" w:color="auto" w:sz="4"/>
+          <w:insideV w:val="single" w:color="auto" w:sz="4"/>
+        </w:tblBorders>
+      </w:tblPr>
+      <w:tblGrid>
+        <w:gridCol w:w="4680"/>
+        <w:gridCol w:w="4680"/>
+      </w:tblGrid>
+      <w:tr>
+        <w:tc>
+          <w:tcPr>
+            <w:tcW w:type="dxa" w:w="4680"/>
+            <w:tcBorders>
+              <w:top w:val="single" w:color="CCCCCC" w:sz="1"/>
+              <w:left w:val="single" w:color="CCCCCC" w:sz="1"/>
+              <w:bottom w:val="single" w:color="CCCCCC" w:sz="1"/>
+              <w:right w:val="single" w:color="CCCCCC" w:sz="1"/>
+            </w:tcBorders>
+            <w:shd w:fill="2E75B6" w:val="clear"/>
+            <w:tcMar>
+              <w:top w:type="dxa" w:w="80"/>
+              <w:left w:type="dxa" w:w="120"/>
+              <w:bottom w:type="dxa" w:w="80"/>
+              <w:right w:type="dxa" w:w="120"/>
+            </w:tcMar>
+          </w:tcPr>
+          <w:p>
+            <w:r>
+              <w:rPr>
+                <w:rFonts w:ascii="Arial" w:cs="Arial" w:eastAsia="Arial" w:hAnsi="Arial"/>
+                <w:b/>
+                <w:bCs/>
+                <w:color w:val="FFFFFF"/>
+                <w:sz w:val="22"/>
+                <w:szCs w:val="22"/>
+              </w:rPr>
+              <w:t xml:space="preserve">Silne strony</w:t>
+            </w:r>
+          </w:p>
+        </w:tc>
+        <w:tc>
+          <w:tcPr>
+            <w:tcW w:type="dxa" w:w="4680"/>
+            <w:tcBorders>
+              <w:top w:val="single" w:color="CCCCCC" w:sz="1"/>
+              <w:left w:val="single" w:color="CCCCCC" w:sz="1"/>
+              <w:bottom w:val="single" w:color="CCCCCC" w:sz="1"/>
+              <w:right w:val="single" w:color="CCCCCC" w:sz="1"/>
+            </w:tcBorders>
+            <w:shd w:fill="2E75B6" w:val="clear"/>
+            <w:tcMar>
+              <w:top w:type="dxa" w:w="80"/>
+              <w:left w:type="dxa" w:w="120"/>
+              <w:bottom w:type="dxa" w:w="80"/>
+              <w:right w:type="dxa" w:w="120"/>
+            </w:tcMar>
+          </w:tcPr>
+          <w:p>
+            <w:r>
+              <w:rPr>
+                <w:rFonts w:ascii="Arial" w:cs="Arial" w:eastAsia="Arial" w:hAnsi="Arial"/>
+                <w:b/>
+                <w:bCs/>
+                <w:color w:val="FFFFFF"/>
+                <w:sz w:val="22"/>
+                <w:szCs w:val="22"/>
+              </w:rPr>
+              <w:t xml:space="preserve">Slabe strony / typowe problemy</w:t>
+            </w:r>
+          </w:p>
+        </w:tc>
+      </w:tr>
+      <w:tr>
+        <w:tc>
+          <w:tcPr>
+            <w:tcW w:type="dxa" w:w="4680"/>
+            <w:tcBorders>
+              <w:top w:val="single" w:color="CCCCCC" w:sz="1"/>
+              <w:left w:val="single" w:color="CCCCCC" w:sz="1"/>
+              <w:bottom w:val="single" w:color="CCCCCC" w:sz="1"/>
+              <w:right w:val="single" w:color="CCCCCC" w:sz="1"/>
+            </w:tcBorders>
+            <w:tcMar>
+              <w:top w:type="dxa" w:w="80"/>
+              <w:left w:type="dxa" w:w="120"/>
+              <w:bottom w:type="dxa" w:w="80"/>
+              <w:right w:type="dxa" w:w="120"/>
+            </w:tcMar>
+          </w:tcPr>
+          <w:p>
+            <w:r>
+              <w:rPr>
+                <w:rFonts w:ascii="Arial" w:cs="Arial" w:eastAsia="Arial" w:hAnsi="Arial"/>
+                <w:sz w:val="20"/>
+                <w:szCs w:val="20"/>
+              </w:rPr>
+              <w:t xml:space="preserve">Scale to zero — zero kosztow gdy brak ruchu (HPA nie moze)</w:t>
+            </w:r>
+          </w:p>
+        </w:tc>
+        <w:tc>
+          <w:tcPr>
+            <w:tcW w:type="dxa" w:w="4680"/>
+            <w:tcBorders>
+              <w:top w:val="single" w:color="CCCCCC" w:sz="1"/>
+              <w:left w:val="single" w:color="CCCCCC" w:sz="1"/>
+              <w:bottom w:val="single" w:color="CCCCCC" w:sz="1"/>
+              <w:right w:val="single" w:color="CCCCCC" w:sz="1"/>
+            </w:tcBorders>
+            <w:tcMar>
+              <w:top w:type="dxa" w:w="80"/>
+              <w:left w:type="dxa" w:w="120"/>
+              <w:bottom w:type="dxa" w:w="80"/>
+              <w:right w:type="dxa" w:w="120"/>
+            </w:tcMar>
+          </w:tcPr>
+          <w:p>
+            <w:r>
+              <w:rPr>
+                <w:rFonts w:ascii="Arial" w:cs="Arial" w:eastAsia="Arial" w:hAnsi="Arial"/>
+                <w:sz w:val="20"/>
+                <w:szCs w:val="20"/>
+              </w:rPr>
+              <w:t xml:space="preserve">Dodatkowa zlozonosc — nowy CRD (ScaledObject), nowe komponenty</w:t>
+            </w:r>
+          </w:p>
+        </w:tc>
+      </w:tr>
+      <w:tr>
+        <w:tc>
+          <w:tcPr>
+            <w:tcW w:type="dxa" w:w="4680"/>
+            <w:tcBorders>
+              <w:top w:val="single" w:color="CCCCCC" w:sz="1"/>
+              <w:left w:val="single" w:color="CCCCCC" w:sz="1"/>
+              <w:bottom w:val="single" w:color="CCCCCC" w:sz="1"/>
+              <w:right w:val="single" w:color="CCCCCC" w:sz="1"/>
+            </w:tcBorders>
+            <w:tcMar>
+              <w:top w:type="dxa" w:w="80"/>
+              <w:left w:type="dxa" w:w="120"/>
+              <w:bottom w:type="dxa" w:w="80"/>
+              <w:right w:type="dxa" w:w="120"/>
+            </w:tcMar>
+          </w:tcPr>
+          <w:p>
+            <w:r>
+              <w:rPr>
+                <w:rFonts w:ascii="Arial" w:cs="Arial" w:eastAsia="Arial" w:hAnsi="Arial"/>
+                <w:sz w:val="20"/>
+                <w:szCs w:val="20"/>
+              </w:rPr>
+              <w:t xml:space="preserve">50+ scalerow — dowolne zrodlo metryk bez pisania kodu</w:t>
+            </w:r>
+          </w:p>
+        </w:tc>
+        <w:tc>
+          <w:tcPr>
+            <w:tcW w:type="dxa" w:w="4680"/>
+            <w:tcBorders>
+              <w:top w:val="single" w:color="CCCCCC" w:sz="1"/>
+              <w:left w:val="single" w:color="CCCCCC" w:sz="1"/>
+              <w:bottom w:val="single" w:color="CCCCCC" w:sz="1"/>
+              <w:right w:val="single" w:color="CCCCCC" w:sz="1"/>
+            </w:tcBorders>
+            <w:tcMar>
+              <w:top w:type="dxa" w:w="80"/>
+              <w:left w:type="dxa" w:w="120"/>
+              <w:bottom w:type="dxa" w:w="80"/>
+              <w:right w:type="dxa" w:w="120"/>
+            </w:tcMar>
+          </w:tcPr>
+          <w:p>
+            <w:r>
+              <w:rPr>
+                <w:rFonts w:ascii="Arial" w:cs="Arial" w:eastAsia="Arial" w:hAnsi="Arial"/>
+                <w:sz w:val="20"/>
+                <w:szCs w:val="20"/>
+              </w:rPr>
+              <w:t xml:space="preserve">Konflikt z istniejacym HPA — trzeba usunac HPA przed wdrozeniem KEDA</w:t>
+            </w:r>
+          </w:p>
+        </w:tc>
+      </w:tr>
+      <w:tr>
+        <w:tc>
+          <w:tcPr>
+            <w:tcW w:type="dxa" w:w="4680"/>
+            <w:tcBorders>
+              <w:top w:val="single" w:color="CCCCCC" w:sz="1"/>
+              <w:left w:val="single" w:color="CCCCCC" w:sz="1"/>
+              <w:bottom w:val="single" w:color="CCCCCC" w:sz="1"/>
+              <w:right w:val="single" w:color="CCCCCC" w:sz="1"/>
+            </w:tcBorders>
+            <w:tcMar>
+              <w:top w:type="dxa" w:w="80"/>
+              <w:left w:type="dxa" w:w="120"/>
+              <w:bottom w:type="dxa" w:w="80"/>
+              <w:right w:type="dxa" w:w="120"/>
+            </w:tcMar>
+          </w:tcPr>
+          <w:p>
+            <w:r>
+              <w:rPr>
+                <w:rFonts w:ascii="Arial" w:cs="Arial" w:eastAsia="Arial" w:hAnsi="Arial"/>
+                <w:sz w:val="20"/>
+                <w:szCs w:val="20"/>
+              </w:rPr>
+              <w:t xml:space="preserve">Szybszy cooldown — 30s vs 5 min w HPA</w:t>
+            </w:r>
+          </w:p>
+        </w:tc>
+        <w:tc>
+          <w:tcPr>
+            <w:tcW w:type="dxa" w:w="4680"/>
+            <w:tcBorders>
+              <w:top w:val="single" w:color="CCCCCC" w:sz="1"/>
+              <w:left w:val="single" w:color="CCCCCC" w:sz="1"/>
+              <w:bottom w:val="single" w:color="CCCCCC" w:sz="1"/>
+              <w:right w:val="single" w:color="CCCCCC" w:sz="1"/>
+            </w:tcBorders>
+            <w:tcMar>
+              <w:top w:type="dxa" w:w="80"/>
+              <w:left w:type="dxa" w:w="120"/>
+              <w:bottom w:type="dxa" w:w="80"/>
+              <w:right w:type="dxa" w:w="120"/>
+            </w:tcMar>
+          </w:tcPr>
+          <w:p>
+            <w:r>
+              <w:rPr>
+                <w:rFonts w:ascii="Arial" w:cs="Arial" w:eastAsia="Arial" w:hAnsi="Arial"/>
+                <w:sz w:val="20"/>
+                <w:szCs w:val="20"/>
+              </w:rPr>
+              <w:t xml:space="preserve">Debugowanie query Prometheus moze byc trudne (nazwy kontenerow, labelki)</w:t>
+            </w:r>
+          </w:p>
+        </w:tc>
+      </w:tr>
+      <w:tr>
+        <w:tc>
+          <w:tcPr>
+            <w:tcW w:type="dxa" w:w="4680"/>
+            <w:tcBorders>
+              <w:top w:val="single" w:color="CCCCCC" w:sz="1"/>
+              <w:left w:val="single" w:color="CCCCCC" w:sz="1"/>
+              <w:bottom w:val="single" w:color="CCCCCC" w:sz="1"/>
+              <w:right w:val="single" w:color="CCCCCC" w:sz="1"/>
+            </w:tcBorders>
+            <w:tcMar>
+              <w:top w:type="dxa" w:w="80"/>
+              <w:left w:type="dxa" w:w="120"/>
+              <w:bottom w:type="dxa" w:w="80"/>
+              <w:right w:type="dxa" w:w="120"/>
+            </w:tcMar>
+          </w:tcPr>
+          <w:p>
+            <w:r>
+              <w:rPr>
+                <w:rFonts w:ascii="Arial" w:cs="Arial" w:eastAsia="Arial" w:hAnsi="Arial"/>
+                <w:sz w:val="20"/>
+                <w:szCs w:val="20"/>
+              </w:rPr>
+              <w:t xml:space="preserve">KEDA zarzadza HPA automatycznie — mniej konfiguracji</w:t>
+            </w:r>
+          </w:p>
+        </w:tc>
+        <w:tc>
+          <w:tcPr>
+            <w:tcW w:type="dxa" w:w="4680"/>
+            <w:tcBorders>
+              <w:top w:val="single" w:color="CCCCCC" w:sz="1"/>
+              <w:left w:val="single" w:color="CCCCCC" w:sz="1"/>
+              <w:bottom w:val="single" w:color="CCCCCC" w:sz="1"/>
+              <w:right w:val="single" w:color="CCCCCC" w:sz="1"/>
+            </w:tcBorders>
+            <w:tcMar>
+              <w:top w:type="dxa" w:w="80"/>
+              <w:left w:type="dxa" w:w="120"/>
+              <w:bottom w:type="dxa" w:w="80"/>
+              <w:right w:type="dxa" w:w="120"/>
+            </w:tcMar>
+          </w:tcPr>
+          <w:p>
+            <w:r>
+              <w:rPr>
+                <w:rFonts w:ascii="Arial" w:cs="Arial" w:eastAsia="Arial" w:hAnsi="Arial"/>
+                <w:sz w:val="20"/>
+                <w:szCs w:val="20"/>
+              </w:rPr>
+              <w:t xml:space="preserve">Scale to zero powoduje cold start — pierwsze requesty po przerwie moga byc wolne</w:t>
             </w:r>
           </w:p>
         </w:tc>

</xml_diff>

<commit_message>
part10: README + Przewodnik updated - Parts 1-10 complete (Helm, OPA, Chaos, Linkerd)
</commit_message>
<xml_diff>
--- a/docs/Przewodnik_Techniczny_SRE_Lab_KOMPLETNY.docx
+++ b/docs/Przewodnik_Techniczny_SRE_Lab_KOMPLETNY.docx
@@ -16015,6 +16015,3377 @@
                 <w:szCs w:val="20"/>
               </w:rPr>
               <w:t xml:space="preserve">Scale to zero powoduje cold start — pierwsze requesty po przerwie moga byc wolne</w:t>
+            </w:r>
+          </w:p>
+        </w:tc>
+      </w:tr>
+    </w:tbl>
+    <w:p>
+      <w:r>
+        <w:br w:type="page"/>
+      </w:r>
+    </w:p>
+    <w:p>
+      <w:pPr>
+        <w:pStyle w:val="Heading1"/>
+        <w:spacing w:after="200" w:before="400"/>
+      </w:pPr>
+      <w:r>
+        <w:rPr>
+          <w:rFonts w:ascii="Arial" w:cs="Arial" w:eastAsia="Arial" w:hAnsi="Arial"/>
+          <w:b/>
+          <w:bCs/>
+          <w:color w:val="1F4E79"/>
+          <w:sz w:val="32"/>
+          <w:szCs w:val="32"/>
+        </w:rPr>
+        <w:t xml:space="preserve">Rozdzial 22: Helm — wlasny chart aplikacji</w:t>
+      </w:r>
+    </w:p>
+    <w:p>
+      <w:pPr>
+        <w:pStyle w:val="Heading2"/>
+        <w:spacing w:after="140" w:before="280"/>
+      </w:pPr>
+      <w:r>
+        <w:rPr>
+          <w:rFonts w:ascii="Arial" w:cs="Arial" w:eastAsia="Arial" w:hAnsi="Arial"/>
+          <w:b/>
+          <w:bCs/>
+          <w:color w:val="2E75B6"/>
+          <w:sz w:val="26"/>
+          <w:szCs w:val="26"/>
+        </w:rPr>
+        <w:t xml:space="preserve">Co to jest</w:t>
+      </w:r>
+    </w:p>
+    <w:p>
+      <w:pPr>
+        <w:spacing w:after="80" w:before="80"/>
+      </w:pPr>
+      <w:r>
+        <w:rPr>
+          <w:rFonts w:ascii="Arial" w:cs="Arial" w:eastAsia="Arial" w:hAnsi="Arial"/>
+          <w:sz w:val="22"/>
+          <w:szCs w:val="22"/>
+        </w:rPr>
+        <w:t xml:space="preserve">Helm to manager pakietow dla Kubernetes — jak apt dla Linuxa lub npm dla Node.js. Chart to paczka YAML-i z szablonami i domyslnymi wartosciami. Zamiast kopiowac i edytowac pliki YAML dla kazdego srodowiska, piszesz raz chart i instalujesz z roznym zestawem wartosci.</w:t>
+      </w:r>
+    </w:p>
+    <w:p>
+      <w:pPr>
+        <w:spacing w:after="80" w:before="0"/>
+      </w:pPr>
+      <w:r>
+        <w:t xml:space="preserve"/>
+      </w:r>
+    </w:p>
+    <w:tbl>
+      <w:tblPr>
+        <w:tblW w:type="dxa" w:w="9360"/>
+        <w:tblBorders>
+          <w:top w:val="single" w:color="auto" w:sz="4"/>
+          <w:left w:val="single" w:color="auto" w:sz="4"/>
+          <w:bottom w:val="single" w:color="auto" w:sz="4"/>
+          <w:right w:val="single" w:color="auto" w:sz="4"/>
+          <w:insideH w:val="single" w:color="auto" w:sz="4"/>
+          <w:insideV w:val="single" w:color="auto" w:sz="4"/>
+        </w:tblBorders>
+      </w:tblPr>
+      <w:tblGrid>
+        <w:gridCol w:w="9360"/>
+      </w:tblGrid>
+      <w:tr>
+        <w:tc>
+          <w:tcPr>
+            <w:tcW w:type="dxa" w:w="9360"/>
+            <w:tcBorders>
+              <w:top w:val="single" w:color="CCCCCC" w:sz="1"/>
+              <w:left w:val="single" w:color="CCCCCC" w:sz="1"/>
+              <w:bottom w:val="single" w:color="CCCCCC" w:sz="1"/>
+              <w:right w:val="single" w:color="CCCCCC" w:sz="1"/>
+            </w:tcBorders>
+            <w:shd w:fill="D5E8F0" w:val="clear"/>
+            <w:tcMar>
+              <w:top w:type="dxa" w:w="120"/>
+              <w:left w:type="dxa" w:w="200"/>
+              <w:bottom w:type="dxa" w:w="120"/>
+              <w:right w:type="dxa" w:w="200"/>
+            </w:tcMar>
+          </w:tcPr>
+          <w:p>
+            <w:pPr>
+              <w:spacing w:after="0" w:before="0"/>
+            </w:pPr>
+            <w:r>
+              <w:rPr>
+                <w:rFonts w:ascii="Arial" w:cs="Arial" w:eastAsia="Arial" w:hAnsi="Arial"/>
+                <w:b/>
+                <w:bCs/>
+                <w:color w:val="1F4E79"/>
+                <w:sz w:val="22"/>
+                <w:szCs w:val="22"/>
+              </w:rPr>
+              <w:t xml:space="preserve">Analogia: </w:t>
+            </w:r>
+            <w:r>
+              <w:rPr>
+                <w:rFonts w:ascii="Arial" w:cs="Arial" w:eastAsia="Arial" w:hAnsi="Arial"/>
+                <w:i/>
+                <w:iCs/>
+                <w:color w:val="000000"/>
+                <w:sz w:val="22"/>
+                <w:szCs w:val="22"/>
+              </w:rPr>
+              <w:t xml:space="preserve">Przepis kulinarny z parametrami — Goly YAML to przepis zapisany na sztywno: '2 jajka, 100g maki'. Helm chart to przepis z parametrami: '{{ .Values.eggs }} jajek, {{ .Values.flour }}g maki'. Ten sam przepis, inne porcje — wystarczy zmienic values.yaml.</w:t>
+            </w:r>
+          </w:p>
+        </w:tc>
+      </w:tr>
+    </w:tbl>
+    <w:p>
+      <w:pPr>
+        <w:spacing w:after="80" w:before="0"/>
+      </w:pPr>
+      <w:r>
+        <w:t xml:space="preserve"/>
+      </w:r>
+    </w:p>
+    <w:p>
+      <w:pPr>
+        <w:pStyle w:val="Heading2"/>
+        <w:spacing w:after="140" w:before="280"/>
+      </w:pPr>
+      <w:r>
+        <w:rPr>
+          <w:rFonts w:ascii="Arial" w:cs="Arial" w:eastAsia="Arial" w:hAnsi="Arial"/>
+          <w:b/>
+          <w:bCs/>
+          <w:color w:val="2E75B6"/>
+          <w:sz w:val="26"/>
+          <w:szCs w:val="26"/>
+        </w:rPr>
+        <w:t xml:space="preserve">Co zrobilimy — chart aras-demo-app v0.1.0</w:t>
+      </w:r>
+    </w:p>
+    <w:p>
+      <w:pPr>
+        <w:pStyle w:val="ListParagraph"/>
+        <w:numPr>
+          <w:ilvl w:val="0"/>
+          <w:numId w:val="2"/>
+        </w:numPr>
+        <w:spacing w:after="60" w:before="60"/>
+      </w:pPr>
+      <w:r>
+        <w:rPr>
+          <w:rFonts w:ascii="Arial" w:cs="Arial" w:eastAsia="Arial" w:hAnsi="Arial"/>
+          <w:sz w:val="22"/>
+          <w:szCs w:val="22"/>
+        </w:rPr>
+        <w:t xml:space="preserve">Chart.yaml — metadane: nazwa, wersja, opis, maintainer</w:t>
+      </w:r>
+    </w:p>
+    <w:p>
+      <w:pPr>
+        <w:pStyle w:val="ListParagraph"/>
+        <w:numPr>
+          <w:ilvl w:val="0"/>
+          <w:numId w:val="2"/>
+        </w:numPr>
+        <w:spacing w:after="60" w:before="60"/>
+      </w:pPr>
+      <w:r>
+        <w:rPr>
+          <w:rFonts w:ascii="Arial" w:cs="Arial" w:eastAsia="Arial" w:hAnsi="Arial"/>
+          <w:sz w:val="22"/>
+          <w:szCs w:val="22"/>
+        </w:rPr>
+        <w:t xml:space="preserve">values.yaml — domyslne wartosci: replicaCount, image, resources, ingress, networkPolicy, rbac</w:t>
+      </w:r>
+    </w:p>
+    <w:p>
+      <w:pPr>
+        <w:pStyle w:val="ListParagraph"/>
+        <w:numPr>
+          <w:ilvl w:val="0"/>
+          <w:numId w:val="2"/>
+        </w:numPr>
+        <w:spacing w:after="60" w:before="60"/>
+      </w:pPr>
+      <w:r>
+        <w:rPr>
+          <w:rFonts w:ascii="Arial" w:cs="Arial" w:eastAsia="Arial" w:hAnsi="Arial"/>
+          <w:sz w:val="22"/>
+          <w:szCs w:val="22"/>
+        </w:rPr>
+        <w:t xml:space="preserve">templates/deployment.yaml — Deployment z {{ .Release.Name }}, {{ .Values.* }}</w:t>
+      </w:r>
+    </w:p>
+    <w:p>
+      <w:pPr>
+        <w:pStyle w:val="ListParagraph"/>
+        <w:numPr>
+          <w:ilvl w:val="0"/>
+          <w:numId w:val="2"/>
+        </w:numPr>
+        <w:spacing w:after="60" w:before="60"/>
+      </w:pPr>
+      <w:r>
+        <w:rPr>
+          <w:rFonts w:ascii="Arial" w:cs="Arial" w:eastAsia="Arial" w:hAnsi="Arial"/>
+          <w:sz w:val="22"/>
+          <w:szCs w:val="22"/>
+        </w:rPr>
+        <w:t xml:space="preserve">templates/service.yaml — Service LoadBalancer</w:t>
+      </w:r>
+    </w:p>
+    <w:p>
+      <w:pPr>
+        <w:pStyle w:val="ListParagraph"/>
+        <w:numPr>
+          <w:ilvl w:val="0"/>
+          <w:numId w:val="2"/>
+        </w:numPr>
+        <w:spacing w:after="60" w:before="60"/>
+      </w:pPr>
+      <w:r>
+        <w:rPr>
+          <w:rFonts w:ascii="Arial" w:cs="Arial" w:eastAsia="Arial" w:hAnsi="Arial"/>
+          <w:sz w:val="22"/>
+          <w:szCs w:val="22"/>
+        </w:rPr>
+        <w:t xml:space="preserve">templates/ingress.yaml — Ingress z cert-manager annotation (warunkowy: {{ if .Values.ingress.enabled }})</w:t>
+      </w:r>
+    </w:p>
+    <w:p>
+      <w:pPr>
+        <w:pStyle w:val="ListParagraph"/>
+        <w:numPr>
+          <w:ilvl w:val="0"/>
+          <w:numId w:val="2"/>
+        </w:numPr>
+        <w:spacing w:after="60" w:before="60"/>
+      </w:pPr>
+      <w:r>
+        <w:rPr>
+          <w:rFonts w:ascii="Arial" w:cs="Arial" w:eastAsia="Arial" w:hAnsi="Arial"/>
+          <w:sz w:val="22"/>
+          <w:szCs w:val="22"/>
+        </w:rPr>
+        <w:t xml:space="preserve">templates/rbac.yaml — ServiceAccount + Role + RoleBinding</w:t>
+      </w:r>
+    </w:p>
+    <w:p>
+      <w:pPr>
+        <w:pStyle w:val="ListParagraph"/>
+        <w:numPr>
+          <w:ilvl w:val="0"/>
+          <w:numId w:val="2"/>
+        </w:numPr>
+        <w:spacing w:after="60" w:before="60"/>
+      </w:pPr>
+      <w:r>
+        <w:rPr>
+          <w:rFonts w:ascii="Arial" w:cs="Arial" w:eastAsia="Arial" w:hAnsi="Arial"/>
+          <w:sz w:val="22"/>
+          <w:szCs w:val="22"/>
+        </w:rPr>
+        <w:t xml:space="preserve">templates/networkpolicy.yaml — NetworkPolicy (warunkowy)</w:t>
+      </w:r>
+    </w:p>
+    <w:p>
+      <w:pPr>
+        <w:pStyle w:val="ListParagraph"/>
+        <w:numPr>
+          <w:ilvl w:val="0"/>
+          <w:numId w:val="2"/>
+        </w:numPr>
+        <w:spacing w:after="60" w:before="60"/>
+      </w:pPr>
+      <w:r>
+        <w:rPr>
+          <w:rFonts w:ascii="Arial" w:cs="Arial" w:eastAsia="Arial" w:hAnsi="Arial"/>
+          <w:sz w:val="22"/>
+          <w:szCs w:val="22"/>
+        </w:rPr>
+        <w:t xml:space="preserve">templates/NOTES.txt — instrukcje po instalacji</w:t>
+      </w:r>
+    </w:p>
+    <w:p>
+      <w:pPr>
+        <w:spacing w:after="80" w:before="0"/>
+      </w:pPr>
+      <w:r>
+        <w:t xml:space="preserve"/>
+      </w:r>
+    </w:p>
+    <w:tbl>
+      <w:tblPr>
+        <w:tblW w:type="dxa" w:w="9360"/>
+        <w:tblBorders>
+          <w:top w:val="single" w:color="auto" w:sz="4"/>
+          <w:left w:val="single" w:color="auto" w:sz="4"/>
+          <w:bottom w:val="single" w:color="auto" w:sz="4"/>
+          <w:right w:val="single" w:color="auto" w:sz="4"/>
+          <w:insideH w:val="single" w:color="auto" w:sz="4"/>
+          <w:insideV w:val="single" w:color="auto" w:sz="4"/>
+        </w:tblBorders>
+      </w:tblPr>
+      <w:tblGrid>
+        <w:gridCol w:w="9360"/>
+      </w:tblGrid>
+      <w:tr>
+        <w:tc>
+          <w:tcPr>
+            <w:tcW w:type="dxa" w:w="9360"/>
+            <w:tcBorders>
+              <w:top w:val="single" w:color="CCCCCC" w:sz="1"/>
+              <w:left w:val="single" w:color="CCCCCC" w:sz="1"/>
+              <w:bottom w:val="single" w:color="CCCCCC" w:sz="1"/>
+              <w:right w:val="single" w:color="CCCCCC" w:sz="1"/>
+            </w:tcBorders>
+            <w:shd w:fill="F2F2F2" w:val="clear"/>
+            <w:tcMar>
+              <w:top w:type="dxa" w:w="120"/>
+              <w:left w:type="dxa" w:w="200"/>
+              <w:bottom w:type="dxa" w:w="120"/>
+              <w:right w:type="dxa" w:w="200"/>
+            </w:tcMar>
+          </w:tcPr>
+          <w:p>
+            <w:pPr>
+              <w:spacing w:after="0" w:before="0"/>
+            </w:pPr>
+            <w:r>
+              <w:rPr>
+                <w:rFonts w:ascii="Arial" w:cs="Arial" w:eastAsia="Arial" w:hAnsi="Arial"/>
+                <w:b/>
+                <w:bCs/>
+                <w:sz w:val="22"/>
+                <w:szCs w:val="22"/>
+              </w:rPr>
+              <w:t xml:space="preserve">Wynik w projekcie: </w:t>
+            </w:r>
+            <w:r>
+              <w:rPr>
+                <w:rFonts w:ascii="Arial" w:cs="Arial" w:eastAsia="Arial" w:hAnsi="Arial"/>
+                <w:sz w:val="22"/>
+                <w:szCs w:val="22"/>
+              </w:rPr>
+              <w:t xml:space="preserve">helm lint k8s/part7/charts/aras-demo-app
+==&gt; Linting k8s/part7/charts/aras-demo-app
+[INFO] Chart.yaml: icon is recommended
+1 chart(s) linted, 0 chart(s) failed
+helm install aras-demo k8s/part7/charts/aras-demo-app
+NAME: aras-demo | STATUS: deployed | REVISION: 1
+helm upgrade aras-demo ... --set replicaCount=3 --set resources.limits.cpu=300m
+REVISION: 2 | Upgrade complete
+helm rollback aras-demo 1
+Rollback was a success! | REVISION: 3
+helm history aras-demo:
+REVISION 1 — Install complete
+REVISION 2 — Upgrade complete (3 repliki, cpu 300m)
+REVISION 3 — Rollback to 1 (2 repliki, cpu 200m)</w:t>
+            </w:r>
+          </w:p>
+        </w:tc>
+      </w:tr>
+    </w:tbl>
+    <w:p>
+      <w:pPr>
+        <w:spacing w:after="80" w:before="0"/>
+      </w:pPr>
+      <w:r>
+        <w:t xml:space="preserve"/>
+      </w:r>
+    </w:p>
+    <w:tbl>
+      <w:tblPr>
+        <w:tblW w:type="dxa" w:w="9360"/>
+        <w:tblBorders>
+          <w:top w:val="single" w:color="auto" w:sz="4"/>
+          <w:left w:val="single" w:color="auto" w:sz="4"/>
+          <w:bottom w:val="single" w:color="auto" w:sz="4"/>
+          <w:right w:val="single" w:color="auto" w:sz="4"/>
+          <w:insideH w:val="single" w:color="auto" w:sz="4"/>
+          <w:insideV w:val="single" w:color="auto" w:sz="4"/>
+        </w:tblBorders>
+      </w:tblPr>
+      <w:tblGrid>
+        <w:gridCol w:w="4680"/>
+        <w:gridCol w:w="4680"/>
+      </w:tblGrid>
+      <w:tr>
+        <w:tc>
+          <w:tcPr>
+            <w:tcW w:type="dxa" w:w="4680"/>
+            <w:tcBorders>
+              <w:top w:val="single" w:color="CCCCCC" w:sz="1"/>
+              <w:left w:val="single" w:color="CCCCCC" w:sz="1"/>
+              <w:bottom w:val="single" w:color="CCCCCC" w:sz="1"/>
+              <w:right w:val="single" w:color="CCCCCC" w:sz="1"/>
+            </w:tcBorders>
+            <w:shd w:fill="2E75B6" w:val="clear"/>
+            <w:tcMar>
+              <w:top w:type="dxa" w:w="80"/>
+              <w:left w:type="dxa" w:w="120"/>
+              <w:bottom w:type="dxa" w:w="80"/>
+              <w:right w:type="dxa" w:w="120"/>
+            </w:tcMar>
+          </w:tcPr>
+          <w:p>
+            <w:r>
+              <w:rPr>
+                <w:rFonts w:ascii="Arial" w:cs="Arial" w:eastAsia="Arial" w:hAnsi="Arial"/>
+                <w:b/>
+                <w:bCs/>
+                <w:color w:val="FFFFFF"/>
+                <w:sz w:val="22"/>
+                <w:szCs w:val="22"/>
+              </w:rPr>
+              <w:t xml:space="preserve">Silne strony</w:t>
+            </w:r>
+          </w:p>
+        </w:tc>
+        <w:tc>
+          <w:tcPr>
+            <w:tcW w:type="dxa" w:w="4680"/>
+            <w:tcBorders>
+              <w:top w:val="single" w:color="CCCCCC" w:sz="1"/>
+              <w:left w:val="single" w:color="CCCCCC" w:sz="1"/>
+              <w:bottom w:val="single" w:color="CCCCCC" w:sz="1"/>
+              <w:right w:val="single" w:color="CCCCCC" w:sz="1"/>
+            </w:tcBorders>
+            <w:shd w:fill="2E75B6" w:val="clear"/>
+            <w:tcMar>
+              <w:top w:type="dxa" w:w="80"/>
+              <w:left w:type="dxa" w:w="120"/>
+              <w:bottom w:type="dxa" w:w="80"/>
+              <w:right w:type="dxa" w:w="120"/>
+            </w:tcMar>
+          </w:tcPr>
+          <w:p>
+            <w:r>
+              <w:rPr>
+                <w:rFonts w:ascii="Arial" w:cs="Arial" w:eastAsia="Arial" w:hAnsi="Arial"/>
+                <w:b/>
+                <w:bCs/>
+                <w:color w:val="FFFFFF"/>
+                <w:sz w:val="22"/>
+                <w:szCs w:val="22"/>
+              </w:rPr>
+              <w:t xml:space="preserve">Slabe strony / typowe problemy</w:t>
+            </w:r>
+          </w:p>
+        </w:tc>
+      </w:tr>
+      <w:tr>
+        <w:tc>
+          <w:tcPr>
+            <w:tcW w:type="dxa" w:w="4680"/>
+            <w:tcBorders>
+              <w:top w:val="single" w:color="CCCCCC" w:sz="1"/>
+              <w:left w:val="single" w:color="CCCCCC" w:sz="1"/>
+              <w:bottom w:val="single" w:color="CCCCCC" w:sz="1"/>
+              <w:right w:val="single" w:color="CCCCCC" w:sz="1"/>
+            </w:tcBorders>
+            <w:tcMar>
+              <w:top w:type="dxa" w:w="80"/>
+              <w:left w:type="dxa" w:w="120"/>
+              <w:bottom w:type="dxa" w:w="80"/>
+              <w:right w:type="dxa" w:w="120"/>
+            </w:tcMar>
+          </w:tcPr>
+          <w:p>
+            <w:r>
+              <w:rPr>
+                <w:rFonts w:ascii="Arial" w:cs="Arial" w:eastAsia="Arial" w:hAnsi="Arial"/>
+                <w:sz w:val="20"/>
+                <w:szCs w:val="20"/>
+              </w:rPr>
+              <w:t xml:space="preserve">Parametryzacja — jeden chart dla dev/staging/prod z roznymi values</w:t>
+            </w:r>
+          </w:p>
+        </w:tc>
+        <w:tc>
+          <w:tcPr>
+            <w:tcW w:type="dxa" w:w="4680"/>
+            <w:tcBorders>
+              <w:top w:val="single" w:color="CCCCCC" w:sz="1"/>
+              <w:left w:val="single" w:color="CCCCCC" w:sz="1"/>
+              <w:bottom w:val="single" w:color="CCCCCC" w:sz="1"/>
+              <w:right w:val="single" w:color="CCCCCC" w:sz="1"/>
+            </w:tcBorders>
+            <w:tcMar>
+              <w:top w:type="dxa" w:w="80"/>
+              <w:left w:type="dxa" w:w="120"/>
+              <w:bottom w:type="dxa" w:w="80"/>
+              <w:right w:type="dxa" w:w="120"/>
+            </w:tcMar>
+          </w:tcPr>
+          <w:p>
+            <w:r>
+              <w:rPr>
+                <w:rFonts w:ascii="Arial" w:cs="Arial" w:eastAsia="Arial" w:hAnsi="Arial"/>
+                <w:sz w:val="20"/>
+                <w:szCs w:val="20"/>
+              </w:rPr>
+              <w:t xml:space="preserve">Zlozonosc szablonow — Helm template language moze byc trudny do debugowania</w:t>
+            </w:r>
+          </w:p>
+        </w:tc>
+      </w:tr>
+      <w:tr>
+        <w:tc>
+          <w:tcPr>
+            <w:tcW w:type="dxa" w:w="4680"/>
+            <w:tcBorders>
+              <w:top w:val="single" w:color="CCCCCC" w:sz="1"/>
+              <w:left w:val="single" w:color="CCCCCC" w:sz="1"/>
+              <w:bottom w:val="single" w:color="CCCCCC" w:sz="1"/>
+              <w:right w:val="single" w:color="CCCCCC" w:sz="1"/>
+            </w:tcBorders>
+            <w:tcMar>
+              <w:top w:type="dxa" w:w="80"/>
+              <w:left w:type="dxa" w:w="120"/>
+              <w:bottom w:type="dxa" w:w="80"/>
+              <w:right w:type="dxa" w:w="120"/>
+            </w:tcMar>
+          </w:tcPr>
+          <w:p>
+            <w:r>
+              <w:rPr>
+                <w:rFonts w:ascii="Arial" w:cs="Arial" w:eastAsia="Arial" w:hAnsi="Arial"/>
+                <w:sz w:val="20"/>
+                <w:szCs w:val="20"/>
+              </w:rPr>
+              <w:t xml:space="preserve">Historia zmian i rollback — helm history + helm rollback jednym poleceniem</w:t>
+            </w:r>
+          </w:p>
+        </w:tc>
+        <w:tc>
+          <w:tcPr>
+            <w:tcW w:type="dxa" w:w="4680"/>
+            <w:tcBorders>
+              <w:top w:val="single" w:color="CCCCCC" w:sz="1"/>
+              <w:left w:val="single" w:color="CCCCCC" w:sz="1"/>
+              <w:bottom w:val="single" w:color="CCCCCC" w:sz="1"/>
+              <w:right w:val="single" w:color="CCCCCC" w:sz="1"/>
+            </w:tcBorders>
+            <w:tcMar>
+              <w:top w:type="dxa" w:w="80"/>
+              <w:left w:type="dxa" w:w="120"/>
+              <w:bottom w:type="dxa" w:w="80"/>
+              <w:right w:type="dxa" w:w="120"/>
+            </w:tcMar>
+          </w:tcPr>
+          <w:p>
+            <w:r>
+              <w:rPr>
+                <w:rFonts w:ascii="Arial" w:cs="Arial" w:eastAsia="Arial" w:hAnsi="Arial"/>
+                <w:sz w:val="20"/>
+                <w:szCs w:val="20"/>
+              </w:rPr>
+              <w:t xml:space="preserve">helm upgrade bez --atomic moze zostawic klaster w polowicznym stanie</w:t>
+            </w:r>
+          </w:p>
+        </w:tc>
+      </w:tr>
+      <w:tr>
+        <w:tc>
+          <w:tcPr>
+            <w:tcW w:type="dxa" w:w="4680"/>
+            <w:tcBorders>
+              <w:top w:val="single" w:color="CCCCCC" w:sz="1"/>
+              <w:left w:val="single" w:color="CCCCCC" w:sz="1"/>
+              <w:bottom w:val="single" w:color="CCCCCC" w:sz="1"/>
+              <w:right w:val="single" w:color="CCCCCC" w:sz="1"/>
+            </w:tcBorders>
+            <w:tcMar>
+              <w:top w:type="dxa" w:w="80"/>
+              <w:left w:type="dxa" w:w="120"/>
+              <w:bottom w:type="dxa" w:w="80"/>
+              <w:right w:type="dxa" w:w="120"/>
+            </w:tcMar>
+          </w:tcPr>
+          <w:p>
+            <w:r>
+              <w:rPr>
+                <w:rFonts w:ascii="Arial" w:cs="Arial" w:eastAsia="Arial" w:hAnsi="Arial"/>
+                <w:sz w:val="20"/>
+                <w:szCs w:val="20"/>
+              </w:rPr>
+              <w:t xml:space="preserve">Wersjonowanie aplikacji — chart version + appVersion</w:t>
+            </w:r>
+          </w:p>
+        </w:tc>
+        <w:tc>
+          <w:tcPr>
+            <w:tcW w:type="dxa" w:w="4680"/>
+            <w:tcBorders>
+              <w:top w:val="single" w:color="CCCCCC" w:sz="1"/>
+              <w:left w:val="single" w:color="CCCCCC" w:sz="1"/>
+              <w:bottom w:val="single" w:color="CCCCCC" w:sz="1"/>
+              <w:right w:val="single" w:color="CCCCCC" w:sz="1"/>
+            </w:tcBorders>
+            <w:tcMar>
+              <w:top w:type="dxa" w:w="80"/>
+              <w:left w:type="dxa" w:w="120"/>
+              <w:bottom w:type="dxa" w:w="80"/>
+              <w:right w:type="dxa" w:w="120"/>
+            </w:tcMar>
+          </w:tcPr>
+          <w:p>
+            <w:r>
+              <w:rPr>
+                <w:rFonts w:ascii="Arial" w:cs="Arial" w:eastAsia="Arial" w:hAnsi="Arial"/>
+                <w:sz w:val="20"/>
+                <w:szCs w:val="20"/>
+              </w:rPr>
+              <w:t xml:space="preserve">Brak natywnego GitOps — Helm nie synchronizuje sie z Git (potrzeba FluxCD HelmRelease)</w:t>
+            </w:r>
+          </w:p>
+        </w:tc>
+      </w:tr>
+      <w:tr>
+        <w:tc>
+          <w:tcPr>
+            <w:tcW w:type="dxa" w:w="4680"/>
+            <w:tcBorders>
+              <w:top w:val="single" w:color="CCCCCC" w:sz="1"/>
+              <w:left w:val="single" w:color="CCCCCC" w:sz="1"/>
+              <w:bottom w:val="single" w:color="CCCCCC" w:sz="1"/>
+              <w:right w:val="single" w:color="CCCCCC" w:sz="1"/>
+            </w:tcBorders>
+            <w:tcMar>
+              <w:top w:type="dxa" w:w="80"/>
+              <w:left w:type="dxa" w:w="120"/>
+              <w:bottom w:type="dxa" w:w="80"/>
+              <w:right w:type="dxa" w:w="120"/>
+            </w:tcMar>
+          </w:tcPr>
+          <w:p>
+            <w:r>
+              <w:rPr>
+                <w:rFonts w:ascii="Arial" w:cs="Arial" w:eastAsia="Arial" w:hAnsi="Arial"/>
+                <w:sz w:val="20"/>
+                <w:szCs w:val="20"/>
+              </w:rPr>
+              <w:t xml:space="preserve">Ekosystem — tysace gotowych chartow na Artifact Hub</w:t>
+            </w:r>
+          </w:p>
+        </w:tc>
+        <w:tc>
+          <w:tcPr>
+            <w:tcW w:type="dxa" w:w="4680"/>
+            <w:tcBorders>
+              <w:top w:val="single" w:color="CCCCCC" w:sz="1"/>
+              <w:left w:val="single" w:color="CCCCCC" w:sz="1"/>
+              <w:bottom w:val="single" w:color="CCCCCC" w:sz="1"/>
+              <w:right w:val="single" w:color="CCCCCC" w:sz="1"/>
+            </w:tcBorders>
+            <w:tcMar>
+              <w:top w:type="dxa" w:w="80"/>
+              <w:left w:type="dxa" w:w="120"/>
+              <w:bottom w:type="dxa" w:w="80"/>
+              <w:right w:type="dxa" w:w="120"/>
+            </w:tcMar>
+          </w:tcPr>
+          <w:p>
+            <w:r>
+              <w:rPr>
+                <w:rFonts w:ascii="Arial" w:cs="Arial" w:eastAsia="Arial" w:hAnsi="Arial"/>
+                <w:sz w:val="20"/>
+                <w:szCs w:val="20"/>
+              </w:rPr>
+              <w:t xml:space="preserve">Sekrety w values.yaml — latwo przypadkowo wersjonowac hasla w Git</w:t>
+            </w:r>
+          </w:p>
+        </w:tc>
+      </w:tr>
+    </w:tbl>
+    <w:p>
+      <w:r>
+        <w:br w:type="page"/>
+      </w:r>
+    </w:p>
+    <w:p>
+      <w:pPr>
+        <w:pStyle w:val="Heading1"/>
+        <w:spacing w:after="200" w:before="400"/>
+      </w:pPr>
+      <w:r>
+        <w:rPr>
+          <w:rFonts w:ascii="Arial" w:cs="Arial" w:eastAsia="Arial" w:hAnsi="Arial"/>
+          <w:b/>
+          <w:bCs/>
+          <w:color w:val="1F4E79"/>
+          <w:sz w:val="32"/>
+          <w:szCs w:val="32"/>
+        </w:rPr>
+        <w:t xml:space="preserve">Rozdzial 23: OPA/Gatekeeper — Policy as Code (admission control)</w:t>
+      </w:r>
+    </w:p>
+    <w:p>
+      <w:pPr>
+        <w:pStyle w:val="Heading2"/>
+        <w:spacing w:after="140" w:before="280"/>
+      </w:pPr>
+      <w:r>
+        <w:rPr>
+          <w:rFonts w:ascii="Arial" w:cs="Arial" w:eastAsia="Arial" w:hAnsi="Arial"/>
+          <w:b/>
+          <w:bCs/>
+          <w:color w:val="2E75B6"/>
+          <w:sz w:val="26"/>
+          <w:szCs w:val="26"/>
+        </w:rPr>
+        <w:t xml:space="preserve">Co to jest</w:t>
+      </w:r>
+    </w:p>
+    <w:p>
+      <w:pPr>
+        <w:spacing w:after="80" w:before="80"/>
+      </w:pPr>
+      <w:r>
+        <w:rPr>
+          <w:rFonts w:ascii="Arial" w:cs="Arial" w:eastAsia="Arial" w:hAnsi="Arial"/>
+          <w:sz w:val="22"/>
+          <w:szCs w:val="22"/>
+        </w:rPr>
+        <w:t xml:space="preserve">OPA (Open Policy Agent) to silnik polityk open-source. Gatekeeper to jego integracja z Kubernetes jako admission controller — sprawdza kazdy zasob PRZED jego utworzeniem w klastrze. Jesli zasob narusza polityki, Kubernetes go odrzuca. W naszym projekcie Gatekeeper jest zarzadzany przez Azure Arc + Azure Policy addon.</w:t>
+      </w:r>
+    </w:p>
+    <w:p>
+      <w:pPr>
+        <w:spacing w:after="80" w:before="0"/>
+      </w:pPr>
+      <w:r>
+        <w:t xml:space="preserve"/>
+      </w:r>
+    </w:p>
+    <w:tbl>
+      <w:tblPr>
+        <w:tblW w:type="dxa" w:w="9360"/>
+        <w:tblBorders>
+          <w:top w:val="single" w:color="auto" w:sz="4"/>
+          <w:left w:val="single" w:color="auto" w:sz="4"/>
+          <w:bottom w:val="single" w:color="auto" w:sz="4"/>
+          <w:right w:val="single" w:color="auto" w:sz="4"/>
+          <w:insideH w:val="single" w:color="auto" w:sz="4"/>
+          <w:insideV w:val="single" w:color="auto" w:sz="4"/>
+        </w:tblBorders>
+      </w:tblPr>
+      <w:tblGrid>
+        <w:gridCol w:w="9360"/>
+      </w:tblGrid>
+      <w:tr>
+        <w:tc>
+          <w:tcPr>
+            <w:tcW w:type="dxa" w:w="9360"/>
+            <w:tcBorders>
+              <w:top w:val="single" w:color="CCCCCC" w:sz="1"/>
+              <w:left w:val="single" w:color="CCCCCC" w:sz="1"/>
+              <w:bottom w:val="single" w:color="CCCCCC" w:sz="1"/>
+              <w:right w:val="single" w:color="CCCCCC" w:sz="1"/>
+            </w:tcBorders>
+            <w:shd w:fill="D5E8F0" w:val="clear"/>
+            <w:tcMar>
+              <w:top w:type="dxa" w:w="120"/>
+              <w:left w:type="dxa" w:w="200"/>
+              <w:bottom w:type="dxa" w:w="120"/>
+              <w:right w:type="dxa" w:w="200"/>
+            </w:tcMar>
+          </w:tcPr>
+          <w:p>
+            <w:pPr>
+              <w:spacing w:after="0" w:before="0"/>
+            </w:pPr>
+            <w:r>
+              <w:rPr>
+                <w:rFonts w:ascii="Arial" w:cs="Arial" w:eastAsia="Arial" w:hAnsi="Arial"/>
+                <w:b/>
+                <w:bCs/>
+                <w:color w:val="1F4E79"/>
+                <w:sz w:val="22"/>
+                <w:szCs w:val="22"/>
+              </w:rPr>
+              <w:t xml:space="preserve">Analogia: </w:t>
+            </w:r>
+            <w:r>
+              <w:rPr>
+                <w:rFonts w:ascii="Arial" w:cs="Arial" w:eastAsia="Arial" w:hAnsi="Arial"/>
+                <w:i/>
+                <w:iCs/>
+                <w:color w:val="000000"/>
+                <w:sz w:val="22"/>
+                <w:szCs w:val="22"/>
+              </w:rPr>
+              <w:t xml:space="preserve">Kontrola paszportowa na lotnisku — NetworkPolicy to strazy na terenie lotniska (po wejsciu). Gatekeeper to kontrola paszportowa PRZED wejsciem — jesli nie masz waznego paszportu (spelniasz polityki), nie wchodzisz do samolotu (klaster odrzuca zasob). Taniej i bezpieczniej zatrzymac problem na wejsciu.</w:t>
+            </w:r>
+          </w:p>
+        </w:tc>
+      </w:tr>
+    </w:tbl>
+    <w:p>
+      <w:pPr>
+        <w:spacing w:after="80" w:before="0"/>
+      </w:pPr>
+      <w:r>
+        <w:t xml:space="preserve"/>
+      </w:r>
+    </w:p>
+    <w:p>
+      <w:pPr>
+        <w:pStyle w:val="Heading2"/>
+        <w:spacing w:after="140" w:before="280"/>
+      </w:pPr>
+      <w:r>
+        <w:rPr>
+          <w:rFonts w:ascii="Arial" w:cs="Arial" w:eastAsia="Arial" w:hAnsi="Arial"/>
+          <w:b/>
+          <w:bCs/>
+          <w:color w:val="2E75B6"/>
+          <w:sz w:val="26"/>
+          <w:szCs w:val="26"/>
+        </w:rPr>
+        <w:t xml:space="preserve">Wyniki audytu — 16 ConstraintTemplates, kluczowe naruszenia</w:t>
+      </w:r>
+    </w:p>
+    <w:tbl>
+      <w:tblPr>
+        <w:tblW w:type="dxa" w:w="9360"/>
+        <w:tblBorders>
+          <w:top w:val="single" w:color="auto" w:sz="4"/>
+          <w:left w:val="single" w:color="auto" w:sz="4"/>
+          <w:bottom w:val="single" w:color="auto" w:sz="4"/>
+          <w:right w:val="single" w:color="auto" w:sz="4"/>
+          <w:insideH w:val="single" w:color="auto" w:sz="4"/>
+          <w:insideV w:val="single" w:color="auto" w:sz="4"/>
+        </w:tblBorders>
+      </w:tblPr>
+      <w:tblGrid>
+        <w:gridCol w:w="4500"/>
+        <w:gridCol w:w="1500"/>
+        <w:gridCol w:w="3360"/>
+      </w:tblGrid>
+      <w:tr>
+        <w:tc>
+          <w:tcPr>
+            <w:tcBorders>
+              <w:top w:val="single" w:color="CCCCCC" w:sz="1"/>
+              <w:left w:val="single" w:color="CCCCCC" w:sz="1"/>
+              <w:bottom w:val="single" w:color="CCCCCC" w:sz="1"/>
+              <w:right w:val="single" w:color="CCCCCC" w:sz="1"/>
+            </w:tcBorders>
+            <w:shd w:fill="2E75B6" w:val="clear"/>
+            <w:tcMar>
+              <w:top w:type="dxa" w:w="80"/>
+              <w:left w:type="dxa" w:w="120"/>
+              <w:bottom w:type="dxa" w:w="80"/>
+              <w:right w:type="dxa" w:w="120"/>
+            </w:tcMar>
+          </w:tcPr>
+          <w:p>
+            <w:r>
+              <w:rPr>
+                <w:rFonts w:ascii="Arial" w:cs="Arial" w:eastAsia="Arial" w:hAnsi="Arial"/>
+                <w:b/>
+                <w:bCs/>
+                <w:color w:val="FFFFFF"/>
+                <w:sz w:val="20"/>
+                <w:szCs w:val="20"/>
+              </w:rPr>
+              <w:t xml:space="preserve">Polityka</w:t>
+            </w:r>
+          </w:p>
+        </w:tc>
+        <w:tc>
+          <w:tcPr>
+            <w:tcBorders>
+              <w:top w:val="single" w:color="CCCCCC" w:sz="1"/>
+              <w:left w:val="single" w:color="CCCCCC" w:sz="1"/>
+              <w:bottom w:val="single" w:color="CCCCCC" w:sz="1"/>
+              <w:right w:val="single" w:color="CCCCCC" w:sz="1"/>
+            </w:tcBorders>
+            <w:shd w:fill="2E75B6" w:val="clear"/>
+            <w:tcMar>
+              <w:top w:type="dxa" w:w="80"/>
+              <w:left w:type="dxa" w:w="120"/>
+              <w:bottom w:type="dxa" w:w="80"/>
+              <w:right w:type="dxa" w:w="120"/>
+            </w:tcMar>
+          </w:tcPr>
+          <w:p>
+            <w:r>
+              <w:rPr>
+                <w:rFonts w:ascii="Arial" w:cs="Arial" w:eastAsia="Arial" w:hAnsi="Arial"/>
+                <w:b/>
+                <w:bCs/>
+                <w:color w:val="FFFFFF"/>
+                <w:sz w:val="20"/>
+                <w:szCs w:val="20"/>
+              </w:rPr>
+              <w:t xml:space="preserve">Naruszenia</w:t>
+            </w:r>
+          </w:p>
+        </w:tc>
+        <w:tc>
+          <w:tcPr>
+            <w:tcBorders>
+              <w:top w:val="single" w:color="CCCCCC" w:sz="1"/>
+              <w:left w:val="single" w:color="CCCCCC" w:sz="1"/>
+              <w:bottom w:val="single" w:color="CCCCCC" w:sz="1"/>
+              <w:right w:val="single" w:color="CCCCCC" w:sz="1"/>
+            </w:tcBorders>
+            <w:shd w:fill="2E75B6" w:val="clear"/>
+            <w:tcMar>
+              <w:top w:type="dxa" w:w="80"/>
+              <w:left w:type="dxa" w:w="120"/>
+              <w:bottom w:type="dxa" w:w="80"/>
+              <w:right w:type="dxa" w:w="120"/>
+            </w:tcMar>
+          </w:tcPr>
+          <w:p>
+            <w:r>
+              <w:rPr>
+                <w:rFonts w:ascii="Arial" w:cs="Arial" w:eastAsia="Arial" w:hAnsi="Arial"/>
+                <w:b/>
+                <w:bCs/>
+                <w:color w:val="FFFFFF"/>
+                <w:sz w:val="20"/>
+                <w:szCs w:val="20"/>
+              </w:rPr>
+              <w:t xml:space="preserve">Opis</w:t>
+            </w:r>
+          </w:p>
+        </w:tc>
+      </w:tr>
+      <w:tr>
+        <w:tc>
+          <w:tcPr>
+            <w:tcBorders>
+              <w:top w:val="single" w:color="CCCCCC" w:sz="1"/>
+              <w:left w:val="single" w:color="CCCCCC" w:sz="1"/>
+              <w:bottom w:val="single" w:color="CCCCCC" w:sz="1"/>
+              <w:right w:val="single" w:color="CCCCCC" w:sz="1"/>
+            </w:tcBorders>
+            <w:shd w:fill="FFFFFF" w:val="clear"/>
+            <w:tcMar>
+              <w:top w:type="dxa" w:w="80"/>
+              <w:left w:type="dxa" w:w="120"/>
+              <w:bottom w:type="dxa" w:w="80"/>
+              <w:right w:type="dxa" w:w="120"/>
+            </w:tcMar>
+          </w:tcPr>
+          <w:p>
+            <w:r>
+              <w:rPr>
+                <w:rFonts w:ascii="Courier New" w:cs="Courier New" w:eastAsia="Courier New" w:hAnsi="Courier New"/>
+                <w:sz w:val="18"/>
+                <w:szCs w:val="18"/>
+              </w:rPr>
+              <w:t xml:space="preserve">k8sazurev3containerlimits</w:t>
+            </w:r>
+          </w:p>
+        </w:tc>
+        <w:tc>
+          <w:tcPr>
+            <w:tcBorders>
+              <w:top w:val="single" w:color="CCCCCC" w:sz="1"/>
+              <w:left w:val="single" w:color="CCCCCC" w:sz="1"/>
+              <w:bottom w:val="single" w:color="CCCCCC" w:sz="1"/>
+              <w:right w:val="single" w:color="CCCCCC" w:sz="1"/>
+            </w:tcBorders>
+            <w:shd w:fill="FFFFFF" w:val="clear"/>
+            <w:tcMar>
+              <w:top w:type="dxa" w:w="80"/>
+              <w:left w:type="dxa" w:w="120"/>
+              <w:bottom w:type="dxa" w:w="80"/>
+              <w:right w:type="dxa" w:w="120"/>
+            </w:tcMar>
+          </w:tcPr>
+          <w:p>
+            <w:r>
+              <w:rPr>
+                <w:rFonts w:ascii="Arial" w:cs="Arial" w:eastAsia="Arial" w:hAnsi="Arial"/>
+                <w:b/>
+                <w:bCs/>
+                <w:sz w:val="20"/>
+                <w:szCs w:val="20"/>
+              </w:rPr>
+              <w:t xml:space="preserve">34</w:t>
+            </w:r>
+          </w:p>
+        </w:tc>
+        <w:tc>
+          <w:tcPr>
+            <w:tcBorders>
+              <w:top w:val="single" w:color="CCCCCC" w:sz="1"/>
+              <w:left w:val="single" w:color="CCCCCC" w:sz="1"/>
+              <w:bottom w:val="single" w:color="CCCCCC" w:sz="1"/>
+              <w:right w:val="single" w:color="CCCCCC" w:sz="1"/>
+            </w:tcBorders>
+            <w:shd w:fill="FFFFFF" w:val="clear"/>
+            <w:tcMar>
+              <w:top w:type="dxa" w:w="80"/>
+              <w:left w:type="dxa" w:w="120"/>
+              <w:bottom w:type="dxa" w:w="80"/>
+              <w:right w:type="dxa" w:w="120"/>
+            </w:tcMar>
+          </w:tcPr>
+          <w:p>
+            <w:r>
+              <w:rPr>
+                <w:rFonts w:ascii="Arial" w:cs="Arial" w:eastAsia="Arial" w:hAnsi="Arial"/>
+                <w:sz w:val="20"/>
+                <w:szCs w:val="20"/>
+              </w:rPr>
+              <w:t xml:space="preserve">Kontenery bez resource limits</w:t>
+            </w:r>
+          </w:p>
+        </w:tc>
+      </w:tr>
+      <w:tr>
+        <w:tc>
+          <w:tcPr>
+            <w:tcBorders>
+              <w:top w:val="single" w:color="CCCCCC" w:sz="1"/>
+              <w:left w:val="single" w:color="CCCCCC" w:sz="1"/>
+              <w:bottom w:val="single" w:color="CCCCCC" w:sz="1"/>
+              <w:right w:val="single" w:color="CCCCCC" w:sz="1"/>
+            </w:tcBorders>
+            <w:shd w:fill="F2F2F2" w:val="clear"/>
+            <w:tcMar>
+              <w:top w:type="dxa" w:w="80"/>
+              <w:left w:type="dxa" w:w="120"/>
+              <w:bottom w:type="dxa" w:w="80"/>
+              <w:right w:type="dxa" w:w="120"/>
+            </w:tcMar>
+          </w:tcPr>
+          <w:p>
+            <w:r>
+              <w:rPr>
+                <w:rFonts w:ascii="Courier New" w:cs="Courier New" w:eastAsia="Courier New" w:hAnsi="Courier New"/>
+                <w:sz w:val="18"/>
+                <w:szCs w:val="18"/>
+              </w:rPr>
+              <w:t xml:space="preserve">k8sazurev2containerallowedimages</w:t>
+            </w:r>
+          </w:p>
+        </w:tc>
+        <w:tc>
+          <w:tcPr>
+            <w:tcBorders>
+              <w:top w:val="single" w:color="CCCCCC" w:sz="1"/>
+              <w:left w:val="single" w:color="CCCCCC" w:sz="1"/>
+              <w:bottom w:val="single" w:color="CCCCCC" w:sz="1"/>
+              <w:right w:val="single" w:color="CCCCCC" w:sz="1"/>
+            </w:tcBorders>
+            <w:shd w:fill="F2F2F2" w:val="clear"/>
+            <w:tcMar>
+              <w:top w:type="dxa" w:w="80"/>
+              <w:left w:type="dxa" w:w="120"/>
+              <w:bottom w:type="dxa" w:w="80"/>
+              <w:right w:type="dxa" w:w="120"/>
+            </w:tcMar>
+          </w:tcPr>
+          <w:p>
+            <w:r>
+              <w:rPr>
+                <w:rFonts w:ascii="Arial" w:cs="Arial" w:eastAsia="Arial" w:hAnsi="Arial"/>
+                <w:b/>
+                <w:bCs/>
+                <w:sz w:val="20"/>
+                <w:szCs w:val="20"/>
+              </w:rPr>
+              <w:t xml:space="preserve">30</w:t>
+            </w:r>
+          </w:p>
+        </w:tc>
+        <w:tc>
+          <w:tcPr>
+            <w:tcBorders>
+              <w:top w:val="single" w:color="CCCCCC" w:sz="1"/>
+              <w:left w:val="single" w:color="CCCCCC" w:sz="1"/>
+              <w:bottom w:val="single" w:color="CCCCCC" w:sz="1"/>
+              <w:right w:val="single" w:color="CCCCCC" w:sz="1"/>
+            </w:tcBorders>
+            <w:shd w:fill="F2F2F2" w:val="clear"/>
+            <w:tcMar>
+              <w:top w:type="dxa" w:w="80"/>
+              <w:left w:type="dxa" w:w="120"/>
+              <w:bottom w:type="dxa" w:w="80"/>
+              <w:right w:type="dxa" w:w="120"/>
+            </w:tcMar>
+          </w:tcPr>
+          <w:p>
+            <w:r>
+              <w:rPr>
+                <w:rFonts w:ascii="Arial" w:cs="Arial" w:eastAsia="Arial" w:hAnsi="Arial"/>
+                <w:sz w:val="20"/>
+                <w:szCs w:val="20"/>
+              </w:rPr>
+              <w:t xml:space="preserve">Obrazy spoza dozwolonego registry</w:t>
+            </w:r>
+          </w:p>
+        </w:tc>
+      </w:tr>
+      <w:tr>
+        <w:tc>
+          <w:tcPr>
+            <w:tcBorders>
+              <w:top w:val="single" w:color="CCCCCC" w:sz="1"/>
+              <w:left w:val="single" w:color="CCCCCC" w:sz="1"/>
+              <w:bottom w:val="single" w:color="CCCCCC" w:sz="1"/>
+              <w:right w:val="single" w:color="CCCCCC" w:sz="1"/>
+            </w:tcBorders>
+            <w:shd w:fill="FFFFFF" w:val="clear"/>
+            <w:tcMar>
+              <w:top w:type="dxa" w:w="80"/>
+              <w:left w:type="dxa" w:w="120"/>
+              <w:bottom w:type="dxa" w:w="80"/>
+              <w:right w:type="dxa" w:w="120"/>
+            </w:tcMar>
+          </w:tcPr>
+          <w:p>
+            <w:r>
+              <w:rPr>
+                <w:rFonts w:ascii="Courier New" w:cs="Courier New" w:eastAsia="Courier New" w:hAnsi="Courier New"/>
+                <w:sz w:val="18"/>
+                <w:szCs w:val="18"/>
+              </w:rPr>
+              <w:t xml:space="preserve">k8sazurev2blockautomounttoken</w:t>
+            </w:r>
+          </w:p>
+        </w:tc>
+        <w:tc>
+          <w:tcPr>
+            <w:tcBorders>
+              <w:top w:val="single" w:color="CCCCCC" w:sz="1"/>
+              <w:left w:val="single" w:color="CCCCCC" w:sz="1"/>
+              <w:bottom w:val="single" w:color="CCCCCC" w:sz="1"/>
+              <w:right w:val="single" w:color="CCCCCC" w:sz="1"/>
+            </w:tcBorders>
+            <w:shd w:fill="FFFFFF" w:val="clear"/>
+            <w:tcMar>
+              <w:top w:type="dxa" w:w="80"/>
+              <w:left w:type="dxa" w:w="120"/>
+              <w:bottom w:type="dxa" w:w="80"/>
+              <w:right w:type="dxa" w:w="120"/>
+            </w:tcMar>
+          </w:tcPr>
+          <w:p>
+            <w:r>
+              <w:rPr>
+                <w:rFonts w:ascii="Arial" w:cs="Arial" w:eastAsia="Arial" w:hAnsi="Arial"/>
+                <w:b/>
+                <w:bCs/>
+                <w:sz w:val="20"/>
+                <w:szCs w:val="20"/>
+              </w:rPr>
+              <w:t xml:space="preserve">21</w:t>
+            </w:r>
+          </w:p>
+        </w:tc>
+        <w:tc>
+          <w:tcPr>
+            <w:tcBorders>
+              <w:top w:val="single" w:color="CCCCCC" w:sz="1"/>
+              <w:left w:val="single" w:color="CCCCCC" w:sz="1"/>
+              <w:bottom w:val="single" w:color="CCCCCC" w:sz="1"/>
+              <w:right w:val="single" w:color="CCCCCC" w:sz="1"/>
+            </w:tcBorders>
+            <w:shd w:fill="FFFFFF" w:val="clear"/>
+            <w:tcMar>
+              <w:top w:type="dxa" w:w="80"/>
+              <w:left w:type="dxa" w:w="120"/>
+              <w:bottom w:type="dxa" w:w="80"/>
+              <w:right w:type="dxa" w:w="120"/>
+            </w:tcMar>
+          </w:tcPr>
+          <w:p>
+            <w:r>
+              <w:rPr>
+                <w:rFonts w:ascii="Arial" w:cs="Arial" w:eastAsia="Arial" w:hAnsi="Arial"/>
+                <w:sz w:val="20"/>
+                <w:szCs w:val="20"/>
+              </w:rPr>
+              <w:t xml:space="preserve">Automount service account token</w:t>
+            </w:r>
+          </w:p>
+        </w:tc>
+      </w:tr>
+      <w:tr>
+        <w:tc>
+          <w:tcPr>
+            <w:tcBorders>
+              <w:top w:val="single" w:color="CCCCCC" w:sz="1"/>
+              <w:left w:val="single" w:color="CCCCCC" w:sz="1"/>
+              <w:bottom w:val="single" w:color="CCCCCC" w:sz="1"/>
+              <w:right w:val="single" w:color="CCCCCC" w:sz="1"/>
+            </w:tcBorders>
+            <w:shd w:fill="F2F2F2" w:val="clear"/>
+            <w:tcMar>
+              <w:top w:type="dxa" w:w="80"/>
+              <w:left w:type="dxa" w:w="120"/>
+              <w:bottom w:type="dxa" w:w="80"/>
+              <w:right w:type="dxa" w:w="120"/>
+            </w:tcMar>
+          </w:tcPr>
+          <w:p>
+            <w:r>
+              <w:rPr>
+                <w:rFonts w:ascii="Courier New" w:cs="Courier New" w:eastAsia="Courier New" w:hAnsi="Courier New"/>
+                <w:sz w:val="18"/>
+                <w:szCs w:val="18"/>
+              </w:rPr>
+              <w:t xml:space="preserve">k8sazurev3allowedusersgroups</w:t>
+            </w:r>
+          </w:p>
+        </w:tc>
+        <w:tc>
+          <w:tcPr>
+            <w:tcBorders>
+              <w:top w:val="single" w:color="CCCCCC" w:sz="1"/>
+              <w:left w:val="single" w:color="CCCCCC" w:sz="1"/>
+              <w:bottom w:val="single" w:color="CCCCCC" w:sz="1"/>
+              <w:right w:val="single" w:color="CCCCCC" w:sz="1"/>
+            </w:tcBorders>
+            <w:shd w:fill="F2F2F2" w:val="clear"/>
+            <w:tcMar>
+              <w:top w:type="dxa" w:w="80"/>
+              <w:left w:type="dxa" w:w="120"/>
+              <w:bottom w:type="dxa" w:w="80"/>
+              <w:right w:type="dxa" w:w="120"/>
+            </w:tcMar>
+          </w:tcPr>
+          <w:p>
+            <w:r>
+              <w:rPr>
+                <w:rFonts w:ascii="Arial" w:cs="Arial" w:eastAsia="Arial" w:hAnsi="Arial"/>
+                <w:b/>
+                <w:bCs/>
+                <w:sz w:val="20"/>
+                <w:szCs w:val="20"/>
+              </w:rPr>
+              <w:t xml:space="preserve">22</w:t>
+            </w:r>
+          </w:p>
+        </w:tc>
+        <w:tc>
+          <w:tcPr>
+            <w:tcBorders>
+              <w:top w:val="single" w:color="CCCCCC" w:sz="1"/>
+              <w:left w:val="single" w:color="CCCCCC" w:sz="1"/>
+              <w:bottom w:val="single" w:color="CCCCCC" w:sz="1"/>
+              <w:right w:val="single" w:color="CCCCCC" w:sz="1"/>
+            </w:tcBorders>
+            <w:shd w:fill="F2F2F2" w:val="clear"/>
+            <w:tcMar>
+              <w:top w:type="dxa" w:w="80"/>
+              <w:left w:type="dxa" w:w="120"/>
+              <w:bottom w:type="dxa" w:w="80"/>
+              <w:right w:type="dxa" w:w="120"/>
+            </w:tcMar>
+          </w:tcPr>
+          <w:p>
+            <w:r>
+              <w:rPr>
+                <w:rFonts w:ascii="Arial" w:cs="Arial" w:eastAsia="Arial" w:hAnsi="Arial"/>
+                <w:sz w:val="20"/>
+                <w:szCs w:val="20"/>
+              </w:rPr>
+              <w:t xml:space="preserve">Niezgodne ustawienia user/group</w:t>
+            </w:r>
+          </w:p>
+        </w:tc>
+      </w:tr>
+      <w:tr>
+        <w:tc>
+          <w:tcPr>
+            <w:tcBorders>
+              <w:top w:val="single" w:color="CCCCCC" w:sz="1"/>
+              <w:left w:val="single" w:color="CCCCCC" w:sz="1"/>
+              <w:bottom w:val="single" w:color="CCCCCC" w:sz="1"/>
+              <w:right w:val="single" w:color="CCCCCC" w:sz="1"/>
+            </w:tcBorders>
+            <w:shd w:fill="FFFFFF" w:val="clear"/>
+            <w:tcMar>
+              <w:top w:type="dxa" w:w="80"/>
+              <w:left w:type="dxa" w:w="120"/>
+              <w:bottom w:type="dxa" w:w="80"/>
+              <w:right w:type="dxa" w:w="120"/>
+            </w:tcMar>
+          </w:tcPr>
+          <w:p>
+            <w:r>
+              <w:rPr>
+                <w:rFonts w:ascii="Courier New" w:cs="Courier New" w:eastAsia="Courier New" w:hAnsi="Courier New"/>
+                <w:sz w:val="18"/>
+                <w:szCs w:val="18"/>
+              </w:rPr>
+              <w:t xml:space="preserve">k8sazurev3hostnetworkingports</w:t>
+            </w:r>
+          </w:p>
+        </w:tc>
+        <w:tc>
+          <w:tcPr>
+            <w:tcBorders>
+              <w:top w:val="single" w:color="CCCCCC" w:sz="1"/>
+              <w:left w:val="single" w:color="CCCCCC" w:sz="1"/>
+              <w:bottom w:val="single" w:color="CCCCCC" w:sz="1"/>
+              <w:right w:val="single" w:color="CCCCCC" w:sz="1"/>
+            </w:tcBorders>
+            <w:shd w:fill="FFFFFF" w:val="clear"/>
+            <w:tcMar>
+              <w:top w:type="dxa" w:w="80"/>
+              <w:left w:type="dxa" w:w="120"/>
+              <w:bottom w:type="dxa" w:w="80"/>
+              <w:right w:type="dxa" w:w="120"/>
+            </w:tcMar>
+          </w:tcPr>
+          <w:p>
+            <w:r>
+              <w:rPr>
+                <w:rFonts w:ascii="Arial" w:cs="Arial" w:eastAsia="Arial" w:hAnsi="Arial"/>
+                <w:b/>
+                <w:bCs/>
+                <w:sz w:val="20"/>
+                <w:szCs w:val="20"/>
+              </w:rPr>
+              <w:t xml:space="preserve">15</w:t>
+            </w:r>
+          </w:p>
+        </w:tc>
+        <w:tc>
+          <w:tcPr>
+            <w:tcBorders>
+              <w:top w:val="single" w:color="CCCCCC" w:sz="1"/>
+              <w:left w:val="single" w:color="CCCCCC" w:sz="1"/>
+              <w:bottom w:val="single" w:color="CCCCCC" w:sz="1"/>
+              <w:right w:val="single" w:color="CCCCCC" w:sz="1"/>
+            </w:tcBorders>
+            <w:shd w:fill="FFFFFF" w:val="clear"/>
+            <w:tcMar>
+              <w:top w:type="dxa" w:w="80"/>
+              <w:left w:type="dxa" w:w="120"/>
+              <w:bottom w:type="dxa" w:w="80"/>
+              <w:right w:type="dxa" w:w="120"/>
+            </w:tcMar>
+          </w:tcPr>
+          <w:p>
+            <w:r>
+              <w:rPr>
+                <w:rFonts w:ascii="Arial" w:cs="Arial" w:eastAsia="Arial" w:hAnsi="Arial"/>
+                <w:sz w:val="20"/>
+                <w:szCs w:val="20"/>
+              </w:rPr>
+              <w:t xml:space="preserve">Naruszenia host networking</w:t>
+            </w:r>
+          </w:p>
+        </w:tc>
+      </w:tr>
+      <w:tr>
+        <w:tc>
+          <w:tcPr>
+            <w:tcBorders>
+              <w:top w:val="single" w:color="CCCCCC" w:sz="1"/>
+              <w:left w:val="single" w:color="CCCCCC" w:sz="1"/>
+              <w:bottom w:val="single" w:color="CCCCCC" w:sz="1"/>
+              <w:right w:val="single" w:color="CCCCCC" w:sz="1"/>
+            </w:tcBorders>
+            <w:shd w:fill="F2F2F2" w:val="clear"/>
+            <w:tcMar>
+              <w:top w:type="dxa" w:w="80"/>
+              <w:left w:type="dxa" w:w="120"/>
+              <w:bottom w:type="dxa" w:w="80"/>
+              <w:right w:type="dxa" w:w="120"/>
+            </w:tcMar>
+          </w:tcPr>
+          <w:p>
+            <w:r>
+              <w:rPr>
+                <w:rFonts w:ascii="Courier New" w:cs="Courier New" w:eastAsia="Courier New" w:hAnsi="Courier New"/>
+                <w:sz w:val="18"/>
+                <w:szCs w:val="18"/>
+              </w:rPr>
+              <w:t xml:space="preserve">k8sazurev3readonlyrootfilesystem</w:t>
+            </w:r>
+          </w:p>
+        </w:tc>
+        <w:tc>
+          <w:tcPr>
+            <w:tcBorders>
+              <w:top w:val="single" w:color="CCCCCC" w:sz="1"/>
+              <w:left w:val="single" w:color="CCCCCC" w:sz="1"/>
+              <w:bottom w:val="single" w:color="CCCCCC" w:sz="1"/>
+              <w:right w:val="single" w:color="CCCCCC" w:sz="1"/>
+            </w:tcBorders>
+            <w:shd w:fill="F2F2F2" w:val="clear"/>
+            <w:tcMar>
+              <w:top w:type="dxa" w:w="80"/>
+              <w:left w:type="dxa" w:w="120"/>
+              <w:bottom w:type="dxa" w:w="80"/>
+              <w:right w:type="dxa" w:w="120"/>
+            </w:tcMar>
+          </w:tcPr>
+          <w:p>
+            <w:r>
+              <w:rPr>
+                <w:rFonts w:ascii="Arial" w:cs="Arial" w:eastAsia="Arial" w:hAnsi="Arial"/>
+                <w:b/>
+                <w:bCs/>
+                <w:sz w:val="20"/>
+                <w:szCs w:val="20"/>
+              </w:rPr>
+              <w:t xml:space="preserve">9</w:t>
+            </w:r>
+          </w:p>
+        </w:tc>
+        <w:tc>
+          <w:tcPr>
+            <w:tcBorders>
+              <w:top w:val="single" w:color="CCCCCC" w:sz="1"/>
+              <w:left w:val="single" w:color="CCCCCC" w:sz="1"/>
+              <w:bottom w:val="single" w:color="CCCCCC" w:sz="1"/>
+              <w:right w:val="single" w:color="CCCCCC" w:sz="1"/>
+            </w:tcBorders>
+            <w:shd w:fill="F2F2F2" w:val="clear"/>
+            <w:tcMar>
+              <w:top w:type="dxa" w:w="80"/>
+              <w:left w:type="dxa" w:w="120"/>
+              <w:bottom w:type="dxa" w:w="80"/>
+              <w:right w:type="dxa" w:w="120"/>
+            </w:tcMar>
+          </w:tcPr>
+          <w:p>
+            <w:r>
+              <w:rPr>
+                <w:rFonts w:ascii="Arial" w:cs="Arial" w:eastAsia="Arial" w:hAnsi="Arial"/>
+                <w:sz w:val="20"/>
+                <w:szCs w:val="20"/>
+              </w:rPr>
+              <w:t xml:space="preserve">Zapisywalny root filesystem</w:t>
+            </w:r>
+          </w:p>
+        </w:tc>
+      </w:tr>
+      <w:tr>
+        <w:tc>
+          <w:tcPr>
+            <w:tcBorders>
+              <w:top w:val="single" w:color="CCCCCC" w:sz="1"/>
+              <w:left w:val="single" w:color="CCCCCC" w:sz="1"/>
+              <w:bottom w:val="single" w:color="CCCCCC" w:sz="1"/>
+              <w:right w:val="single" w:color="CCCCCC" w:sz="1"/>
+            </w:tcBorders>
+            <w:shd w:fill="FFFFFF" w:val="clear"/>
+            <w:tcMar>
+              <w:top w:type="dxa" w:w="80"/>
+              <w:left w:type="dxa" w:w="120"/>
+              <w:bottom w:type="dxa" w:w="80"/>
+              <w:right w:type="dxa" w:w="120"/>
+            </w:tcMar>
+          </w:tcPr>
+          <w:p>
+            <w:r>
+              <w:rPr>
+                <w:rFonts w:ascii="Courier New" w:cs="Courier New" w:eastAsia="Courier New" w:hAnsi="Courier New"/>
+                <w:sz w:val="18"/>
+                <w:szCs w:val="18"/>
+              </w:rPr>
+              <w:t xml:space="preserve">k8sazurev2noprivilege</w:t>
+            </w:r>
+          </w:p>
+        </w:tc>
+        <w:tc>
+          <w:tcPr>
+            <w:tcBorders>
+              <w:top w:val="single" w:color="CCCCCC" w:sz="1"/>
+              <w:left w:val="single" w:color="CCCCCC" w:sz="1"/>
+              <w:bottom w:val="single" w:color="CCCCCC" w:sz="1"/>
+              <w:right w:val="single" w:color="CCCCCC" w:sz="1"/>
+            </w:tcBorders>
+            <w:shd w:fill="FFFFFF" w:val="clear"/>
+            <w:tcMar>
+              <w:top w:type="dxa" w:w="80"/>
+              <w:left w:type="dxa" w:w="120"/>
+              <w:bottom w:type="dxa" w:w="80"/>
+              <w:right w:type="dxa" w:w="120"/>
+            </w:tcMar>
+          </w:tcPr>
+          <w:p>
+            <w:r>
+              <w:rPr>
+                <w:rFonts w:ascii="Arial" w:cs="Arial" w:eastAsia="Arial" w:hAnsi="Arial"/>
+                <w:b w:val="false"/>
+                <w:bCs w:val="false"/>
+                <w:sz w:val="20"/>
+                <w:szCs w:val="20"/>
+              </w:rPr>
+              <w:t xml:space="preserve">0</w:t>
+            </w:r>
+          </w:p>
+        </w:tc>
+        <w:tc>
+          <w:tcPr>
+            <w:tcBorders>
+              <w:top w:val="single" w:color="CCCCCC" w:sz="1"/>
+              <w:left w:val="single" w:color="CCCCCC" w:sz="1"/>
+              <w:bottom w:val="single" w:color="CCCCCC" w:sz="1"/>
+              <w:right w:val="single" w:color="CCCCCC" w:sz="1"/>
+            </w:tcBorders>
+            <w:shd w:fill="FFFFFF" w:val="clear"/>
+            <w:tcMar>
+              <w:top w:type="dxa" w:w="80"/>
+              <w:left w:type="dxa" w:w="120"/>
+              <w:bottom w:type="dxa" w:w="80"/>
+              <w:right w:type="dxa" w:w="120"/>
+            </w:tcMar>
+          </w:tcPr>
+          <w:p>
+            <w:r>
+              <w:rPr>
+                <w:rFonts w:ascii="Arial" w:cs="Arial" w:eastAsia="Arial" w:hAnsi="Arial"/>
+                <w:sz w:val="20"/>
+                <w:szCs w:val="20"/>
+              </w:rPr>
+              <w:t xml:space="preserve">Brak uprawnien root — Compliant</w:t>
+            </w:r>
+          </w:p>
+        </w:tc>
+      </w:tr>
+    </w:tbl>
+    <w:p>
+      <w:pPr>
+        <w:spacing w:after="80" w:before="0"/>
+      </w:pPr>
+      <w:r>
+        <w:t xml:space="preserve"/>
+      </w:r>
+    </w:p>
+    <w:p>
+      <w:pPr>
+        <w:pStyle w:val="Heading2"/>
+        <w:spacing w:after="140" w:before="280"/>
+      </w:pPr>
+      <w:r>
+        <w:rPr>
+          <w:rFonts w:ascii="Arial" w:cs="Arial" w:eastAsia="Arial" w:hAnsi="Arial"/>
+          <w:b/>
+          <w:bCs/>
+          <w:color w:val="2E75B6"/>
+          <w:sz w:val="26"/>
+          <w:szCs w:val="26"/>
+        </w:rPr>
+        <w:t xml:space="preserve">Wazna obserwacja — Azure Arc zarzadza Gatekeeper</w:t>
+      </w:r>
+    </w:p>
+    <w:p>
+      <w:pPr>
+        <w:spacing w:after="80" w:before="80"/>
+      </w:pPr>
+      <w:r>
+        <w:rPr>
+          <w:rFonts w:ascii="Arial" w:cs="Arial" w:eastAsia="Arial" w:hAnsi="Arial"/>
+          <w:sz w:val="22"/>
+          <w:szCs w:val="22"/>
+        </w:rPr>
+        <w:t xml:space="preserve">W tym projekcie Gatekeeper jest instalowany i zarzadzany przez Azure Arc + Azure Policy addon. Tworzenie wlasnych ConstraintTemplate jest zablokowane przez webhook 'byovalidation.policy.azure.com'. To jest celowe zachowanie — centralny governance przez Azure Policy zamiast lokalnych polityk. W srodowisku bez Arc mozna tworzyc dowolne ConstraintTemplate w Rego.</w:t>
+      </w:r>
+    </w:p>
+    <w:p>
+      <w:pPr>
+        <w:spacing w:after="80" w:before="0"/>
+      </w:pPr>
+      <w:r>
+        <w:t xml:space="preserve"/>
+      </w:r>
+    </w:p>
+    <w:tbl>
+      <w:tblPr>
+        <w:tblW w:type="dxa" w:w="9360"/>
+        <w:tblBorders>
+          <w:top w:val="single" w:color="auto" w:sz="4"/>
+          <w:left w:val="single" w:color="auto" w:sz="4"/>
+          <w:bottom w:val="single" w:color="auto" w:sz="4"/>
+          <w:right w:val="single" w:color="auto" w:sz="4"/>
+          <w:insideH w:val="single" w:color="auto" w:sz="4"/>
+          <w:insideV w:val="single" w:color="auto" w:sz="4"/>
+        </w:tblBorders>
+      </w:tblPr>
+      <w:tblGrid>
+        <w:gridCol w:w="4680"/>
+        <w:gridCol w:w="4680"/>
+      </w:tblGrid>
+      <w:tr>
+        <w:tc>
+          <w:tcPr>
+            <w:tcW w:type="dxa" w:w="4680"/>
+            <w:tcBorders>
+              <w:top w:val="single" w:color="CCCCCC" w:sz="1"/>
+              <w:left w:val="single" w:color="CCCCCC" w:sz="1"/>
+              <w:bottom w:val="single" w:color="CCCCCC" w:sz="1"/>
+              <w:right w:val="single" w:color="CCCCCC" w:sz="1"/>
+            </w:tcBorders>
+            <w:shd w:fill="2E75B6" w:val="clear"/>
+            <w:tcMar>
+              <w:top w:type="dxa" w:w="80"/>
+              <w:left w:type="dxa" w:w="120"/>
+              <w:bottom w:type="dxa" w:w="80"/>
+              <w:right w:type="dxa" w:w="120"/>
+            </w:tcMar>
+          </w:tcPr>
+          <w:p>
+            <w:r>
+              <w:rPr>
+                <w:rFonts w:ascii="Arial" w:cs="Arial" w:eastAsia="Arial" w:hAnsi="Arial"/>
+                <w:b/>
+                <w:bCs/>
+                <w:color w:val="FFFFFF"/>
+                <w:sz w:val="22"/>
+                <w:szCs w:val="22"/>
+              </w:rPr>
+              <w:t xml:space="preserve">Silne strony</w:t>
+            </w:r>
+          </w:p>
+        </w:tc>
+        <w:tc>
+          <w:tcPr>
+            <w:tcW w:type="dxa" w:w="4680"/>
+            <w:tcBorders>
+              <w:top w:val="single" w:color="CCCCCC" w:sz="1"/>
+              <w:left w:val="single" w:color="CCCCCC" w:sz="1"/>
+              <w:bottom w:val="single" w:color="CCCCCC" w:sz="1"/>
+              <w:right w:val="single" w:color="CCCCCC" w:sz="1"/>
+            </w:tcBorders>
+            <w:shd w:fill="2E75B6" w:val="clear"/>
+            <w:tcMar>
+              <w:top w:type="dxa" w:w="80"/>
+              <w:left w:type="dxa" w:w="120"/>
+              <w:bottom w:type="dxa" w:w="80"/>
+              <w:right w:type="dxa" w:w="120"/>
+            </w:tcMar>
+          </w:tcPr>
+          <w:p>
+            <w:r>
+              <w:rPr>
+                <w:rFonts w:ascii="Arial" w:cs="Arial" w:eastAsia="Arial" w:hAnsi="Arial"/>
+                <w:b/>
+                <w:bCs/>
+                <w:color w:val="FFFFFF"/>
+                <w:sz w:val="22"/>
+                <w:szCs w:val="22"/>
+              </w:rPr>
+              <w:t xml:space="preserve">Slabe strony / typowe problemy</w:t>
+            </w:r>
+          </w:p>
+        </w:tc>
+      </w:tr>
+      <w:tr>
+        <w:tc>
+          <w:tcPr>
+            <w:tcW w:type="dxa" w:w="4680"/>
+            <w:tcBorders>
+              <w:top w:val="single" w:color="CCCCCC" w:sz="1"/>
+              <w:left w:val="single" w:color="CCCCCC" w:sz="1"/>
+              <w:bottom w:val="single" w:color="CCCCCC" w:sz="1"/>
+              <w:right w:val="single" w:color="CCCCCC" w:sz="1"/>
+            </w:tcBorders>
+            <w:tcMar>
+              <w:top w:type="dxa" w:w="80"/>
+              <w:left w:type="dxa" w:w="120"/>
+              <w:bottom w:type="dxa" w:w="80"/>
+              <w:right w:type="dxa" w:w="120"/>
+            </w:tcMar>
+          </w:tcPr>
+          <w:p>
+            <w:r>
+              <w:rPr>
+                <w:rFonts w:ascii="Arial" w:cs="Arial" w:eastAsia="Arial" w:hAnsi="Arial"/>
+                <w:sz w:val="20"/>
+                <w:szCs w:val="20"/>
+              </w:rPr>
+              <w:t xml:space="preserve">Blokuje naruszenia PRZED utworzeniem zasobu — nie po fakcie</w:t>
+            </w:r>
+          </w:p>
+        </w:tc>
+        <w:tc>
+          <w:tcPr>
+            <w:tcW w:type="dxa" w:w="4680"/>
+            <w:tcBorders>
+              <w:top w:val="single" w:color="CCCCCC" w:sz="1"/>
+              <w:left w:val="single" w:color="CCCCCC" w:sz="1"/>
+              <w:bottom w:val="single" w:color="CCCCCC" w:sz="1"/>
+              <w:right w:val="single" w:color="CCCCCC" w:sz="1"/>
+            </w:tcBorders>
+            <w:tcMar>
+              <w:top w:type="dxa" w:w="80"/>
+              <w:left w:type="dxa" w:w="120"/>
+              <w:bottom w:type="dxa" w:w="80"/>
+              <w:right w:type="dxa" w:w="120"/>
+            </w:tcMar>
+          </w:tcPr>
+          <w:p>
+            <w:r>
+              <w:rPr>
+                <w:rFonts w:ascii="Arial" w:cs="Arial" w:eastAsia="Arial" w:hAnsi="Arial"/>
+                <w:sz w:val="20"/>
+                <w:szCs w:val="20"/>
+              </w:rPr>
+              <w:t xml:space="preserve">Krzywa uczenia Rego — jezyk polityk wymaga nauki</w:t>
+            </w:r>
+          </w:p>
+        </w:tc>
+      </w:tr>
+      <w:tr>
+        <w:tc>
+          <w:tcPr>
+            <w:tcW w:type="dxa" w:w="4680"/>
+            <w:tcBorders>
+              <w:top w:val="single" w:color="CCCCCC" w:sz="1"/>
+              <w:left w:val="single" w:color="CCCCCC" w:sz="1"/>
+              <w:bottom w:val="single" w:color="CCCCCC" w:sz="1"/>
+              <w:right w:val="single" w:color="CCCCCC" w:sz="1"/>
+            </w:tcBorders>
+            <w:tcMar>
+              <w:top w:type="dxa" w:w="80"/>
+              <w:left w:type="dxa" w:w="120"/>
+              <w:bottom w:type="dxa" w:w="80"/>
+              <w:right w:type="dxa" w:w="120"/>
+            </w:tcMar>
+          </w:tcPr>
+          <w:p>
+            <w:r>
+              <w:rPr>
+                <w:rFonts w:ascii="Arial" w:cs="Arial" w:eastAsia="Arial" w:hAnsi="Arial"/>
+                <w:sz w:val="20"/>
+                <w:szCs w:val="20"/>
+              </w:rPr>
+              <w:t xml:space="preserve">Audit mode — wykrywa naruszenia bez blokowania istniejacych zasobow</w:t>
+            </w:r>
+          </w:p>
+        </w:tc>
+        <w:tc>
+          <w:tcPr>
+            <w:tcW w:type="dxa" w:w="4680"/>
+            <w:tcBorders>
+              <w:top w:val="single" w:color="CCCCCC" w:sz="1"/>
+              <w:left w:val="single" w:color="CCCCCC" w:sz="1"/>
+              <w:bottom w:val="single" w:color="CCCCCC" w:sz="1"/>
+              <w:right w:val="single" w:color="CCCCCC" w:sz="1"/>
+            </w:tcBorders>
+            <w:tcMar>
+              <w:top w:type="dxa" w:w="80"/>
+              <w:left w:type="dxa" w:w="120"/>
+              <w:bottom w:type="dxa" w:w="80"/>
+              <w:right w:type="dxa" w:w="120"/>
+            </w:tcMar>
+          </w:tcPr>
+          <w:p>
+            <w:r>
+              <w:rPr>
+                <w:rFonts w:ascii="Arial" w:cs="Arial" w:eastAsia="Arial" w:hAnsi="Arial"/>
+                <w:sz w:val="20"/>
+                <w:szCs w:val="20"/>
+              </w:rPr>
+              <w:t xml:space="preserve">Webhook latency — kazdy zasob przechodzi przez Gatekeeper (ms overhead)</w:t>
+            </w:r>
+          </w:p>
+        </w:tc>
+      </w:tr>
+      <w:tr>
+        <w:tc>
+          <w:tcPr>
+            <w:tcW w:type="dxa" w:w="4680"/>
+            <w:tcBorders>
+              <w:top w:val="single" w:color="CCCCCC" w:sz="1"/>
+              <w:left w:val="single" w:color="CCCCCC" w:sz="1"/>
+              <w:bottom w:val="single" w:color="CCCCCC" w:sz="1"/>
+              <w:right w:val="single" w:color="CCCCCC" w:sz="1"/>
+            </w:tcBorders>
+            <w:tcMar>
+              <w:top w:type="dxa" w:w="80"/>
+              <w:left w:type="dxa" w:w="120"/>
+              <w:bottom w:type="dxa" w:w="80"/>
+              <w:right w:type="dxa" w:w="120"/>
+            </w:tcMar>
+          </w:tcPr>
+          <w:p>
+            <w:r>
+              <w:rPr>
+                <w:rFonts w:ascii="Arial" w:cs="Arial" w:eastAsia="Arial" w:hAnsi="Arial"/>
+                <w:sz w:val="20"/>
+                <w:szCs w:val="20"/>
+              </w:rPr>
+              <w:t xml:space="preserve">Policy as Code — polityki w YAML/Rego, wersjonowane w Git</w:t>
+            </w:r>
+          </w:p>
+        </w:tc>
+        <w:tc>
+          <w:tcPr>
+            <w:tcW w:type="dxa" w:w="4680"/>
+            <w:tcBorders>
+              <w:top w:val="single" w:color="CCCCCC" w:sz="1"/>
+              <w:left w:val="single" w:color="CCCCCC" w:sz="1"/>
+              <w:bottom w:val="single" w:color="CCCCCC" w:sz="1"/>
+              <w:right w:val="single" w:color="CCCCCC" w:sz="1"/>
+            </w:tcBorders>
+            <w:tcMar>
+              <w:top w:type="dxa" w:w="80"/>
+              <w:left w:type="dxa" w:w="120"/>
+              <w:bottom w:type="dxa" w:w="80"/>
+              <w:right w:type="dxa" w:w="120"/>
+            </w:tcMar>
+          </w:tcPr>
+          <w:p>
+            <w:r>
+              <w:rPr>
+                <w:rFonts w:ascii="Arial" w:cs="Arial" w:eastAsia="Arial" w:hAnsi="Arial"/>
+                <w:sz w:val="20"/>
+                <w:szCs w:val="20"/>
+              </w:rPr>
+              <w:t xml:space="preserve">W trybie Azure Arc: brak mozliwosci tworzenia wlasnych ConstraintTemplate</w:t>
+            </w:r>
+          </w:p>
+        </w:tc>
+      </w:tr>
+      <w:tr>
+        <w:tc>
+          <w:tcPr>
+            <w:tcW w:type="dxa" w:w="4680"/>
+            <w:tcBorders>
+              <w:top w:val="single" w:color="CCCCCC" w:sz="1"/>
+              <w:left w:val="single" w:color="CCCCCC" w:sz="1"/>
+              <w:bottom w:val="single" w:color="CCCCCC" w:sz="1"/>
+              <w:right w:val="single" w:color="CCCCCC" w:sz="1"/>
+            </w:tcBorders>
+            <w:tcMar>
+              <w:top w:type="dxa" w:w="80"/>
+              <w:left w:type="dxa" w:w="120"/>
+              <w:bottom w:type="dxa" w:w="80"/>
+              <w:right w:type="dxa" w:w="120"/>
+            </w:tcMar>
+          </w:tcPr>
+          <w:p>
+            <w:r>
+              <w:rPr>
+                <w:rFonts w:ascii="Arial" w:cs="Arial" w:eastAsia="Arial" w:hAnsi="Arial"/>
+                <w:sz w:val="20"/>
+                <w:szCs w:val="20"/>
+              </w:rPr>
+              <w:t xml:space="preserve">Integracja z Azure Arc — centralne zarzadzanie przez Azure Policy</w:t>
+            </w:r>
+          </w:p>
+        </w:tc>
+        <w:tc>
+          <w:tcPr>
+            <w:tcW w:type="dxa" w:w="4680"/>
+            <w:tcBorders>
+              <w:top w:val="single" w:color="CCCCCC" w:sz="1"/>
+              <w:left w:val="single" w:color="CCCCCC" w:sz="1"/>
+              <w:bottom w:val="single" w:color="CCCCCC" w:sz="1"/>
+              <w:right w:val="single" w:color="CCCCCC" w:sz="1"/>
+            </w:tcBorders>
+            <w:tcMar>
+              <w:top w:type="dxa" w:w="80"/>
+              <w:left w:type="dxa" w:w="120"/>
+              <w:bottom w:type="dxa" w:w="80"/>
+              <w:right w:type="dxa" w:w="120"/>
+            </w:tcMar>
+          </w:tcPr>
+          <w:p>
+            <w:r>
+              <w:rPr>
+                <w:rFonts w:ascii="Arial" w:cs="Arial" w:eastAsia="Arial" w:hAnsi="Arial"/>
+                <w:sz w:val="20"/>
+                <w:szCs w:val="20"/>
+              </w:rPr>
+              <w:t xml:space="preserve">Trudny debugging — odrzucony zasob moze nie miec jasnego komunikatu bledu</w:t>
+            </w:r>
+          </w:p>
+        </w:tc>
+      </w:tr>
+    </w:tbl>
+    <w:p>
+      <w:r>
+        <w:br w:type="page"/>
+      </w:r>
+    </w:p>
+    <w:p>
+      <w:pPr>
+        <w:pStyle w:val="Heading1"/>
+        <w:spacing w:after="200" w:before="400"/>
+      </w:pPr>
+      <w:r>
+        <w:rPr>
+          <w:rFonts w:ascii="Arial" w:cs="Arial" w:eastAsia="Arial" w:hAnsi="Arial"/>
+          <w:b/>
+          <w:bCs/>
+          <w:color w:val="1F4E79"/>
+          <w:sz w:val="32"/>
+          <w:szCs w:val="32"/>
+        </w:rPr>
+        <w:t xml:space="preserve">Rozdzial 24: Chaos Engineering — Chaos Mesh</w:t>
+      </w:r>
+    </w:p>
+    <w:p>
+      <w:pPr>
+        <w:pStyle w:val="Heading2"/>
+        <w:spacing w:after="140" w:before="280"/>
+      </w:pPr>
+      <w:r>
+        <w:rPr>
+          <w:rFonts w:ascii="Arial" w:cs="Arial" w:eastAsia="Arial" w:hAnsi="Arial"/>
+          <w:b/>
+          <w:bCs/>
+          <w:color w:val="2E75B6"/>
+          <w:sz w:val="26"/>
+          <w:szCs w:val="26"/>
+        </w:rPr>
+        <w:t xml:space="preserve">Co to jest</w:t>
+      </w:r>
+    </w:p>
+    <w:p>
+      <w:pPr>
+        <w:spacing w:after="80" w:before="80"/>
+      </w:pPr>
+      <w:r>
+        <w:rPr>
+          <w:rFonts w:ascii="Arial" w:cs="Arial" w:eastAsia="Arial" w:hAnsi="Arial"/>
+          <w:sz w:val="22"/>
+          <w:szCs w:val="22"/>
+        </w:rPr>
+        <w:t xml:space="preserve">Chaos Engineering to praktyka celowego wprowadzania awarii do systemu produkcyjnego (lub jego repliki) w celu weryfikacji odpornosci. Filozofia SRE: 'hope is not a strategy' — zamiast miec nadzieje ze system przezyje awarie, udowadniamy to eksperymentem. Chaos Mesh to platforma Chaos Engineering dla Kubernetes.</w:t>
+      </w:r>
+    </w:p>
+    <w:p>
+      <w:pPr>
+        <w:spacing w:after="80" w:before="0"/>
+      </w:pPr>
+      <w:r>
+        <w:t xml:space="preserve"/>
+      </w:r>
+    </w:p>
+    <w:tbl>
+      <w:tblPr>
+        <w:tblW w:type="dxa" w:w="9360"/>
+        <w:tblBorders>
+          <w:top w:val="single" w:color="auto" w:sz="4"/>
+          <w:left w:val="single" w:color="auto" w:sz="4"/>
+          <w:bottom w:val="single" w:color="auto" w:sz="4"/>
+          <w:right w:val="single" w:color="auto" w:sz="4"/>
+          <w:insideH w:val="single" w:color="auto" w:sz="4"/>
+          <w:insideV w:val="single" w:color="auto" w:sz="4"/>
+        </w:tblBorders>
+      </w:tblPr>
+      <w:tblGrid>
+        <w:gridCol w:w="9360"/>
+      </w:tblGrid>
+      <w:tr>
+        <w:tc>
+          <w:tcPr>
+            <w:tcW w:type="dxa" w:w="9360"/>
+            <w:tcBorders>
+              <w:top w:val="single" w:color="CCCCCC" w:sz="1"/>
+              <w:left w:val="single" w:color="CCCCCC" w:sz="1"/>
+              <w:bottom w:val="single" w:color="CCCCCC" w:sz="1"/>
+              <w:right w:val="single" w:color="CCCCCC" w:sz="1"/>
+            </w:tcBorders>
+            <w:shd w:fill="D5E8F0" w:val="clear"/>
+            <w:tcMar>
+              <w:top w:type="dxa" w:w="120"/>
+              <w:left w:type="dxa" w:w="200"/>
+              <w:bottom w:type="dxa" w:w="120"/>
+              <w:right w:type="dxa" w:w="200"/>
+            </w:tcMar>
+          </w:tcPr>
+          <w:p>
+            <w:pPr>
+              <w:spacing w:after="0" w:before="0"/>
+            </w:pPr>
+            <w:r>
+              <w:rPr>
+                <w:rFonts w:ascii="Arial" w:cs="Arial" w:eastAsia="Arial" w:hAnsi="Arial"/>
+                <w:b/>
+                <w:bCs/>
+                <w:color w:val="1F4E79"/>
+                <w:sz w:val="22"/>
+                <w:szCs w:val="22"/>
+              </w:rPr>
+              <w:t xml:space="preserve">Analogia: </w:t>
+            </w:r>
+            <w:r>
+              <w:rPr>
+                <w:rFonts w:ascii="Arial" w:cs="Arial" w:eastAsia="Arial" w:hAnsi="Arial"/>
+                <w:i/>
+                <w:iCs/>
+                <w:color w:val="000000"/>
+                <w:sz w:val="22"/>
+                <w:szCs w:val="22"/>
+              </w:rPr>
+              <w:t xml:space="preserve">Cwiczenia przeciwpozarowe — Firma nie czeka na prawdziwy pozar zeby sprawdzic czy ewakuacja dziala. Robi cwiczenia — kontrolowany chaos w bezpiecznych warunkach. Chaos Mesh to cwiczenia przeciwpozarowe dla klastra Kubernetes: zabijamy Pody, symulujemy awarie sieci, przeciazamy CPU — i sprawdzamy czy system sie regeneruje.</w:t>
+            </w:r>
+          </w:p>
+        </w:tc>
+      </w:tr>
+    </w:tbl>
+    <w:p>
+      <w:pPr>
+        <w:spacing w:after="80" w:before="0"/>
+      </w:pPr>
+      <w:r>
+        <w:t xml:space="preserve"/>
+      </w:r>
+    </w:p>
+    <w:p>
+      <w:pPr>
+        <w:pStyle w:val="Heading2"/>
+        <w:spacing w:after="140" w:before="280"/>
+      </w:pPr>
+      <w:r>
+        <w:rPr>
+          <w:rFonts w:ascii="Arial" w:cs="Arial" w:eastAsia="Arial" w:hAnsi="Arial"/>
+          <w:b/>
+          <w:bCs/>
+          <w:color w:val="2E75B6"/>
+          <w:sz w:val="26"/>
+          <w:szCs w:val="26"/>
+        </w:rPr>
+        <w:t xml:space="preserve">Co zrobilimy</w:t>
+      </w:r>
+    </w:p>
+    <w:p>
+      <w:pPr>
+        <w:pStyle w:val="ListParagraph"/>
+        <w:numPr>
+          <w:ilvl w:val="0"/>
+          <w:numId w:val="2"/>
+        </w:numPr>
+        <w:spacing w:after="60" w:before="60"/>
+      </w:pPr>
+      <w:r>
+        <w:rPr>
+          <w:rFonts w:ascii="Arial" w:cs="Arial" w:eastAsia="Arial" w:hAnsi="Arial"/>
+          <w:sz w:val="22"/>
+          <w:szCs w:val="22"/>
+        </w:rPr>
+        <w:t xml:space="preserve">Zainstalowalismy Chaos Mesh przez Helm z konfiguracja dla K3s containerd runtime</w:t>
+      </w:r>
+    </w:p>
+    <w:p>
+      <w:pPr>
+        <w:pStyle w:val="ListParagraph"/>
+        <w:numPr>
+          <w:ilvl w:val="0"/>
+          <w:numId w:val="2"/>
+        </w:numPr>
+        <w:spacing w:after="60" w:before="60"/>
+      </w:pPr>
+      <w:r>
+        <w:rPr>
+          <w:rFonts w:ascii="Arial" w:cs="Arial" w:eastAsia="Arial" w:hAnsi="Arial"/>
+          <w:sz w:val="22"/>
+          <w:szCs w:val="22"/>
+        </w:rPr>
+        <w:t xml:space="preserve">8 podow: 3x chaos-controller-manager, 3x chaos-daemon (DaemonSet), chaos-dashboard, chaos-dns-server</w:t>
+      </w:r>
+    </w:p>
+    <w:p>
+      <w:pPr>
+        <w:pStyle w:val="ListParagraph"/>
+        <w:numPr>
+          <w:ilvl w:val="0"/>
+          <w:numId w:val="2"/>
+        </w:numPr>
+        <w:spacing w:after="60" w:before="60"/>
+      </w:pPr>
+      <w:r>
+        <w:rPr>
+          <w:rFonts w:ascii="Arial" w:cs="Arial" w:eastAsia="Arial" w:hAnsi="Arial"/>
+          <w:sz w:val="22"/>
+          <w:szCs w:val="22"/>
+        </w:rPr>
+        <w:t xml:space="preserve">Eksperyment PodChaos: pod-kill co 30 sekund, tryb 'one' (jeden losowy Pod)</w:t>
+      </w:r>
+    </w:p>
+    <w:p>
+      <w:pPr>
+        <w:pStyle w:val="ListParagraph"/>
+        <w:numPr>
+          <w:ilvl w:val="0"/>
+          <w:numId w:val="2"/>
+        </w:numPr>
+        <w:spacing w:after="60" w:before="60"/>
+      </w:pPr>
+      <w:r>
+        <w:rPr>
+          <w:rFonts w:ascii="Arial" w:cs="Arial" w:eastAsia="Arial" w:hAnsi="Arial"/>
+          <w:sz w:val="22"/>
+          <w:szCs w:val="22"/>
+        </w:rPr>
+        <w:t xml:space="preserve">Wynik: Kubernetes zastepuje zabite Pody w ciagu 3-5 sekund — zero downtime</w:t>
+      </w:r>
+    </w:p>
+    <w:p>
+      <w:pPr>
+        <w:pStyle w:val="ListParagraph"/>
+        <w:numPr>
+          <w:ilvl w:val="0"/>
+          <w:numId w:val="2"/>
+        </w:numPr>
+        <w:spacing w:after="60" w:before="60"/>
+      </w:pPr>
+      <w:r>
+        <w:rPr>
+          <w:rFonts w:ascii="Arial" w:cs="Arial" w:eastAsia="Arial" w:hAnsi="Arial"/>
+          <w:sz w:val="22"/>
+          <w:szCs w:val="22"/>
+        </w:rPr>
+        <w:t xml:space="preserve">Obserwacja: nowe Pody maja AGE kilku sekund podczas gdy stary Pod ma AGE 10d — system self-healing dziala</w:t>
+      </w:r>
+    </w:p>
+    <w:p>
+      <w:pPr>
+        <w:spacing w:after="80" w:before="0"/>
+      </w:pPr>
+      <w:r>
+        <w:t xml:space="preserve"/>
+      </w:r>
+    </w:p>
+    <w:tbl>
+      <w:tblPr>
+        <w:tblW w:type="dxa" w:w="9360"/>
+        <w:tblBorders>
+          <w:top w:val="single" w:color="auto" w:sz="4"/>
+          <w:left w:val="single" w:color="auto" w:sz="4"/>
+          <w:bottom w:val="single" w:color="auto" w:sz="4"/>
+          <w:right w:val="single" w:color="auto" w:sz="4"/>
+          <w:insideH w:val="single" w:color="auto" w:sz="4"/>
+          <w:insideV w:val="single" w:color="auto" w:sz="4"/>
+        </w:tblBorders>
+      </w:tblPr>
+      <w:tblGrid>
+        <w:gridCol w:w="9360"/>
+      </w:tblGrid>
+      <w:tr>
+        <w:tc>
+          <w:tcPr>
+            <w:tcW w:type="dxa" w:w="9360"/>
+            <w:tcBorders>
+              <w:top w:val="single" w:color="CCCCCC" w:sz="1"/>
+              <w:left w:val="single" w:color="CCCCCC" w:sz="1"/>
+              <w:bottom w:val="single" w:color="CCCCCC" w:sz="1"/>
+              <w:right w:val="single" w:color="CCCCCC" w:sz="1"/>
+            </w:tcBorders>
+            <w:shd w:fill="F2F2F2" w:val="clear"/>
+            <w:tcMar>
+              <w:top w:type="dxa" w:w="120"/>
+              <w:left w:type="dxa" w:w="200"/>
+              <w:bottom w:type="dxa" w:w="120"/>
+              <w:right w:type="dxa" w:w="200"/>
+            </w:tcMar>
+          </w:tcPr>
+          <w:p>
+            <w:pPr>
+              <w:spacing w:after="0" w:before="0"/>
+            </w:pPr>
+            <w:r>
+              <w:rPr>
+                <w:rFonts w:ascii="Arial" w:cs="Arial" w:eastAsia="Arial" w:hAnsi="Arial"/>
+                <w:b/>
+                <w:bCs/>
+                <w:sz w:val="22"/>
+                <w:szCs w:val="22"/>
+              </w:rPr>
+              <w:t xml:space="preserve">Wynik w projekcie: </w:t>
+            </w:r>
+            <w:r>
+              <w:rPr>
+                <w:rFonts w:ascii="Arial" w:cs="Arial" w:eastAsia="Arial" w:hAnsi="Arial"/>
+                <w:sz w:val="22"/>
+                <w:szCs w:val="22"/>
+              </w:rPr>
+              <w:t xml:space="preserve"># Podczas chaos experiment (Schedule @every 30s):
+kubectl get pods -n default | grep aras
+aras-demo-app-5b58b48d6d-spwkm   1/1  Running  1  10d   &lt;- ocalaly
+aras-demo-f5c768d7c-gsbhm         1/1  Running  0  13s   &lt;- nowy po zabiciu
+aras-demo-f5c768d7c-45ksd         1/1  Running  0  7s    &lt;- kolejny nowy
+aras-demo-f5c768d7c-xjzmm         0/1  Running  0  5s    &lt;- wlasnie tworzony
+# Po zatrzymaniu chaosu:
+kubectl delete schedule aras-demo-schedule -n default
+# Klaster wraca do stabilnego stanu: 2 repliki Running</w:t>
+            </w:r>
+          </w:p>
+        </w:tc>
+      </w:tr>
+    </w:tbl>
+    <w:p>
+      <w:pPr>
+        <w:spacing w:after="80" w:before="0"/>
+      </w:pPr>
+      <w:r>
+        <w:t xml:space="preserve"/>
+      </w:r>
+    </w:p>
+    <w:p>
+      <w:pPr>
+        <w:pStyle w:val="Heading2"/>
+        <w:spacing w:after="140" w:before="280"/>
+      </w:pPr>
+      <w:r>
+        <w:rPr>
+          <w:rFonts w:ascii="Arial" w:cs="Arial" w:eastAsia="Arial" w:hAnsi="Arial"/>
+          <w:b/>
+          <w:bCs/>
+          <w:color w:val="2E75B6"/>
+          <w:sz w:val="26"/>
+          <w:szCs w:val="26"/>
+        </w:rPr>
+        <w:t xml:space="preserve">Rodzaje eksperymentow Chaos Mesh</w:t>
+      </w:r>
+    </w:p>
+    <w:p>
+      <w:pPr>
+        <w:pStyle w:val="ListParagraph"/>
+        <w:numPr>
+          <w:ilvl w:val="0"/>
+          <w:numId w:val="2"/>
+        </w:numPr>
+        <w:spacing w:after="60" w:before="60"/>
+      </w:pPr>
+      <w:r>
+        <w:rPr>
+          <w:rFonts w:ascii="Arial" w:cs="Arial" w:eastAsia="Arial" w:hAnsi="Arial"/>
+          <w:sz w:val="22"/>
+          <w:szCs w:val="22"/>
+        </w:rPr>
+        <w:t xml:space="preserve">PodChaos — zabijanie Podow, restart kontenerow, kill procesu</w:t>
+      </w:r>
+    </w:p>
+    <w:p>
+      <w:pPr>
+        <w:pStyle w:val="ListParagraph"/>
+        <w:numPr>
+          <w:ilvl w:val="0"/>
+          <w:numId w:val="2"/>
+        </w:numPr>
+        <w:spacing w:after="60" w:before="60"/>
+      </w:pPr>
+      <w:r>
+        <w:rPr>
+          <w:rFonts w:ascii="Arial" w:cs="Arial" w:eastAsia="Arial" w:hAnsi="Arial"/>
+          <w:sz w:val="22"/>
+          <w:szCs w:val="22"/>
+        </w:rPr>
+        <w:t xml:space="preserve">NetworkChaos — opoznienie pakietow (latency), utrata pakietow (packet loss), duplikacja, partycja sieci</w:t>
+      </w:r>
+    </w:p>
+    <w:p>
+      <w:pPr>
+        <w:pStyle w:val="ListParagraph"/>
+        <w:numPr>
+          <w:ilvl w:val="0"/>
+          <w:numId w:val="2"/>
+        </w:numPr>
+        <w:spacing w:after="60" w:before="60"/>
+      </w:pPr>
+      <w:r>
+        <w:rPr>
+          <w:rFonts w:ascii="Arial" w:cs="Arial" w:eastAsia="Arial" w:hAnsi="Arial"/>
+          <w:sz w:val="22"/>
+          <w:szCs w:val="22"/>
+        </w:rPr>
+        <w:t xml:space="preserve">StressChaos — przeciazenie CPU i pamieci na wybranych Podach</w:t>
+      </w:r>
+    </w:p>
+    <w:p>
+      <w:pPr>
+        <w:pStyle w:val="ListParagraph"/>
+        <w:numPr>
+          <w:ilvl w:val="0"/>
+          <w:numId w:val="2"/>
+        </w:numPr>
+        <w:spacing w:after="60" w:before="60"/>
+      </w:pPr>
+      <w:r>
+        <w:rPr>
+          <w:rFonts w:ascii="Arial" w:cs="Arial" w:eastAsia="Arial" w:hAnsi="Arial"/>
+          <w:sz w:val="22"/>
+          <w:szCs w:val="22"/>
+        </w:rPr>
+        <w:t xml:space="preserve">IOChaos — opoznienie operacji I/O, bledy odczytu/zapisu na dysku</w:t>
+      </w:r>
+    </w:p>
+    <w:p>
+      <w:pPr>
+        <w:pStyle w:val="ListParagraph"/>
+        <w:numPr>
+          <w:ilvl w:val="0"/>
+          <w:numId w:val="2"/>
+        </w:numPr>
+        <w:spacing w:after="60" w:before="60"/>
+      </w:pPr>
+      <w:r>
+        <w:rPr>
+          <w:rFonts w:ascii="Arial" w:cs="Arial" w:eastAsia="Arial" w:hAnsi="Arial"/>
+          <w:sz w:val="22"/>
+          <w:szCs w:val="22"/>
+        </w:rPr>
+        <w:t xml:space="preserve">HTTPChaos — bledy HTTP, opoznienia requestow, modyfikacja odpowiedzi</w:t>
+      </w:r>
+    </w:p>
+    <w:p>
+      <w:pPr>
+        <w:spacing w:after="80" w:before="0"/>
+      </w:pPr>
+      <w:r>
+        <w:t xml:space="preserve"/>
+      </w:r>
+    </w:p>
+    <w:tbl>
+      <w:tblPr>
+        <w:tblW w:type="dxa" w:w="9360"/>
+        <w:tblBorders>
+          <w:top w:val="single" w:color="auto" w:sz="4"/>
+          <w:left w:val="single" w:color="auto" w:sz="4"/>
+          <w:bottom w:val="single" w:color="auto" w:sz="4"/>
+          <w:right w:val="single" w:color="auto" w:sz="4"/>
+          <w:insideH w:val="single" w:color="auto" w:sz="4"/>
+          <w:insideV w:val="single" w:color="auto" w:sz="4"/>
+        </w:tblBorders>
+      </w:tblPr>
+      <w:tblGrid>
+        <w:gridCol w:w="4680"/>
+        <w:gridCol w:w="4680"/>
+      </w:tblGrid>
+      <w:tr>
+        <w:tc>
+          <w:tcPr>
+            <w:tcW w:type="dxa" w:w="4680"/>
+            <w:tcBorders>
+              <w:top w:val="single" w:color="CCCCCC" w:sz="1"/>
+              <w:left w:val="single" w:color="CCCCCC" w:sz="1"/>
+              <w:bottom w:val="single" w:color="CCCCCC" w:sz="1"/>
+              <w:right w:val="single" w:color="CCCCCC" w:sz="1"/>
+            </w:tcBorders>
+            <w:shd w:fill="2E75B6" w:val="clear"/>
+            <w:tcMar>
+              <w:top w:type="dxa" w:w="80"/>
+              <w:left w:type="dxa" w:w="120"/>
+              <w:bottom w:type="dxa" w:w="80"/>
+              <w:right w:type="dxa" w:w="120"/>
+            </w:tcMar>
+          </w:tcPr>
+          <w:p>
+            <w:r>
+              <w:rPr>
+                <w:rFonts w:ascii="Arial" w:cs="Arial" w:eastAsia="Arial" w:hAnsi="Arial"/>
+                <w:b/>
+                <w:bCs/>
+                <w:color w:val="FFFFFF"/>
+                <w:sz w:val="22"/>
+                <w:szCs w:val="22"/>
+              </w:rPr>
+              <w:t xml:space="preserve">Silne strony</w:t>
+            </w:r>
+          </w:p>
+        </w:tc>
+        <w:tc>
+          <w:tcPr>
+            <w:tcW w:type="dxa" w:w="4680"/>
+            <w:tcBorders>
+              <w:top w:val="single" w:color="CCCCCC" w:sz="1"/>
+              <w:left w:val="single" w:color="CCCCCC" w:sz="1"/>
+              <w:bottom w:val="single" w:color="CCCCCC" w:sz="1"/>
+              <w:right w:val="single" w:color="CCCCCC" w:sz="1"/>
+            </w:tcBorders>
+            <w:shd w:fill="2E75B6" w:val="clear"/>
+            <w:tcMar>
+              <w:top w:type="dxa" w:w="80"/>
+              <w:left w:type="dxa" w:w="120"/>
+              <w:bottom w:type="dxa" w:w="80"/>
+              <w:right w:type="dxa" w:w="120"/>
+            </w:tcMar>
+          </w:tcPr>
+          <w:p>
+            <w:r>
+              <w:rPr>
+                <w:rFonts w:ascii="Arial" w:cs="Arial" w:eastAsia="Arial" w:hAnsi="Arial"/>
+                <w:b/>
+                <w:bCs/>
+                <w:color w:val="FFFFFF"/>
+                <w:sz w:val="22"/>
+                <w:szCs w:val="22"/>
+              </w:rPr>
+              <w:t xml:space="preserve">Slabe strony / typowe problemy</w:t>
+            </w:r>
+          </w:p>
+        </w:tc>
+      </w:tr>
+      <w:tr>
+        <w:tc>
+          <w:tcPr>
+            <w:tcW w:type="dxa" w:w="4680"/>
+            <w:tcBorders>
+              <w:top w:val="single" w:color="CCCCCC" w:sz="1"/>
+              <w:left w:val="single" w:color="CCCCCC" w:sz="1"/>
+              <w:bottom w:val="single" w:color="CCCCCC" w:sz="1"/>
+              <w:right w:val="single" w:color="CCCCCC" w:sz="1"/>
+            </w:tcBorders>
+            <w:tcMar>
+              <w:top w:type="dxa" w:w="80"/>
+              <w:left w:type="dxa" w:w="120"/>
+              <w:bottom w:type="dxa" w:w="80"/>
+              <w:right w:type="dxa" w:w="120"/>
+            </w:tcMar>
+          </w:tcPr>
+          <w:p>
+            <w:r>
+              <w:rPr>
+                <w:rFonts w:ascii="Arial" w:cs="Arial" w:eastAsia="Arial" w:hAnsi="Arial"/>
+                <w:sz w:val="20"/>
+                <w:szCs w:val="20"/>
+              </w:rPr>
+              <w:t xml:space="preserve">Udowadnia odpornosc systemu zamiast zakladac ja</w:t>
+            </w:r>
+          </w:p>
+        </w:tc>
+        <w:tc>
+          <w:tcPr>
+            <w:tcW w:type="dxa" w:w="4680"/>
+            <w:tcBorders>
+              <w:top w:val="single" w:color="CCCCCC" w:sz="1"/>
+              <w:left w:val="single" w:color="CCCCCC" w:sz="1"/>
+              <w:bottom w:val="single" w:color="CCCCCC" w:sz="1"/>
+              <w:right w:val="single" w:color="CCCCCC" w:sz="1"/>
+            </w:tcBorders>
+            <w:tcMar>
+              <w:top w:type="dxa" w:w="80"/>
+              <w:left w:type="dxa" w:w="120"/>
+              <w:bottom w:type="dxa" w:w="80"/>
+              <w:right w:type="dxa" w:w="120"/>
+            </w:tcMar>
+          </w:tcPr>
+          <w:p>
+            <w:r>
+              <w:rPr>
+                <w:rFonts w:ascii="Arial" w:cs="Arial" w:eastAsia="Arial" w:hAnsi="Arial"/>
+                <w:sz w:val="20"/>
+                <w:szCs w:val="20"/>
+              </w:rPr>
+              <w:t xml:space="preserve">Wymaga dokladnego planowania — chaos na produkcji bez planowania to katastrofa</w:t>
+            </w:r>
+          </w:p>
+        </w:tc>
+      </w:tr>
+      <w:tr>
+        <w:tc>
+          <w:tcPr>
+            <w:tcW w:type="dxa" w:w="4680"/>
+            <w:tcBorders>
+              <w:top w:val="single" w:color="CCCCCC" w:sz="1"/>
+              <w:left w:val="single" w:color="CCCCCC" w:sz="1"/>
+              <w:bottom w:val="single" w:color="CCCCCC" w:sz="1"/>
+              <w:right w:val="single" w:color="CCCCCC" w:sz="1"/>
+            </w:tcBorders>
+            <w:tcMar>
+              <w:top w:type="dxa" w:w="80"/>
+              <w:left w:type="dxa" w:w="120"/>
+              <w:bottom w:type="dxa" w:w="80"/>
+              <w:right w:type="dxa" w:w="120"/>
+            </w:tcMar>
+          </w:tcPr>
+          <w:p>
+            <w:r>
+              <w:rPr>
+                <w:rFonts w:ascii="Arial" w:cs="Arial" w:eastAsia="Arial" w:hAnsi="Arial"/>
+                <w:sz w:val="20"/>
+                <w:szCs w:val="20"/>
+              </w:rPr>
+              <w:t xml:space="preserve">Wiele typow eksperymentow — siec, CPU, pamiec, I/O, HTTP</w:t>
+            </w:r>
+          </w:p>
+        </w:tc>
+        <w:tc>
+          <w:tcPr>
+            <w:tcW w:type="dxa" w:w="4680"/>
+            <w:tcBorders>
+              <w:top w:val="single" w:color="CCCCCC" w:sz="1"/>
+              <w:left w:val="single" w:color="CCCCCC" w:sz="1"/>
+              <w:bottom w:val="single" w:color="CCCCCC" w:sz="1"/>
+              <w:right w:val="single" w:color="CCCCCC" w:sz="1"/>
+            </w:tcBorders>
+            <w:tcMar>
+              <w:top w:type="dxa" w:w="80"/>
+              <w:left w:type="dxa" w:w="120"/>
+              <w:bottom w:type="dxa" w:w="80"/>
+              <w:right w:type="dxa" w:w="120"/>
+            </w:tcMar>
+          </w:tcPr>
+          <w:p>
+            <w:r>
+              <w:rPr>
+                <w:rFonts w:ascii="Arial" w:cs="Arial" w:eastAsia="Arial" w:hAnsi="Arial"/>
+                <w:sz w:val="20"/>
+                <w:szCs w:val="20"/>
+              </w:rPr>
+              <w:t xml:space="preserve">K3s wymaga specjalnej konfiguracji (containerd socket path)</w:t>
+            </w:r>
+          </w:p>
+        </w:tc>
+      </w:tr>
+      <w:tr>
+        <w:tc>
+          <w:tcPr>
+            <w:tcW w:type="dxa" w:w="4680"/>
+            <w:tcBorders>
+              <w:top w:val="single" w:color="CCCCCC" w:sz="1"/>
+              <w:left w:val="single" w:color="CCCCCC" w:sz="1"/>
+              <w:bottom w:val="single" w:color="CCCCCC" w:sz="1"/>
+              <w:right w:val="single" w:color="CCCCCC" w:sz="1"/>
+            </w:tcBorders>
+            <w:tcMar>
+              <w:top w:type="dxa" w:w="80"/>
+              <w:left w:type="dxa" w:w="120"/>
+              <w:bottom w:type="dxa" w:w="80"/>
+              <w:right w:type="dxa" w:w="120"/>
+            </w:tcMar>
+          </w:tcPr>
+          <w:p>
+            <w:r>
+              <w:rPr>
+                <w:rFonts w:ascii="Arial" w:cs="Arial" w:eastAsia="Arial" w:hAnsi="Arial"/>
+                <w:sz w:val="20"/>
+                <w:szCs w:val="20"/>
+              </w:rPr>
+              <w:t xml:space="preserve">Harmonogram eksperymentow (Schedule) — automatyczne powtarzanie</w:t>
+            </w:r>
+          </w:p>
+        </w:tc>
+        <w:tc>
+          <w:tcPr>
+            <w:tcW w:type="dxa" w:w="4680"/>
+            <w:tcBorders>
+              <w:top w:val="single" w:color="CCCCCC" w:sz="1"/>
+              <w:left w:val="single" w:color="CCCCCC" w:sz="1"/>
+              <w:bottom w:val="single" w:color="CCCCCC" w:sz="1"/>
+              <w:right w:val="single" w:color="CCCCCC" w:sz="1"/>
+            </w:tcBorders>
+            <w:tcMar>
+              <w:top w:type="dxa" w:w="80"/>
+              <w:left w:type="dxa" w:w="120"/>
+              <w:bottom w:type="dxa" w:w="80"/>
+              <w:right w:type="dxa" w:w="120"/>
+            </w:tcMar>
+          </w:tcPr>
+          <w:p>
+            <w:r>
+              <w:rPr>
+                <w:rFonts w:ascii="Arial" w:cs="Arial" w:eastAsia="Arial" w:hAnsi="Arial"/>
+                <w:sz w:val="20"/>
+                <w:szCs w:val="20"/>
+              </w:rPr>
+              <w:t xml:space="preserve">Chaos Daemon wymaga uprawnien root na nodach</w:t>
+            </w:r>
+          </w:p>
+        </w:tc>
+      </w:tr>
+      <w:tr>
+        <w:tc>
+          <w:tcPr>
+            <w:tcW w:type="dxa" w:w="4680"/>
+            <w:tcBorders>
+              <w:top w:val="single" w:color="CCCCCC" w:sz="1"/>
+              <w:left w:val="single" w:color="CCCCCC" w:sz="1"/>
+              <w:bottom w:val="single" w:color="CCCCCC" w:sz="1"/>
+              <w:right w:val="single" w:color="CCCCCC" w:sz="1"/>
+            </w:tcBorders>
+            <w:tcMar>
+              <w:top w:type="dxa" w:w="80"/>
+              <w:left w:type="dxa" w:w="120"/>
+              <w:bottom w:type="dxa" w:w="80"/>
+              <w:right w:type="dxa" w:w="120"/>
+            </w:tcMar>
+          </w:tcPr>
+          <w:p>
+            <w:r>
+              <w:rPr>
+                <w:rFonts w:ascii="Arial" w:cs="Arial" w:eastAsia="Arial" w:hAnsi="Arial"/>
+                <w:sz w:val="20"/>
+                <w:szCs w:val="20"/>
+              </w:rPr>
+              <w:t xml:space="preserve">Dashboard GUI — wizualizacja eksperymentow</w:t>
+            </w:r>
+          </w:p>
+        </w:tc>
+        <w:tc>
+          <w:tcPr>
+            <w:tcW w:type="dxa" w:w="4680"/>
+            <w:tcBorders>
+              <w:top w:val="single" w:color="CCCCCC" w:sz="1"/>
+              <w:left w:val="single" w:color="CCCCCC" w:sz="1"/>
+              <w:bottom w:val="single" w:color="CCCCCC" w:sz="1"/>
+              <w:right w:val="single" w:color="CCCCCC" w:sz="1"/>
+            </w:tcBorders>
+            <w:tcMar>
+              <w:top w:type="dxa" w:w="80"/>
+              <w:left w:type="dxa" w:w="120"/>
+              <w:bottom w:type="dxa" w:w="80"/>
+              <w:right w:type="dxa" w:w="120"/>
+            </w:tcMar>
+          </w:tcPr>
+          <w:p>
+            <w:r>
+              <w:rPr>
+                <w:rFonts w:ascii="Arial" w:cs="Arial" w:eastAsia="Arial" w:hAnsi="Arial"/>
+                <w:sz w:val="20"/>
+                <w:szCs w:val="20"/>
+              </w:rPr>
+              <w:t xml:space="preserve">Eksperymenty sieciowe moga byc trudne do debugowania po fakcie</w:t>
+            </w:r>
+          </w:p>
+        </w:tc>
+      </w:tr>
+    </w:tbl>
+    <w:p>
+      <w:r>
+        <w:br w:type="page"/>
+      </w:r>
+    </w:p>
+    <w:p>
+      <w:pPr>
+        <w:pStyle w:val="Heading1"/>
+        <w:spacing w:after="200" w:before="400"/>
+      </w:pPr>
+      <w:r>
+        <w:rPr>
+          <w:rFonts w:ascii="Arial" w:cs="Arial" w:eastAsia="Arial" w:hAnsi="Arial"/>
+          <w:b/>
+          <w:bCs/>
+          <w:color w:val="1F4E79"/>
+          <w:sz w:val="32"/>
+          <w:szCs w:val="32"/>
+        </w:rPr>
+        <w:t xml:space="preserve">Rozdzial 25: Linkerd — Service Mesh i mTLS</w:t>
+      </w:r>
+    </w:p>
+    <w:p>
+      <w:pPr>
+        <w:pStyle w:val="Heading2"/>
+        <w:spacing w:after="140" w:before="280"/>
+      </w:pPr>
+      <w:r>
+        <w:rPr>
+          <w:rFonts w:ascii="Arial" w:cs="Arial" w:eastAsia="Arial" w:hAnsi="Arial"/>
+          <w:b/>
+          <w:bCs/>
+          <w:color w:val="2E75B6"/>
+          <w:sz w:val="26"/>
+          <w:szCs w:val="26"/>
+        </w:rPr>
+        <w:t xml:space="preserve">Co to jest</w:t>
+      </w:r>
+    </w:p>
+    <w:p>
+      <w:pPr>
+        <w:spacing w:after="80" w:before="80"/>
+      </w:pPr>
+      <w:r>
+        <w:rPr>
+          <w:rFonts w:ascii="Arial" w:cs="Arial" w:eastAsia="Arial" w:hAnsi="Arial"/>
+          <w:sz w:val="22"/>
+          <w:szCs w:val="22"/>
+        </w:rPr>
+        <w:t xml:space="preserve">Service mesh to warstwa infrastruktury ktora dodaje mozliwosci sieciowe (szyfrowanie, obserwability, load balancing) do komunikacji miedzy serwisami bez zmian w kodzie aplikacji. Linkerd to lekki service mesh dla Kubernetes — wstrzykuje sidecar proxy (linkerd-proxy) do kazdego Poda ktory automatycznie szyfruje ruch przez mTLS.</w:t>
+      </w:r>
+    </w:p>
+    <w:p>
+      <w:pPr>
+        <w:spacing w:after="80" w:before="0"/>
+      </w:pPr>
+      <w:r>
+        <w:t xml:space="preserve"/>
+      </w:r>
+    </w:p>
+    <w:tbl>
+      <w:tblPr>
+        <w:tblW w:type="dxa" w:w="9360"/>
+        <w:tblBorders>
+          <w:top w:val="single" w:color="auto" w:sz="4"/>
+          <w:left w:val="single" w:color="auto" w:sz="4"/>
+          <w:bottom w:val="single" w:color="auto" w:sz="4"/>
+          <w:right w:val="single" w:color="auto" w:sz="4"/>
+          <w:insideH w:val="single" w:color="auto" w:sz="4"/>
+          <w:insideV w:val="single" w:color="auto" w:sz="4"/>
+        </w:tblBorders>
+      </w:tblPr>
+      <w:tblGrid>
+        <w:gridCol w:w="9360"/>
+      </w:tblGrid>
+      <w:tr>
+        <w:tc>
+          <w:tcPr>
+            <w:tcW w:type="dxa" w:w="9360"/>
+            <w:tcBorders>
+              <w:top w:val="single" w:color="CCCCCC" w:sz="1"/>
+              <w:left w:val="single" w:color="CCCCCC" w:sz="1"/>
+              <w:bottom w:val="single" w:color="CCCCCC" w:sz="1"/>
+              <w:right w:val="single" w:color="CCCCCC" w:sz="1"/>
+            </w:tcBorders>
+            <w:shd w:fill="D5E8F0" w:val="clear"/>
+            <w:tcMar>
+              <w:top w:type="dxa" w:w="120"/>
+              <w:left w:type="dxa" w:w="200"/>
+              <w:bottom w:type="dxa" w:w="120"/>
+              <w:right w:type="dxa" w:w="200"/>
+            </w:tcMar>
+          </w:tcPr>
+          <w:p>
+            <w:pPr>
+              <w:spacing w:after="0" w:before="0"/>
+            </w:pPr>
+            <w:r>
+              <w:rPr>
+                <w:rFonts w:ascii="Arial" w:cs="Arial" w:eastAsia="Arial" w:hAnsi="Arial"/>
+                <w:b/>
+                <w:bCs/>
+                <w:color w:val="1F4E79"/>
+                <w:sz w:val="22"/>
+                <w:szCs w:val="22"/>
+              </w:rPr>
+              <w:t xml:space="preserve">Analogia: </w:t>
+            </w:r>
+            <w:r>
+              <w:rPr>
+                <w:rFonts w:ascii="Arial" w:cs="Arial" w:eastAsia="Arial" w:hAnsi="Arial"/>
+                <w:i/>
+                <w:iCs/>
+                <w:color w:val="000000"/>
+                <w:sz w:val="22"/>
+                <w:szCs w:val="22"/>
+              </w:rPr>
+              <w:t xml:space="preserve">Ochroniarz przy kazdym pracowniku — Bez service mesh komunikacja miedzy serwisami to jak rozmowy pracownikow na otwartej przestrzeni — kazdy moze podsłuchac. Linkerd daje kazdemu pracownikowi (Pod) osobistego ochroniarza (linkerd-proxy) ktory szyfruje wszystkie rozmowy (mTLS) i zbiera statystyki (metryki).</w:t>
+            </w:r>
+          </w:p>
+        </w:tc>
+      </w:tr>
+    </w:tbl>
+    <w:p>
+      <w:pPr>
+        <w:spacing w:after="80" w:before="0"/>
+      </w:pPr>
+      <w:r>
+        <w:t xml:space="preserve"/>
+      </w:r>
+    </w:p>
+    <w:p>
+      <w:pPr>
+        <w:pStyle w:val="Heading2"/>
+        <w:spacing w:after="140" w:before="280"/>
+      </w:pPr>
+      <w:r>
+        <w:rPr>
+          <w:rFonts w:ascii="Arial" w:cs="Arial" w:eastAsia="Arial" w:hAnsi="Arial"/>
+          <w:b/>
+          <w:bCs/>
+          <w:color w:val="2E75B6"/>
+          <w:sz w:val="26"/>
+          <w:szCs w:val="26"/>
+        </w:rPr>
+        <w:t xml:space="preserve">Co zrobilimy</w:t>
+      </w:r>
+    </w:p>
+    <w:p>
+      <w:pPr>
+        <w:pStyle w:val="ListParagraph"/>
+        <w:numPr>
+          <w:ilvl w:val="0"/>
+          <w:numId w:val="2"/>
+        </w:numPr>
+        <w:spacing w:after="60" w:before="60"/>
+      </w:pPr>
+      <w:r>
+        <w:rPr>
+          <w:rFonts w:ascii="Arial" w:cs="Arial" w:eastAsia="Arial" w:hAnsi="Arial"/>
+          <w:sz w:val="22"/>
+          <w:szCs w:val="22"/>
+        </w:rPr>
+        <w:t xml:space="preserve">Zainstalowalismy Linkerd edge-26.6.1 (CLI + control plane + viz extension)</w:t>
+      </w:r>
+    </w:p>
+    <w:p>
+      <w:pPr>
+        <w:pStyle w:val="ListParagraph"/>
+        <w:numPr>
+          <w:ilvl w:val="0"/>
+          <w:numId w:val="2"/>
+        </w:numPr>
+        <w:spacing w:after="60" w:before="60"/>
+      </w:pPr>
+      <w:r>
+        <w:rPr>
+          <w:rFonts w:ascii="Arial" w:cs="Arial" w:eastAsia="Arial" w:hAnsi="Arial"/>
+          <w:sz w:val="22"/>
+          <w:szCs w:val="22"/>
+        </w:rPr>
+        <w:t xml:space="preserve">Annotowalismy namespace default: linkerd.io/inject=enabled</w:t>
+      </w:r>
+    </w:p>
+    <w:p>
+      <w:pPr>
+        <w:pStyle w:val="ListParagraph"/>
+        <w:numPr>
+          <w:ilvl w:val="0"/>
+          <w:numId w:val="2"/>
+        </w:numPr>
+        <w:spacing w:after="60" w:before="60"/>
+      </w:pPr>
+      <w:r>
+        <w:rPr>
+          <w:rFonts w:ascii="Arial" w:cs="Arial" w:eastAsia="Arial" w:hAnsi="Arial"/>
+          <w:sz w:val="22"/>
+          <w:szCs w:val="22"/>
+        </w:rPr>
+        <w:t xml:space="preserve">Po restart Deployment — kazdy Pod otrzymal sidecar linkerd-proxy automatycznie</w:t>
+      </w:r>
+    </w:p>
+    <w:p>
+      <w:pPr>
+        <w:pStyle w:val="ListParagraph"/>
+        <w:numPr>
+          <w:ilvl w:val="0"/>
+          <w:numId w:val="2"/>
+        </w:numPr>
+        <w:spacing w:after="60" w:before="60"/>
+      </w:pPr>
+      <w:r>
+        <w:rPr>
+          <w:rFonts w:ascii="Arial" w:cs="Arial" w:eastAsia="Arial" w:hAnsi="Arial"/>
+          <w:sz w:val="22"/>
+          <w:szCs w:val="22"/>
+        </w:rPr>
+        <w:t xml:space="preserve">Weryfikacja: kubectl get pods — 2/2 zamiast 1/1 (aplikacja + proxy)</w:t>
+      </w:r>
+    </w:p>
+    <w:p>
+      <w:pPr>
+        <w:pStyle w:val="ListParagraph"/>
+        <w:numPr>
+          <w:ilvl w:val="0"/>
+          <w:numId w:val="2"/>
+        </w:numPr>
+        <w:spacing w:after="60" w:before="60"/>
+      </w:pPr>
+      <w:r>
+        <w:rPr>
+          <w:rFonts w:ascii="Arial" w:cs="Arial" w:eastAsia="Arial" w:hAnsi="Arial"/>
+          <w:sz w:val="22"/>
+          <w:szCs w:val="22"/>
+        </w:rPr>
+        <w:t xml:space="preserve">linkerd viz stat deployment/aras-demo: MESHED 2/2</w:t>
+      </w:r>
+    </w:p>
+    <w:p>
+      <w:pPr>
+        <w:pStyle w:val="ListParagraph"/>
+        <w:numPr>
+          <w:ilvl w:val="0"/>
+          <w:numId w:val="2"/>
+        </w:numPr>
+        <w:spacing w:after="60" w:before="60"/>
+      </w:pPr>
+      <w:r>
+        <w:rPr>
+          <w:rFonts w:ascii="Arial" w:cs="Arial" w:eastAsia="Arial" w:hAnsi="Arial"/>
+          <w:sz w:val="22"/>
+          <w:szCs w:val="22"/>
+        </w:rPr>
+        <w:t xml:space="preserve">linkerd check — wszystkie 30+ checkow zielone</w:t>
+      </w:r>
+    </w:p>
+    <w:p>
+      <w:pPr>
+        <w:spacing w:after="80" w:before="0"/>
+      </w:pPr>
+      <w:r>
+        <w:t xml:space="preserve"/>
+      </w:r>
+    </w:p>
+    <w:tbl>
+      <w:tblPr>
+        <w:tblW w:type="dxa" w:w="9360"/>
+        <w:tblBorders>
+          <w:top w:val="single" w:color="auto" w:sz="4"/>
+          <w:left w:val="single" w:color="auto" w:sz="4"/>
+          <w:bottom w:val="single" w:color="auto" w:sz="4"/>
+          <w:right w:val="single" w:color="auto" w:sz="4"/>
+          <w:insideH w:val="single" w:color="auto" w:sz="4"/>
+          <w:insideV w:val="single" w:color="auto" w:sz="4"/>
+        </w:tblBorders>
+      </w:tblPr>
+      <w:tblGrid>
+        <w:gridCol w:w="9360"/>
+      </w:tblGrid>
+      <w:tr>
+        <w:tc>
+          <w:tcPr>
+            <w:tcW w:type="dxa" w:w="9360"/>
+            <w:tcBorders>
+              <w:top w:val="single" w:color="CCCCCC" w:sz="1"/>
+              <w:left w:val="single" w:color="CCCCCC" w:sz="1"/>
+              <w:bottom w:val="single" w:color="CCCCCC" w:sz="1"/>
+              <w:right w:val="single" w:color="CCCCCC" w:sz="1"/>
+            </w:tcBorders>
+            <w:shd w:fill="F2F2F2" w:val="clear"/>
+            <w:tcMar>
+              <w:top w:type="dxa" w:w="120"/>
+              <w:left w:type="dxa" w:w="200"/>
+              <w:bottom w:type="dxa" w:w="120"/>
+              <w:right w:type="dxa" w:w="200"/>
+            </w:tcMar>
+          </w:tcPr>
+          <w:p>
+            <w:pPr>
+              <w:spacing w:after="0" w:before="0"/>
+            </w:pPr>
+            <w:r>
+              <w:rPr>
+                <w:rFonts w:ascii="Arial" w:cs="Arial" w:eastAsia="Arial" w:hAnsi="Arial"/>
+                <w:b/>
+                <w:bCs/>
+                <w:sz w:val="22"/>
+                <w:szCs w:val="22"/>
+              </w:rPr>
+              <w:t xml:space="preserve">Wynik w projekcie: </w:t>
+            </w:r>
+            <w:r>
+              <w:rPr>
+                <w:rFonts w:ascii="Arial" w:cs="Arial" w:eastAsia="Arial" w:hAnsi="Arial"/>
+                <w:sz w:val="22"/>
+                <w:szCs w:val="22"/>
+              </w:rPr>
+              <w:t xml:space="preserve">kubectl get pods -n default | grep aras
+# BEZ Linkerd:
+aras-demo-xxx   1/1  Running  &lt;- 1 kontener
+# Z Linkerd:
+aras-demo-yyy   2/2  Running  &lt;- 2 kontenery (app + linkerd-proxy)
+linkerd viz stat deployment/aras-demo -n default
+NAME       MESHED  SUCCESS  RPS  LATENCY_P50  LATENCY_P95
+aras-demo  2/2     -        -    -            -
+# MESHED: 2/2 = oba pody w service mesh, mTLS aktywne</w:t>
+            </w:r>
+          </w:p>
+        </w:tc>
+      </w:tr>
+    </w:tbl>
+    <w:p>
+      <w:pPr>
+        <w:spacing w:after="80" w:before="0"/>
+      </w:pPr>
+      <w:r>
+        <w:t xml:space="preserve"/>
+      </w:r>
+    </w:p>
+    <w:p>
+      <w:pPr>
+        <w:pStyle w:val="Heading2"/>
+        <w:spacing w:after="140" w:before="280"/>
+      </w:pPr>
+      <w:r>
+        <w:rPr>
+          <w:rFonts w:ascii="Arial" w:cs="Arial" w:eastAsia="Arial" w:hAnsi="Arial"/>
+          <w:b/>
+          <w:bCs/>
+          <w:color w:val="2E75B6"/>
+          <w:sz w:val="26"/>
+          <w:szCs w:val="26"/>
+        </w:rPr>
+        <w:t xml:space="preserve">Co daje mTLS</w:t>
+      </w:r>
+    </w:p>
+    <w:p>
+      <w:pPr>
+        <w:pStyle w:val="ListParagraph"/>
+        <w:numPr>
+          <w:ilvl w:val="0"/>
+          <w:numId w:val="2"/>
+        </w:numPr>
+        <w:spacing w:after="60" w:before="60"/>
+      </w:pPr>
+      <w:r>
+        <w:rPr>
+          <w:rFonts w:ascii="Arial" w:cs="Arial" w:eastAsia="Arial" w:hAnsi="Arial"/>
+          <w:sz w:val="22"/>
+          <w:szCs w:val="22"/>
+        </w:rPr>
+        <w:t xml:space="preserve">Mutual TLS — obie strony weryfikuja swoje certyfikaty. Certyfikaty generowane automatycznie przez Linkerd identity controller</w:t>
+      </w:r>
+    </w:p>
+    <w:p>
+      <w:pPr>
+        <w:pStyle w:val="ListParagraph"/>
+        <w:numPr>
+          <w:ilvl w:val="0"/>
+          <w:numId w:val="2"/>
+        </w:numPr>
+        <w:spacing w:after="60" w:before="60"/>
+      </w:pPr>
+      <w:r>
+        <w:rPr>
+          <w:rFonts w:ascii="Arial" w:cs="Arial" w:eastAsia="Arial" w:hAnsi="Arial"/>
+          <w:sz w:val="22"/>
+          <w:szCs w:val="22"/>
+        </w:rPr>
+        <w:t xml:space="preserve">Szyfrowanie — caly ruch pod-to-pod w namespace jest zaszyfrowany bez zmian w kodzie</w:t>
+      </w:r>
+    </w:p>
+    <w:p>
+      <w:pPr>
+        <w:pStyle w:val="ListParagraph"/>
+        <w:numPr>
+          <w:ilvl w:val="0"/>
+          <w:numId w:val="2"/>
+        </w:numPr>
+        <w:spacing w:after="60" w:before="60"/>
+      </w:pPr>
+      <w:r>
+        <w:rPr>
+          <w:rFonts w:ascii="Arial" w:cs="Arial" w:eastAsia="Arial" w:hAnsi="Arial"/>
+          <w:sz w:val="22"/>
+          <w:szCs w:val="22"/>
+        </w:rPr>
+        <w:t xml:space="preserve">Identity — kazdy serwis ma kryptograficzna tozsamosc (SPIFFE/SPIRE standard)</w:t>
+      </w:r>
+    </w:p>
+    <w:p>
+      <w:pPr>
+        <w:pStyle w:val="ListParagraph"/>
+        <w:numPr>
+          <w:ilvl w:val="0"/>
+          <w:numId w:val="2"/>
+        </w:numPr>
+        <w:spacing w:after="60" w:before="60"/>
+      </w:pPr>
+      <w:r>
+        <w:rPr>
+          <w:rFonts w:ascii="Arial" w:cs="Arial" w:eastAsia="Arial" w:hAnsi="Arial"/>
+          <w:sz w:val="22"/>
+          <w:szCs w:val="22"/>
+        </w:rPr>
+        <w:t xml:space="preserve">Zero-trust networking — kazde polaczenie jest uwierzytelnione i zaszyfrowane</w:t>
+      </w:r>
+    </w:p>
+    <w:p>
+      <w:pPr>
+        <w:spacing w:after="80" w:before="0"/>
+      </w:pPr>
+      <w:r>
+        <w:t xml:space="preserve"/>
+      </w:r>
+    </w:p>
+    <w:tbl>
+      <w:tblPr>
+        <w:tblW w:type="dxa" w:w="9360"/>
+        <w:tblBorders>
+          <w:top w:val="single" w:color="auto" w:sz="4"/>
+          <w:left w:val="single" w:color="auto" w:sz="4"/>
+          <w:bottom w:val="single" w:color="auto" w:sz="4"/>
+          <w:right w:val="single" w:color="auto" w:sz="4"/>
+          <w:insideH w:val="single" w:color="auto" w:sz="4"/>
+          <w:insideV w:val="single" w:color="auto" w:sz="4"/>
+        </w:tblBorders>
+      </w:tblPr>
+      <w:tblGrid>
+        <w:gridCol w:w="4680"/>
+        <w:gridCol w:w="4680"/>
+      </w:tblGrid>
+      <w:tr>
+        <w:tc>
+          <w:tcPr>
+            <w:tcW w:type="dxa" w:w="4680"/>
+            <w:tcBorders>
+              <w:top w:val="single" w:color="CCCCCC" w:sz="1"/>
+              <w:left w:val="single" w:color="CCCCCC" w:sz="1"/>
+              <w:bottom w:val="single" w:color="CCCCCC" w:sz="1"/>
+              <w:right w:val="single" w:color="CCCCCC" w:sz="1"/>
+            </w:tcBorders>
+            <w:shd w:fill="2E75B6" w:val="clear"/>
+            <w:tcMar>
+              <w:top w:type="dxa" w:w="80"/>
+              <w:left w:type="dxa" w:w="120"/>
+              <w:bottom w:type="dxa" w:w="80"/>
+              <w:right w:type="dxa" w:w="120"/>
+            </w:tcMar>
+          </w:tcPr>
+          <w:p>
+            <w:r>
+              <w:rPr>
+                <w:rFonts w:ascii="Arial" w:cs="Arial" w:eastAsia="Arial" w:hAnsi="Arial"/>
+                <w:b/>
+                <w:bCs/>
+                <w:color w:val="FFFFFF"/>
+                <w:sz w:val="22"/>
+                <w:szCs w:val="22"/>
+              </w:rPr>
+              <w:t xml:space="preserve">Silne strony</w:t>
+            </w:r>
+          </w:p>
+        </w:tc>
+        <w:tc>
+          <w:tcPr>
+            <w:tcW w:type="dxa" w:w="4680"/>
+            <w:tcBorders>
+              <w:top w:val="single" w:color="CCCCCC" w:sz="1"/>
+              <w:left w:val="single" w:color="CCCCCC" w:sz="1"/>
+              <w:bottom w:val="single" w:color="CCCCCC" w:sz="1"/>
+              <w:right w:val="single" w:color="CCCCCC" w:sz="1"/>
+            </w:tcBorders>
+            <w:shd w:fill="2E75B6" w:val="clear"/>
+            <w:tcMar>
+              <w:top w:type="dxa" w:w="80"/>
+              <w:left w:type="dxa" w:w="120"/>
+              <w:bottom w:type="dxa" w:w="80"/>
+              <w:right w:type="dxa" w:w="120"/>
+            </w:tcMar>
+          </w:tcPr>
+          <w:p>
+            <w:r>
+              <w:rPr>
+                <w:rFonts w:ascii="Arial" w:cs="Arial" w:eastAsia="Arial" w:hAnsi="Arial"/>
+                <w:b/>
+                <w:bCs/>
+                <w:color w:val="FFFFFF"/>
+                <w:sz w:val="22"/>
+                <w:szCs w:val="22"/>
+              </w:rPr>
+              <w:t xml:space="preserve">Slabe strony / typowe problemy</w:t>
+            </w:r>
+          </w:p>
+        </w:tc>
+      </w:tr>
+      <w:tr>
+        <w:tc>
+          <w:tcPr>
+            <w:tcW w:type="dxa" w:w="4680"/>
+            <w:tcBorders>
+              <w:top w:val="single" w:color="CCCCCC" w:sz="1"/>
+              <w:left w:val="single" w:color="CCCCCC" w:sz="1"/>
+              <w:bottom w:val="single" w:color="CCCCCC" w:sz="1"/>
+              <w:right w:val="single" w:color="CCCCCC" w:sz="1"/>
+            </w:tcBorders>
+            <w:tcMar>
+              <w:top w:type="dxa" w:w="80"/>
+              <w:left w:type="dxa" w:w="120"/>
+              <w:bottom w:type="dxa" w:w="80"/>
+              <w:right w:type="dxa" w:w="120"/>
+            </w:tcMar>
+          </w:tcPr>
+          <w:p>
+            <w:r>
+              <w:rPr>
+                <w:rFonts w:ascii="Arial" w:cs="Arial" w:eastAsia="Arial" w:hAnsi="Arial"/>
+                <w:sz w:val="20"/>
+                <w:szCs w:val="20"/>
+              </w:rPr>
+              <w:t xml:space="preserve">Zero-trust mTLS bez zmian w kodzie aplikacji</w:t>
+            </w:r>
+          </w:p>
+        </w:tc>
+        <w:tc>
+          <w:tcPr>
+            <w:tcW w:type="dxa" w:w="4680"/>
+            <w:tcBorders>
+              <w:top w:val="single" w:color="CCCCCC" w:sz="1"/>
+              <w:left w:val="single" w:color="CCCCCC" w:sz="1"/>
+              <w:bottom w:val="single" w:color="CCCCCC" w:sz="1"/>
+              <w:right w:val="single" w:color="CCCCCC" w:sz="1"/>
+            </w:tcBorders>
+            <w:tcMar>
+              <w:top w:type="dxa" w:w="80"/>
+              <w:left w:type="dxa" w:w="120"/>
+              <w:bottom w:type="dxa" w:w="80"/>
+              <w:right w:type="dxa" w:w="120"/>
+            </w:tcMar>
+          </w:tcPr>
+          <w:p>
+            <w:r>
+              <w:rPr>
+                <w:rFonts w:ascii="Arial" w:cs="Arial" w:eastAsia="Arial" w:hAnsi="Arial"/>
+                <w:sz w:val="20"/>
+                <w:szCs w:val="20"/>
+              </w:rPr>
+              <w:t xml:space="preserve">Cold start — sidecar musi sie uruchomic przed aplikacja (init container)</w:t>
+            </w:r>
+          </w:p>
+        </w:tc>
+      </w:tr>
+      <w:tr>
+        <w:tc>
+          <w:tcPr>
+            <w:tcW w:type="dxa" w:w="4680"/>
+            <w:tcBorders>
+              <w:top w:val="single" w:color="CCCCCC" w:sz="1"/>
+              <w:left w:val="single" w:color="CCCCCC" w:sz="1"/>
+              <w:bottom w:val="single" w:color="CCCCCC" w:sz="1"/>
+              <w:right w:val="single" w:color="CCCCCC" w:sz="1"/>
+            </w:tcBorders>
+            <w:tcMar>
+              <w:top w:type="dxa" w:w="80"/>
+              <w:left w:type="dxa" w:w="120"/>
+              <w:bottom w:type="dxa" w:w="80"/>
+              <w:right w:type="dxa" w:w="120"/>
+            </w:tcMar>
+          </w:tcPr>
+          <w:p>
+            <w:r>
+              <w:rPr>
+                <w:rFonts w:ascii="Arial" w:cs="Arial" w:eastAsia="Arial" w:hAnsi="Arial"/>
+                <w:sz w:val="20"/>
+                <w:szCs w:val="20"/>
+              </w:rPr>
+              <w:t xml:space="preserve">Automatyczne metryki latency, success rate, RPS dla kazdego serwisu</w:t>
+            </w:r>
+          </w:p>
+        </w:tc>
+        <w:tc>
+          <w:tcPr>
+            <w:tcW w:type="dxa" w:w="4680"/>
+            <w:tcBorders>
+              <w:top w:val="single" w:color="CCCCCC" w:sz="1"/>
+              <w:left w:val="single" w:color="CCCCCC" w:sz="1"/>
+              <w:bottom w:val="single" w:color="CCCCCC" w:sz="1"/>
+              <w:right w:val="single" w:color="CCCCCC" w:sz="1"/>
+            </w:tcBorders>
+            <w:tcMar>
+              <w:top w:type="dxa" w:w="80"/>
+              <w:left w:type="dxa" w:w="120"/>
+              <w:bottom w:type="dxa" w:w="80"/>
+              <w:right w:type="dxa" w:w="120"/>
+            </w:tcMar>
+          </w:tcPr>
+          <w:p>
+            <w:r>
+              <w:rPr>
+                <w:rFonts w:ascii="Arial" w:cs="Arial" w:eastAsia="Arial" w:hAnsi="Arial"/>
+                <w:sz w:val="20"/>
+                <w:szCs w:val="20"/>
+              </w:rPr>
+              <w:t xml:space="preserve">Debugging przez dwa proxy moze byc skomplikowany</w:t>
+            </w:r>
+          </w:p>
+        </w:tc>
+      </w:tr>
+      <w:tr>
+        <w:tc>
+          <w:tcPr>
+            <w:tcW w:type="dxa" w:w="4680"/>
+            <w:tcBorders>
+              <w:top w:val="single" w:color="CCCCCC" w:sz="1"/>
+              <w:left w:val="single" w:color="CCCCCC" w:sz="1"/>
+              <w:bottom w:val="single" w:color="CCCCCC" w:sz="1"/>
+              <w:right w:val="single" w:color="CCCCCC" w:sz="1"/>
+            </w:tcBorders>
+            <w:tcMar>
+              <w:top w:type="dxa" w:w="80"/>
+              <w:left w:type="dxa" w:w="120"/>
+              <w:bottom w:type="dxa" w:w="80"/>
+              <w:right w:type="dxa" w:w="120"/>
+            </w:tcMar>
+          </w:tcPr>
+          <w:p>
+            <w:r>
+              <w:rPr>
+                <w:rFonts w:ascii="Arial" w:cs="Arial" w:eastAsia="Arial" w:hAnsi="Arial"/>
+                <w:sz w:val="20"/>
+                <w:szCs w:val="20"/>
+              </w:rPr>
+              <w:t xml:space="preserve">Sidecar injection przez adnotacje — transparentne dla aplikacji</w:t>
+            </w:r>
+          </w:p>
+        </w:tc>
+        <w:tc>
+          <w:tcPr>
+            <w:tcW w:type="dxa" w:w="4680"/>
+            <w:tcBorders>
+              <w:top w:val="single" w:color="CCCCCC" w:sz="1"/>
+              <w:left w:val="single" w:color="CCCCCC" w:sz="1"/>
+              <w:bottom w:val="single" w:color="CCCCCC" w:sz="1"/>
+              <w:right w:val="single" w:color="CCCCCC" w:sz="1"/>
+            </w:tcBorders>
+            <w:tcMar>
+              <w:top w:type="dxa" w:w="80"/>
+              <w:left w:type="dxa" w:w="120"/>
+              <w:bottom w:type="dxa" w:w="80"/>
+              <w:right w:type="dxa" w:w="120"/>
+            </w:tcMar>
+          </w:tcPr>
+          <w:p>
+            <w:r>
+              <w:rPr>
+                <w:rFonts w:ascii="Arial" w:cs="Arial" w:eastAsia="Arial" w:hAnsi="Arial"/>
+                <w:sz w:val="20"/>
+                <w:szCs w:val="20"/>
+              </w:rPr>
+              <w:t xml:space="preserve">Metryki dostepne tylko dla ruchu wewnatrz klastra (pod-to-pod)</w:t>
+            </w:r>
+          </w:p>
+        </w:tc>
+      </w:tr>
+      <w:tr>
+        <w:tc>
+          <w:tcPr>
+            <w:tcW w:type="dxa" w:w="4680"/>
+            <w:tcBorders>
+              <w:top w:val="single" w:color="CCCCCC" w:sz="1"/>
+              <w:left w:val="single" w:color="CCCCCC" w:sz="1"/>
+              <w:bottom w:val="single" w:color="CCCCCC" w:sz="1"/>
+              <w:right w:val="single" w:color="CCCCCC" w:sz="1"/>
+            </w:tcBorders>
+            <w:tcMar>
+              <w:top w:type="dxa" w:w="80"/>
+              <w:left w:type="dxa" w:w="120"/>
+              <w:bottom w:type="dxa" w:w="80"/>
+              <w:right w:type="dxa" w:w="120"/>
+            </w:tcMar>
+          </w:tcPr>
+          <w:p>
+            <w:r>
+              <w:rPr>
+                <w:rFonts w:ascii="Arial" w:cs="Arial" w:eastAsia="Arial" w:hAnsi="Arial"/>
+                <w:sz w:val="20"/>
+                <w:szCs w:val="20"/>
+              </w:rPr>
+              <w:t xml:space="preserve">Lekki — Linkerd proxy (Rust) zuzywa mniej zasobow niz Istio (C++)</w:t>
+            </w:r>
+          </w:p>
+        </w:tc>
+        <w:tc>
+          <w:tcPr>
+            <w:tcW w:type="dxa" w:w="4680"/>
+            <w:tcBorders>
+              <w:top w:val="single" w:color="CCCCCC" w:sz="1"/>
+              <w:left w:val="single" w:color="CCCCCC" w:sz="1"/>
+              <w:bottom w:val="single" w:color="CCCCCC" w:sz="1"/>
+              <w:right w:val="single" w:color="CCCCCC" w:sz="1"/>
+            </w:tcBorders>
+            <w:tcMar>
+              <w:top w:type="dxa" w:w="80"/>
+              <w:left w:type="dxa" w:w="120"/>
+              <w:bottom w:type="dxa" w:w="80"/>
+              <w:right w:type="dxa" w:w="120"/>
+            </w:tcMar>
+          </w:tcPr>
+          <w:p>
+            <w:r>
+              <w:rPr>
+                <w:rFonts w:ascii="Arial" w:cs="Arial" w:eastAsia="Arial" w:hAnsi="Arial"/>
+                <w:sz w:val="20"/>
+                <w:szCs w:val="20"/>
+              </w:rPr>
+              <w:t xml:space="preserve">Wersje edge mogą być niestabilne — produkcja powinna uzywac stable</w:t>
             </w:r>
           </w:p>
         </w:tc>

</xml_diff>